<commit_message>
Cleaned Up .rmd with new workflow
</commit_message>
<xml_diff>
--- a/outputs/tables_database_section.docx
+++ b/outputs/tables_database_section.docx
@@ -10262,6 +10262,4836 @@
                 <w:color w:val="000000"/>
               </w:rPr>
               <w:t xml:space="preserve">2/24 (8.3%)</w:t>
+            </w:r>
+          </w:p>
+        </w:tc>
+      </w:tr>
+    </w:tbl>
+    <w:p>
+      <w:pPr>
+        <w:pStyle w:val="Normal"/>
+      </w:pPr>
+      <w:r>
+        <w:t xml:space="preserve"/>
+      </w:r>
+    </w:p>
+    <w:p>
+      <w:pPr>
+        <w:pStyle w:val="TableCaption"/>
+        <w:jc w:val="center"/>
+        <w:keepNext/>
+        <w:pBdr>
+          <w:bottom w:val="none" w:sz="0" w:space="0" w:color="000000"/>
+          <w:top w:val="none" w:sz="0" w:space="0" w:color="000000"/>
+          <w:left w:val="none" w:sz="0" w:space="0" w:color="000000"/>
+          <w:right w:val="none" w:sz="0" w:space="0" w:color="000000"/>
+        </w:pBdr>
+        <w:spacing w:after="60" w:before="60" w:line="240"/>
+        <w:ind w:left="60" w:right="60" w:firstLine="0" w:firstLineChars="0"/>
+      </w:pPr>
+      <w:r>
+        <w:t xml:space="preserve">Table X. Reported item preprocessing and transformation decisions</w:t>
+      </w:r>
+    </w:p>
+    <w:tbl xmlns:a="http://schemas.openxmlformats.org/drawingml/2006/main" xmlns:pic="http://schemas.openxmlformats.org/drawingml/2006/picture">
+      <w:tblPr>
+        <w:tblLayout w:type="autofit"/>
+        <w:jc w:val="center"/>
+        <w:tblW w:type="pct" w:w="5000"/>
+        <w:tblLook w:firstRow="1" w:lastRow="0" w:firstColumn="0" w:lastColumn="0" w:noHBand="0" w:noVBand="1"/>
+      </w:tblPr>
+      <w:tr>
+        <w:trPr>
+          <w:trHeight w:val="608" w:hRule="auto"/>
+          <w:tblHeader/>
+        </w:trPr>
+        <w:tc>
+          <w:tcPr>
+            <w:tcBorders>
+              <w:bottom w:val="single" w:sz="12" w:space="0" w:color="666666"/>
+              <w:top w:val="single" w:sz="12" w:space="0" w:color="666666"/>
+              <w:left w:val="none" w:sz="0" w:space="0" w:color="000000"/>
+              <w:right w:val="none" w:sz="0" w:space="0" w:color="000000"/>
+            </w:tcBorders>
+            <w:shd w:val="clear" w:color="auto" w:fill="FFFFFF"/>
+            <w:tcMar>
+              <w:top w:w="0" w:type="dxa"/>
+              <w:bottom w:w="0" w:type="dxa"/>
+              <w:left w:w="0" w:type="dxa"/>
+              <w:right w:w="0" w:type="dxa"/>
+            </w:tcMar>
+            <w:vAlign w:val="top"/>
+          </w:tcPr>
+          <w:p>
+            <w:pPr>
+              <w:pStyle w:val="Normal"/>
+              <w:jc w:val="left"/>
+              <w:pBdr>
+                <w:bottom w:val="none" w:sz="0" w:space="0" w:color="000000"/>
+                <w:top w:val="none" w:sz="0" w:space="0" w:color="000000"/>
+                <w:left w:val="none" w:sz="0" w:space="0" w:color="000000"/>
+                <w:right w:val="none" w:sz="0" w:space="0" w:color="000000"/>
+              </w:pBdr>
+              <w:spacing w:after="40" w:before="40" w:line="240"/>
+              <w:ind w:left="40" w:right="40" w:firstLine="0" w:firstLineChars="0"/>
+              <w:rPr>
+                <w:rFonts w:ascii="Arial" w:hAnsi="Arial" w:eastAsia="Arial" w:cs="Arial"/>
+                <w:i w:val="false"/>
+                <w:b w:val="false"/>
+                <w:u w:val="none"/>
+                <w:strike w:val="false"/>
+                <w:sz w:val="20"/>
+                <w:szCs w:val="20"/>
+                <w:color w:val="000000"/>
+              </w:rPr>
+            </w:pPr>
+            <w:r>
+              <w:rPr>
+                <w:rFonts w:ascii="Arial" w:hAnsi="Arial" w:eastAsia="Arial" w:cs="Arial"/>
+                <w:i w:val="false"/>
+                <w:b w:val="false"/>
+                <w:u w:val="none"/>
+                <w:strike w:val="false"/>
+                <w:sz w:val="20"/>
+                <w:szCs w:val="20"/>
+                <w:color w:val="000000"/>
+              </w:rPr>
+              <w:t xml:space="preserve">method</w:t>
+            </w:r>
+          </w:p>
+        </w:tc>
+        <w:tc>
+          <w:tcPr>
+            <w:tcBorders>
+              <w:bottom w:val="single" w:sz="12" w:space="0" w:color="666666"/>
+              <w:top w:val="single" w:sz="12" w:space="0" w:color="666666"/>
+              <w:left w:val="none" w:sz="0" w:space="0" w:color="000000"/>
+              <w:right w:val="none" w:sz="0" w:space="0" w:color="000000"/>
+            </w:tcBorders>
+            <w:shd w:val="clear" w:color="auto" w:fill="FFFFFF"/>
+            <w:tcMar>
+              <w:top w:w="0" w:type="dxa"/>
+              <w:bottom w:w="0" w:type="dxa"/>
+              <w:left w:w="0" w:type="dxa"/>
+              <w:right w:w="0" w:type="dxa"/>
+            </w:tcMar>
+            <w:vAlign w:val="top"/>
+          </w:tcPr>
+          <w:p>
+            <w:pPr>
+              <w:pStyle w:val="Normal"/>
+              <w:jc w:val="left"/>
+              <w:pBdr>
+                <w:bottom w:val="none" w:sz="0" w:space="0" w:color="000000"/>
+                <w:top w:val="none" w:sz="0" w:space="0" w:color="000000"/>
+                <w:left w:val="none" w:sz="0" w:space="0" w:color="000000"/>
+                <w:right w:val="none" w:sz="0" w:space="0" w:color="000000"/>
+              </w:pBdr>
+              <w:spacing w:after="40" w:before="40" w:line="240"/>
+              <w:ind w:left="40" w:right="40" w:firstLine="0" w:firstLineChars="0"/>
+              <w:rPr>
+                <w:rFonts w:ascii="Arial" w:hAnsi="Arial" w:eastAsia="Arial" w:cs="Arial"/>
+                <w:i w:val="false"/>
+                <w:b w:val="false"/>
+                <w:u w:val="none"/>
+                <w:strike w:val="false"/>
+                <w:sz w:val="20"/>
+                <w:szCs w:val="20"/>
+                <w:color w:val="000000"/>
+              </w:rPr>
+            </w:pPr>
+            <w:r>
+              <w:rPr>
+                <w:rFonts w:ascii="Arial" w:hAnsi="Arial" w:eastAsia="Arial" w:cs="Arial"/>
+                <w:i w:val="false"/>
+                <w:b w:val="false"/>
+                <w:u w:val="none"/>
+                <w:strike w:val="false"/>
+                <w:sz w:val="20"/>
+                <w:szCs w:val="20"/>
+                <w:color w:val="000000"/>
+              </w:rPr>
+              <w:t xml:space="preserve">n_true</w:t>
+            </w:r>
+          </w:p>
+        </w:tc>
+        <w:tc>
+          <w:tcPr>
+            <w:tcBorders>
+              <w:bottom w:val="single" w:sz="12" w:space="0" w:color="666666"/>
+              <w:top w:val="single" w:sz="12" w:space="0" w:color="666666"/>
+              <w:left w:val="none" w:sz="0" w:space="0" w:color="000000"/>
+              <w:right w:val="none" w:sz="0" w:space="0" w:color="000000"/>
+            </w:tcBorders>
+            <w:shd w:val="clear" w:color="auto" w:fill="FFFFFF"/>
+            <w:tcMar>
+              <w:top w:w="0" w:type="dxa"/>
+              <w:bottom w:w="0" w:type="dxa"/>
+              <w:left w:w="0" w:type="dxa"/>
+              <w:right w:w="0" w:type="dxa"/>
+            </w:tcMar>
+            <w:vAlign w:val="top"/>
+          </w:tcPr>
+          <w:p>
+            <w:pPr>
+              <w:pStyle w:val="Normal"/>
+              <w:jc w:val="left"/>
+              <w:pBdr>
+                <w:bottom w:val="none" w:sz="0" w:space="0" w:color="000000"/>
+                <w:top w:val="none" w:sz="0" w:space="0" w:color="000000"/>
+                <w:left w:val="none" w:sz="0" w:space="0" w:color="000000"/>
+                <w:right w:val="none" w:sz="0" w:space="0" w:color="000000"/>
+              </w:pBdr>
+              <w:spacing w:after="40" w:before="40" w:line="240"/>
+              <w:ind w:left="40" w:right="40" w:firstLine="0" w:firstLineChars="0"/>
+              <w:rPr>
+                <w:rFonts w:ascii="Arial" w:hAnsi="Arial" w:eastAsia="Arial" w:cs="Arial"/>
+                <w:i w:val="false"/>
+                <w:b w:val="false"/>
+                <w:u w:val="none"/>
+                <w:strike w:val="false"/>
+                <w:sz w:val="20"/>
+                <w:szCs w:val="20"/>
+                <w:color w:val="000000"/>
+              </w:rPr>
+            </w:pPr>
+            <w:r>
+              <w:rPr>
+                <w:rFonts w:ascii="Arial" w:hAnsi="Arial" w:eastAsia="Arial" w:cs="Arial"/>
+                <w:i w:val="false"/>
+                <w:b w:val="false"/>
+                <w:u w:val="none"/>
+                <w:strike w:val="false"/>
+                <w:sz w:val="20"/>
+                <w:szCs w:val="20"/>
+                <w:color w:val="000000"/>
+              </w:rPr>
+              <w:t xml:space="preserve">report</w:t>
+            </w:r>
+          </w:p>
+        </w:tc>
+        <w:tc>
+          <w:tcPr>
+            <w:tcBorders>
+              <w:bottom w:val="single" w:sz="12" w:space="0" w:color="666666"/>
+              <w:top w:val="single" w:sz="12" w:space="0" w:color="666666"/>
+              <w:left w:val="none" w:sz="0" w:space="0" w:color="000000"/>
+              <w:right w:val="none" w:sz="0" w:space="0" w:color="000000"/>
+            </w:tcBorders>
+            <w:shd w:val="clear" w:color="auto" w:fill="FFFFFF"/>
+            <w:tcMar>
+              <w:top w:w="0" w:type="dxa"/>
+              <w:bottom w:w="0" w:type="dxa"/>
+              <w:left w:w="0" w:type="dxa"/>
+              <w:right w:w="0" w:type="dxa"/>
+            </w:tcMar>
+            <w:vAlign w:val="top"/>
+          </w:tcPr>
+          <w:p>
+            <w:pPr>
+              <w:pStyle w:val="Normal"/>
+              <w:jc w:val="left"/>
+              <w:pBdr>
+                <w:bottom w:val="none" w:sz="0" w:space="0" w:color="000000"/>
+                <w:top w:val="none" w:sz="0" w:space="0" w:color="000000"/>
+                <w:left w:val="none" w:sz="0" w:space="0" w:color="000000"/>
+                <w:right w:val="none" w:sz="0" w:space="0" w:color="000000"/>
+              </w:pBdr>
+              <w:spacing w:after="40" w:before="40" w:line="240"/>
+              <w:ind w:left="40" w:right="40" w:firstLine="0" w:firstLineChars="0"/>
+              <w:rPr>
+                <w:rFonts w:ascii="Arial" w:hAnsi="Arial" w:eastAsia="Arial" w:cs="Arial"/>
+                <w:i w:val="false"/>
+                <w:b w:val="false"/>
+                <w:u w:val="none"/>
+                <w:strike w:val="false"/>
+                <w:sz w:val="20"/>
+                <w:szCs w:val="20"/>
+                <w:color w:val="000000"/>
+              </w:rPr>
+            </w:pPr>
+            <w:r>
+              <w:rPr>
+                <w:rFonts w:ascii="Arial" w:hAnsi="Arial" w:eastAsia="Arial" w:cs="Arial"/>
+                <w:i w:val="false"/>
+                <w:b w:val="false"/>
+                <w:u w:val="none"/>
+                <w:strike w:val="false"/>
+                <w:sz w:val="20"/>
+                <w:szCs w:val="20"/>
+                <w:color w:val="000000"/>
+              </w:rPr>
+              <w:t xml:space="preserve">percent_true</w:t>
+            </w:r>
+          </w:p>
+        </w:tc>
+      </w:tr>
+      <w:tr>
+        <w:trPr>
+          <w:trHeight w:val="614" w:hRule="auto"/>
+        </w:trPr>
+        <w:tc>
+          <w:tcPr>
+            <w:tcBorders>
+              <w:bottom w:val="none" w:sz="0" w:space="0" w:color="000000"/>
+              <w:top w:val="single" w:sz="12" w:space="0" w:color="666666"/>
+              <w:left w:val="none" w:sz="0" w:space="0" w:color="000000"/>
+              <w:right w:val="none" w:sz="0" w:space="0" w:color="000000"/>
+            </w:tcBorders>
+            <w:shd w:val="clear" w:color="auto" w:fill="FFFFFF"/>
+            <w:tcMar>
+              <w:top w:w="0" w:type="dxa"/>
+              <w:bottom w:w="0" w:type="dxa"/>
+              <w:left w:w="0" w:type="dxa"/>
+              <w:right w:w="0" w:type="dxa"/>
+            </w:tcMar>
+            <w:vAlign w:val="top"/>
+          </w:tcPr>
+          <w:p>
+            <w:pPr>
+              <w:pStyle w:val="Normal"/>
+              <w:jc w:val="left"/>
+              <w:pBdr>
+                <w:bottom w:val="none" w:sz="0" w:space="0" w:color="000000"/>
+                <w:top w:val="none" w:sz="0" w:space="0" w:color="000000"/>
+                <w:left w:val="none" w:sz="0" w:space="0" w:color="000000"/>
+                <w:right w:val="none" w:sz="0" w:space="0" w:color="000000"/>
+              </w:pBdr>
+              <w:spacing w:after="40" w:before="40" w:line="240"/>
+              <w:ind w:left="40" w:right="40" w:firstLine="0" w:firstLineChars="0"/>
+              <w:rPr>
+                <w:rFonts w:ascii="Arial" w:hAnsi="Arial" w:eastAsia="Arial" w:cs="Arial"/>
+                <w:i w:val="false"/>
+                <w:b w:val="false"/>
+                <w:u w:val="none"/>
+                <w:strike w:val="false"/>
+                <w:sz w:val="20"/>
+                <w:szCs w:val="20"/>
+                <w:color w:val="000000"/>
+              </w:rPr>
+            </w:pPr>
+            <w:r>
+              <w:rPr>
+                <w:rFonts w:ascii="Arial" w:hAnsi="Arial" w:eastAsia="Arial" w:cs="Arial"/>
+                <w:i w:val="false"/>
+                <w:b w:val="false"/>
+                <w:u w:val="none"/>
+                <w:strike w:val="false"/>
+                <w:sz w:val="20"/>
+                <w:szCs w:val="20"/>
+                <w:color w:val="000000"/>
+              </w:rPr>
+              <w:t xml:space="preserve">Within-scale item collapsing</w:t>
+            </w:r>
+          </w:p>
+        </w:tc>
+        <w:tc>
+          <w:tcPr>
+            <w:tcBorders>
+              <w:bottom w:val="none" w:sz="0" w:space="0" w:color="000000"/>
+              <w:top w:val="single" w:sz="12" w:space="0" w:color="666666"/>
+              <w:left w:val="none" w:sz="0" w:space="0" w:color="000000"/>
+              <w:right w:val="none" w:sz="0" w:space="0" w:color="000000"/>
+            </w:tcBorders>
+            <w:shd w:val="clear" w:color="auto" w:fill="FFFFFF"/>
+            <w:tcMar>
+              <w:top w:w="0" w:type="dxa"/>
+              <w:bottom w:w="0" w:type="dxa"/>
+              <w:left w:w="0" w:type="dxa"/>
+              <w:right w:w="0" w:type="dxa"/>
+            </w:tcMar>
+            <w:vAlign w:val="top"/>
+          </w:tcPr>
+          <w:p>
+            <w:pPr>
+              <w:pStyle w:val="Normal"/>
+              <w:jc w:val="left"/>
+              <w:pBdr>
+                <w:bottom w:val="none" w:sz="0" w:space="0" w:color="000000"/>
+                <w:top w:val="none" w:sz="0" w:space="0" w:color="000000"/>
+                <w:left w:val="none" w:sz="0" w:space="0" w:color="000000"/>
+                <w:right w:val="none" w:sz="0" w:space="0" w:color="000000"/>
+              </w:pBdr>
+              <w:spacing w:after="40" w:before="40" w:line="240"/>
+              <w:ind w:left="40" w:right="40" w:firstLine="0" w:firstLineChars="0"/>
+              <w:rPr>
+                <w:rFonts w:ascii="Arial" w:hAnsi="Arial" w:eastAsia="Arial" w:cs="Arial"/>
+                <w:i w:val="false"/>
+                <w:b w:val="false"/>
+                <w:u w:val="none"/>
+                <w:strike w:val="false"/>
+                <w:sz w:val="20"/>
+                <w:szCs w:val="20"/>
+                <w:color w:val="000000"/>
+              </w:rPr>
+            </w:pPr>
+            <w:r>
+              <w:rPr>
+                <w:rFonts w:ascii="Arial" w:hAnsi="Arial" w:eastAsia="Arial" w:cs="Arial"/>
+                <w:i w:val="false"/>
+                <w:b w:val="false"/>
+                <w:u w:val="none"/>
+                <w:strike w:val="false"/>
+                <w:sz w:val="20"/>
+                <w:szCs w:val="20"/>
+                <w:color w:val="000000"/>
+              </w:rPr>
+              <w:t xml:space="preserve">16</w:t>
+            </w:r>
+          </w:p>
+        </w:tc>
+        <w:tc>
+          <w:tcPr>
+            <w:tcBorders>
+              <w:bottom w:val="none" w:sz="0" w:space="0" w:color="000000"/>
+              <w:top w:val="single" w:sz="12" w:space="0" w:color="666666"/>
+              <w:left w:val="none" w:sz="0" w:space="0" w:color="000000"/>
+              <w:right w:val="none" w:sz="0" w:space="0" w:color="000000"/>
+            </w:tcBorders>
+            <w:shd w:val="clear" w:color="auto" w:fill="FFFFFF"/>
+            <w:tcMar>
+              <w:top w:w="0" w:type="dxa"/>
+              <w:bottom w:w="0" w:type="dxa"/>
+              <w:left w:w="0" w:type="dxa"/>
+              <w:right w:w="0" w:type="dxa"/>
+            </w:tcMar>
+            <w:vAlign w:val="top"/>
+          </w:tcPr>
+          <w:p>
+            <w:pPr>
+              <w:pStyle w:val="Normal"/>
+              <w:jc w:val="left"/>
+              <w:pBdr>
+                <w:bottom w:val="none" w:sz="0" w:space="0" w:color="000000"/>
+                <w:top w:val="none" w:sz="0" w:space="0" w:color="000000"/>
+                <w:left w:val="none" w:sz="0" w:space="0" w:color="000000"/>
+                <w:right w:val="none" w:sz="0" w:space="0" w:color="000000"/>
+              </w:pBdr>
+              <w:spacing w:after="40" w:before="40" w:line="240"/>
+              <w:ind w:left="40" w:right="40" w:firstLine="0" w:firstLineChars="0"/>
+              <w:rPr>
+                <w:rFonts w:ascii="Arial" w:hAnsi="Arial" w:eastAsia="Arial" w:cs="Arial"/>
+                <w:i w:val="false"/>
+                <w:b w:val="false"/>
+                <w:u w:val="none"/>
+                <w:strike w:val="false"/>
+                <w:sz w:val="20"/>
+                <w:szCs w:val="20"/>
+                <w:color w:val="000000"/>
+              </w:rPr>
+            </w:pPr>
+            <w:r>
+              <w:rPr>
+                <w:rFonts w:ascii="Arial" w:hAnsi="Arial" w:eastAsia="Arial" w:cs="Arial"/>
+                <w:i w:val="false"/>
+                <w:b w:val="false"/>
+                <w:u w:val="none"/>
+                <w:strike w:val="false"/>
+                <w:sz w:val="20"/>
+                <w:szCs w:val="20"/>
+                <w:color w:val="000000"/>
+              </w:rPr>
+              <w:t xml:space="preserve">16/37</w:t>
+            </w:r>
+          </w:p>
+        </w:tc>
+        <w:tc>
+          <w:tcPr>
+            <w:tcBorders>
+              <w:bottom w:val="none" w:sz="0" w:space="0" w:color="000000"/>
+              <w:top w:val="single" w:sz="12" w:space="0" w:color="666666"/>
+              <w:left w:val="none" w:sz="0" w:space="0" w:color="000000"/>
+              <w:right w:val="none" w:sz="0" w:space="0" w:color="000000"/>
+            </w:tcBorders>
+            <w:shd w:val="clear" w:color="auto" w:fill="FFFFFF"/>
+            <w:tcMar>
+              <w:top w:w="0" w:type="dxa"/>
+              <w:bottom w:w="0" w:type="dxa"/>
+              <w:left w:w="0" w:type="dxa"/>
+              <w:right w:w="0" w:type="dxa"/>
+            </w:tcMar>
+            <w:vAlign w:val="top"/>
+          </w:tcPr>
+          <w:p>
+            <w:pPr>
+              <w:pStyle w:val="Normal"/>
+              <w:jc w:val="left"/>
+              <w:pBdr>
+                <w:bottom w:val="none" w:sz="0" w:space="0" w:color="000000"/>
+                <w:top w:val="none" w:sz="0" w:space="0" w:color="000000"/>
+                <w:left w:val="none" w:sz="0" w:space="0" w:color="000000"/>
+                <w:right w:val="none" w:sz="0" w:space="0" w:color="000000"/>
+              </w:pBdr>
+              <w:spacing w:after="40" w:before="40" w:line="240"/>
+              <w:ind w:left="40" w:right="40" w:firstLine="0" w:firstLineChars="0"/>
+              <w:rPr>
+                <w:rFonts w:ascii="Arial" w:hAnsi="Arial" w:eastAsia="Arial" w:cs="Arial"/>
+                <w:i w:val="false"/>
+                <w:b w:val="false"/>
+                <w:u w:val="none"/>
+                <w:strike w:val="false"/>
+                <w:sz w:val="20"/>
+                <w:szCs w:val="20"/>
+                <w:color w:val="000000"/>
+              </w:rPr>
+            </w:pPr>
+            <w:r>
+              <w:rPr>
+                <w:rFonts w:ascii="Arial" w:hAnsi="Arial" w:eastAsia="Arial" w:cs="Arial"/>
+                <w:i w:val="false"/>
+                <w:b w:val="false"/>
+                <w:u w:val="none"/>
+                <w:strike w:val="false"/>
+                <w:sz w:val="20"/>
+                <w:szCs w:val="20"/>
+                <w:color w:val="000000"/>
+              </w:rPr>
+              <w:t xml:space="preserve">43.2%</w:t>
+            </w:r>
+          </w:p>
+        </w:tc>
+      </w:tr>
+      <w:tr>
+        <w:trPr>
+          <w:trHeight w:val="612" w:hRule="auto"/>
+        </w:trPr>
+        <w:tc>
+          <w:tcPr>
+            <w:tcBorders>
+              <w:bottom w:val="none" w:sz="0" w:space="0" w:color="000000"/>
+              <w:top w:val="none" w:sz="0" w:space="0" w:color="000000"/>
+              <w:left w:val="none" w:sz="0" w:space="0" w:color="000000"/>
+              <w:right w:val="none" w:sz="0" w:space="0" w:color="000000"/>
+            </w:tcBorders>
+            <w:shd w:val="clear" w:color="auto" w:fill="FFFFFF"/>
+            <w:tcMar>
+              <w:top w:w="0" w:type="dxa"/>
+              <w:bottom w:w="0" w:type="dxa"/>
+              <w:left w:w="0" w:type="dxa"/>
+              <w:right w:w="0" w:type="dxa"/>
+            </w:tcMar>
+            <w:vAlign w:val="top"/>
+          </w:tcPr>
+          <w:p>
+            <w:pPr>
+              <w:pStyle w:val="Normal"/>
+              <w:jc w:val="left"/>
+              <w:pBdr>
+                <w:bottom w:val="none" w:sz="0" w:space="0" w:color="000000"/>
+                <w:top w:val="none" w:sz="0" w:space="0" w:color="000000"/>
+                <w:left w:val="none" w:sz="0" w:space="0" w:color="000000"/>
+                <w:right w:val="none" w:sz="0" w:space="0" w:color="000000"/>
+              </w:pBdr>
+              <w:spacing w:after="40" w:before="40" w:line="240"/>
+              <w:ind w:left="40" w:right="40" w:firstLine="0" w:firstLineChars="0"/>
+              <w:rPr>
+                <w:rFonts w:ascii="Arial" w:hAnsi="Arial" w:eastAsia="Arial" w:cs="Arial"/>
+                <w:i w:val="false"/>
+                <w:b w:val="false"/>
+                <w:u w:val="none"/>
+                <w:strike w:val="false"/>
+                <w:sz w:val="20"/>
+                <w:szCs w:val="20"/>
+                <w:color w:val="000000"/>
+              </w:rPr>
+            </w:pPr>
+            <w:r>
+              <w:rPr>
+                <w:rFonts w:ascii="Arial" w:hAnsi="Arial" w:eastAsia="Arial" w:cs="Arial"/>
+                <w:i w:val="false"/>
+                <w:b w:val="false"/>
+                <w:u w:val="none"/>
+                <w:strike w:val="false"/>
+                <w:sz w:val="20"/>
+                <w:szCs w:val="20"/>
+                <w:color w:val="000000"/>
+              </w:rPr>
+              <w:t xml:space="preserve">Reverse-worded items collapsed</w:t>
+            </w:r>
+          </w:p>
+        </w:tc>
+        <w:tc>
+          <w:tcPr>
+            <w:tcBorders>
+              <w:bottom w:val="none" w:sz="0" w:space="0" w:color="000000"/>
+              <w:top w:val="none" w:sz="0" w:space="0" w:color="000000"/>
+              <w:left w:val="none" w:sz="0" w:space="0" w:color="000000"/>
+              <w:right w:val="none" w:sz="0" w:space="0" w:color="000000"/>
+            </w:tcBorders>
+            <w:shd w:val="clear" w:color="auto" w:fill="FFFFFF"/>
+            <w:tcMar>
+              <w:top w:w="0" w:type="dxa"/>
+              <w:bottom w:w="0" w:type="dxa"/>
+              <w:left w:w="0" w:type="dxa"/>
+              <w:right w:w="0" w:type="dxa"/>
+            </w:tcMar>
+            <w:vAlign w:val="top"/>
+          </w:tcPr>
+          <w:p>
+            <w:pPr>
+              <w:pStyle w:val="Normal"/>
+              <w:jc w:val="left"/>
+              <w:pBdr>
+                <w:bottom w:val="none" w:sz="0" w:space="0" w:color="000000"/>
+                <w:top w:val="none" w:sz="0" w:space="0" w:color="000000"/>
+                <w:left w:val="none" w:sz="0" w:space="0" w:color="000000"/>
+                <w:right w:val="none" w:sz="0" w:space="0" w:color="000000"/>
+              </w:pBdr>
+              <w:spacing w:after="40" w:before="40" w:line="240"/>
+              <w:ind w:left="40" w:right="40" w:firstLine="0" w:firstLineChars="0"/>
+              <w:rPr>
+                <w:rFonts w:ascii="Arial" w:hAnsi="Arial" w:eastAsia="Arial" w:cs="Arial"/>
+                <w:i w:val="false"/>
+                <w:b w:val="false"/>
+                <w:u w:val="none"/>
+                <w:strike w:val="false"/>
+                <w:sz w:val="20"/>
+                <w:szCs w:val="20"/>
+                <w:color w:val="000000"/>
+              </w:rPr>
+            </w:pPr>
+            <w:r>
+              <w:rPr>
+                <w:rFonts w:ascii="Arial" w:hAnsi="Arial" w:eastAsia="Arial" w:cs="Arial"/>
+                <w:i w:val="false"/>
+                <w:b w:val="false"/>
+                <w:u w:val="none"/>
+                <w:strike w:val="false"/>
+                <w:sz w:val="20"/>
+                <w:szCs w:val="20"/>
+                <w:color w:val="000000"/>
+              </w:rPr>
+              <w:t xml:space="preserve">7</w:t>
+            </w:r>
+          </w:p>
+        </w:tc>
+        <w:tc>
+          <w:tcPr>
+            <w:tcBorders>
+              <w:bottom w:val="none" w:sz="0" w:space="0" w:color="000000"/>
+              <w:top w:val="none" w:sz="0" w:space="0" w:color="000000"/>
+              <w:left w:val="none" w:sz="0" w:space="0" w:color="000000"/>
+              <w:right w:val="none" w:sz="0" w:space="0" w:color="000000"/>
+            </w:tcBorders>
+            <w:shd w:val="clear" w:color="auto" w:fill="FFFFFF"/>
+            <w:tcMar>
+              <w:top w:w="0" w:type="dxa"/>
+              <w:bottom w:w="0" w:type="dxa"/>
+              <w:left w:w="0" w:type="dxa"/>
+              <w:right w:w="0" w:type="dxa"/>
+            </w:tcMar>
+            <w:vAlign w:val="top"/>
+          </w:tcPr>
+          <w:p>
+            <w:pPr>
+              <w:pStyle w:val="Normal"/>
+              <w:jc w:val="left"/>
+              <w:pBdr>
+                <w:bottom w:val="none" w:sz="0" w:space="0" w:color="000000"/>
+                <w:top w:val="none" w:sz="0" w:space="0" w:color="000000"/>
+                <w:left w:val="none" w:sz="0" w:space="0" w:color="000000"/>
+                <w:right w:val="none" w:sz="0" w:space="0" w:color="000000"/>
+              </w:pBdr>
+              <w:spacing w:after="40" w:before="40" w:line="240"/>
+              <w:ind w:left="40" w:right="40" w:firstLine="0" w:firstLineChars="0"/>
+              <w:rPr>
+                <w:rFonts w:ascii="Arial" w:hAnsi="Arial" w:eastAsia="Arial" w:cs="Arial"/>
+                <w:i w:val="false"/>
+                <w:b w:val="false"/>
+                <w:u w:val="none"/>
+                <w:strike w:val="false"/>
+                <w:sz w:val="20"/>
+                <w:szCs w:val="20"/>
+                <w:color w:val="000000"/>
+              </w:rPr>
+            </w:pPr>
+            <w:r>
+              <w:rPr>
+                <w:rFonts w:ascii="Arial" w:hAnsi="Arial" w:eastAsia="Arial" w:cs="Arial"/>
+                <w:i w:val="false"/>
+                <w:b w:val="false"/>
+                <w:u w:val="none"/>
+                <w:strike w:val="false"/>
+                <w:sz w:val="20"/>
+                <w:szCs w:val="20"/>
+                <w:color w:val="000000"/>
+              </w:rPr>
+              <w:t xml:space="preserve">7/37</w:t>
+            </w:r>
+          </w:p>
+        </w:tc>
+        <w:tc>
+          <w:tcPr>
+            <w:tcBorders>
+              <w:bottom w:val="none" w:sz="0" w:space="0" w:color="000000"/>
+              <w:top w:val="none" w:sz="0" w:space="0" w:color="000000"/>
+              <w:left w:val="none" w:sz="0" w:space="0" w:color="000000"/>
+              <w:right w:val="none" w:sz="0" w:space="0" w:color="000000"/>
+            </w:tcBorders>
+            <w:shd w:val="clear" w:color="auto" w:fill="FFFFFF"/>
+            <w:tcMar>
+              <w:top w:w="0" w:type="dxa"/>
+              <w:bottom w:w="0" w:type="dxa"/>
+              <w:left w:w="0" w:type="dxa"/>
+              <w:right w:w="0" w:type="dxa"/>
+            </w:tcMar>
+            <w:vAlign w:val="top"/>
+          </w:tcPr>
+          <w:p>
+            <w:pPr>
+              <w:pStyle w:val="Normal"/>
+              <w:jc w:val="left"/>
+              <w:pBdr>
+                <w:bottom w:val="none" w:sz="0" w:space="0" w:color="000000"/>
+                <w:top w:val="none" w:sz="0" w:space="0" w:color="000000"/>
+                <w:left w:val="none" w:sz="0" w:space="0" w:color="000000"/>
+                <w:right w:val="none" w:sz="0" w:space="0" w:color="000000"/>
+              </w:pBdr>
+              <w:spacing w:after="40" w:before="40" w:line="240"/>
+              <w:ind w:left="40" w:right="40" w:firstLine="0" w:firstLineChars="0"/>
+              <w:rPr>
+                <w:rFonts w:ascii="Arial" w:hAnsi="Arial" w:eastAsia="Arial" w:cs="Arial"/>
+                <w:i w:val="false"/>
+                <w:b w:val="false"/>
+                <w:u w:val="none"/>
+                <w:strike w:val="false"/>
+                <w:sz w:val="20"/>
+                <w:szCs w:val="20"/>
+                <w:color w:val="000000"/>
+              </w:rPr>
+            </w:pPr>
+            <w:r>
+              <w:rPr>
+                <w:rFonts w:ascii="Arial" w:hAnsi="Arial" w:eastAsia="Arial" w:cs="Arial"/>
+                <w:i w:val="false"/>
+                <w:b w:val="false"/>
+                <w:u w:val="none"/>
+                <w:strike w:val="false"/>
+                <w:sz w:val="20"/>
+                <w:szCs w:val="20"/>
+                <w:color w:val="000000"/>
+              </w:rPr>
+              <w:t xml:space="preserve">18.9%</w:t>
+            </w:r>
+          </w:p>
+        </w:tc>
+      </w:tr>
+      <w:tr>
+        <w:trPr>
+          <w:trHeight w:val="612" w:hRule="auto"/>
+        </w:trPr>
+        <w:tc>
+          <w:tcPr>
+            <w:tcBorders>
+              <w:bottom w:val="none" w:sz="0" w:space="0" w:color="000000"/>
+              <w:top w:val="none" w:sz="0" w:space="0" w:color="000000"/>
+              <w:left w:val="none" w:sz="0" w:space="0" w:color="000000"/>
+              <w:right w:val="none" w:sz="0" w:space="0" w:color="000000"/>
+            </w:tcBorders>
+            <w:shd w:val="clear" w:color="auto" w:fill="FFFFFF"/>
+            <w:tcMar>
+              <w:top w:w="0" w:type="dxa"/>
+              <w:bottom w:w="0" w:type="dxa"/>
+              <w:left w:w="0" w:type="dxa"/>
+              <w:right w:w="0" w:type="dxa"/>
+            </w:tcMar>
+            <w:vAlign w:val="top"/>
+          </w:tcPr>
+          <w:p>
+            <w:pPr>
+              <w:pStyle w:val="Normal"/>
+              <w:jc w:val="left"/>
+              <w:pBdr>
+                <w:bottom w:val="none" w:sz="0" w:space="0" w:color="000000"/>
+                <w:top w:val="none" w:sz="0" w:space="0" w:color="000000"/>
+                <w:left w:val="none" w:sz="0" w:space="0" w:color="000000"/>
+                <w:right w:val="none" w:sz="0" w:space="0" w:color="000000"/>
+              </w:pBdr>
+              <w:spacing w:after="40" w:before="40" w:line="240"/>
+              <w:ind w:left="40" w:right="40" w:firstLine="0" w:firstLineChars="0"/>
+              <w:rPr>
+                <w:rFonts w:ascii="Arial" w:hAnsi="Arial" w:eastAsia="Arial" w:cs="Arial"/>
+                <w:i w:val="false"/>
+                <w:b w:val="false"/>
+                <w:u w:val="none"/>
+                <w:strike w:val="false"/>
+                <w:sz w:val="20"/>
+                <w:szCs w:val="20"/>
+                <w:color w:val="000000"/>
+              </w:rPr>
+            </w:pPr>
+            <w:r>
+              <w:rPr>
+                <w:rFonts w:ascii="Arial" w:hAnsi="Arial" w:eastAsia="Arial" w:cs="Arial"/>
+                <w:i w:val="false"/>
+                <w:b w:val="false"/>
+                <w:u w:val="none"/>
+                <w:strike w:val="false"/>
+                <w:sz w:val="20"/>
+                <w:szCs w:val="20"/>
+                <w:color w:val="000000"/>
+              </w:rPr>
+              <w:t xml:space="preserve">Item exclusions reported</w:t>
+            </w:r>
+          </w:p>
+        </w:tc>
+        <w:tc>
+          <w:tcPr>
+            <w:tcBorders>
+              <w:bottom w:val="none" w:sz="0" w:space="0" w:color="000000"/>
+              <w:top w:val="none" w:sz="0" w:space="0" w:color="000000"/>
+              <w:left w:val="none" w:sz="0" w:space="0" w:color="000000"/>
+              <w:right w:val="none" w:sz="0" w:space="0" w:color="000000"/>
+            </w:tcBorders>
+            <w:shd w:val="clear" w:color="auto" w:fill="FFFFFF"/>
+            <w:tcMar>
+              <w:top w:w="0" w:type="dxa"/>
+              <w:bottom w:w="0" w:type="dxa"/>
+              <w:left w:w="0" w:type="dxa"/>
+              <w:right w:w="0" w:type="dxa"/>
+            </w:tcMar>
+            <w:vAlign w:val="top"/>
+          </w:tcPr>
+          <w:p>
+            <w:pPr>
+              <w:pStyle w:val="Normal"/>
+              <w:jc w:val="left"/>
+              <w:pBdr>
+                <w:bottom w:val="none" w:sz="0" w:space="0" w:color="000000"/>
+                <w:top w:val="none" w:sz="0" w:space="0" w:color="000000"/>
+                <w:left w:val="none" w:sz="0" w:space="0" w:color="000000"/>
+                <w:right w:val="none" w:sz="0" w:space="0" w:color="000000"/>
+              </w:pBdr>
+              <w:spacing w:after="40" w:before="40" w:line="240"/>
+              <w:ind w:left="40" w:right="40" w:firstLine="0" w:firstLineChars="0"/>
+              <w:rPr>
+                <w:rFonts w:ascii="Arial" w:hAnsi="Arial" w:eastAsia="Arial" w:cs="Arial"/>
+                <w:i w:val="false"/>
+                <w:b w:val="false"/>
+                <w:u w:val="none"/>
+                <w:strike w:val="false"/>
+                <w:sz w:val="20"/>
+                <w:szCs w:val="20"/>
+                <w:color w:val="000000"/>
+              </w:rPr>
+            </w:pPr>
+            <w:r>
+              <w:rPr>
+                <w:rFonts w:ascii="Arial" w:hAnsi="Arial" w:eastAsia="Arial" w:cs="Arial"/>
+                <w:i w:val="false"/>
+                <w:b w:val="false"/>
+                <w:u w:val="none"/>
+                <w:strike w:val="false"/>
+                <w:sz w:val="20"/>
+                <w:szCs w:val="20"/>
+                <w:color w:val="000000"/>
+              </w:rPr>
+              <w:t xml:space="preserve">13</w:t>
+            </w:r>
+          </w:p>
+        </w:tc>
+        <w:tc>
+          <w:tcPr>
+            <w:tcBorders>
+              <w:bottom w:val="none" w:sz="0" w:space="0" w:color="000000"/>
+              <w:top w:val="none" w:sz="0" w:space="0" w:color="000000"/>
+              <w:left w:val="none" w:sz="0" w:space="0" w:color="000000"/>
+              <w:right w:val="none" w:sz="0" w:space="0" w:color="000000"/>
+            </w:tcBorders>
+            <w:shd w:val="clear" w:color="auto" w:fill="FFFFFF"/>
+            <w:tcMar>
+              <w:top w:w="0" w:type="dxa"/>
+              <w:bottom w:w="0" w:type="dxa"/>
+              <w:left w:w="0" w:type="dxa"/>
+              <w:right w:w="0" w:type="dxa"/>
+            </w:tcMar>
+            <w:vAlign w:val="top"/>
+          </w:tcPr>
+          <w:p>
+            <w:pPr>
+              <w:pStyle w:val="Normal"/>
+              <w:jc w:val="left"/>
+              <w:pBdr>
+                <w:bottom w:val="none" w:sz="0" w:space="0" w:color="000000"/>
+                <w:top w:val="none" w:sz="0" w:space="0" w:color="000000"/>
+                <w:left w:val="none" w:sz="0" w:space="0" w:color="000000"/>
+                <w:right w:val="none" w:sz="0" w:space="0" w:color="000000"/>
+              </w:pBdr>
+              <w:spacing w:after="40" w:before="40" w:line="240"/>
+              <w:ind w:left="40" w:right="40" w:firstLine="0" w:firstLineChars="0"/>
+              <w:rPr>
+                <w:rFonts w:ascii="Arial" w:hAnsi="Arial" w:eastAsia="Arial" w:cs="Arial"/>
+                <w:i w:val="false"/>
+                <w:b w:val="false"/>
+                <w:u w:val="none"/>
+                <w:strike w:val="false"/>
+                <w:sz w:val="20"/>
+                <w:szCs w:val="20"/>
+                <w:color w:val="000000"/>
+              </w:rPr>
+            </w:pPr>
+            <w:r>
+              <w:rPr>
+                <w:rFonts w:ascii="Arial" w:hAnsi="Arial" w:eastAsia="Arial" w:cs="Arial"/>
+                <w:i w:val="false"/>
+                <w:b w:val="false"/>
+                <w:u w:val="none"/>
+                <w:strike w:val="false"/>
+                <w:sz w:val="20"/>
+                <w:szCs w:val="20"/>
+                <w:color w:val="000000"/>
+              </w:rPr>
+              <w:t xml:space="preserve">13/37</w:t>
+            </w:r>
+          </w:p>
+        </w:tc>
+        <w:tc>
+          <w:tcPr>
+            <w:tcBorders>
+              <w:bottom w:val="none" w:sz="0" w:space="0" w:color="000000"/>
+              <w:top w:val="none" w:sz="0" w:space="0" w:color="000000"/>
+              <w:left w:val="none" w:sz="0" w:space="0" w:color="000000"/>
+              <w:right w:val="none" w:sz="0" w:space="0" w:color="000000"/>
+            </w:tcBorders>
+            <w:shd w:val="clear" w:color="auto" w:fill="FFFFFF"/>
+            <w:tcMar>
+              <w:top w:w="0" w:type="dxa"/>
+              <w:bottom w:w="0" w:type="dxa"/>
+              <w:left w:w="0" w:type="dxa"/>
+              <w:right w:w="0" w:type="dxa"/>
+            </w:tcMar>
+            <w:vAlign w:val="top"/>
+          </w:tcPr>
+          <w:p>
+            <w:pPr>
+              <w:pStyle w:val="Normal"/>
+              <w:jc w:val="left"/>
+              <w:pBdr>
+                <w:bottom w:val="none" w:sz="0" w:space="0" w:color="000000"/>
+                <w:top w:val="none" w:sz="0" w:space="0" w:color="000000"/>
+                <w:left w:val="none" w:sz="0" w:space="0" w:color="000000"/>
+                <w:right w:val="none" w:sz="0" w:space="0" w:color="000000"/>
+              </w:pBdr>
+              <w:spacing w:after="40" w:before="40" w:line="240"/>
+              <w:ind w:left="40" w:right="40" w:firstLine="0" w:firstLineChars="0"/>
+              <w:rPr>
+                <w:rFonts w:ascii="Arial" w:hAnsi="Arial" w:eastAsia="Arial" w:cs="Arial"/>
+                <w:i w:val="false"/>
+                <w:b w:val="false"/>
+                <w:u w:val="none"/>
+                <w:strike w:val="false"/>
+                <w:sz w:val="20"/>
+                <w:szCs w:val="20"/>
+                <w:color w:val="000000"/>
+              </w:rPr>
+            </w:pPr>
+            <w:r>
+              <w:rPr>
+                <w:rFonts w:ascii="Arial" w:hAnsi="Arial" w:eastAsia="Arial" w:cs="Arial"/>
+                <w:i w:val="false"/>
+                <w:b w:val="false"/>
+                <w:u w:val="none"/>
+                <w:strike w:val="false"/>
+                <w:sz w:val="20"/>
+                <w:szCs w:val="20"/>
+                <w:color w:val="000000"/>
+              </w:rPr>
+              <w:t xml:space="preserve">35.1%</w:t>
+            </w:r>
+          </w:p>
+        </w:tc>
+      </w:tr>
+      <w:tr>
+        <w:trPr>
+          <w:trHeight w:val="617" w:hRule="auto"/>
+        </w:trPr>
+        <w:tc>
+          <w:tcPr>
+            <w:tcBorders>
+              <w:bottom w:val="none" w:sz="0" w:space="0" w:color="000000"/>
+              <w:top w:val="none" w:sz="0" w:space="0" w:color="000000"/>
+              <w:left w:val="none" w:sz="0" w:space="0" w:color="000000"/>
+              <w:right w:val="none" w:sz="0" w:space="0" w:color="000000"/>
+            </w:tcBorders>
+            <w:shd w:val="clear" w:color="auto" w:fill="FFFFFF"/>
+            <w:tcMar>
+              <w:top w:w="0" w:type="dxa"/>
+              <w:bottom w:w="0" w:type="dxa"/>
+              <w:left w:w="0" w:type="dxa"/>
+              <w:right w:w="0" w:type="dxa"/>
+            </w:tcMar>
+            <w:vAlign w:val="top"/>
+          </w:tcPr>
+          <w:p>
+            <w:pPr>
+              <w:pStyle w:val="Normal"/>
+              <w:jc w:val="left"/>
+              <w:pBdr>
+                <w:bottom w:val="none" w:sz="0" w:space="0" w:color="000000"/>
+                <w:top w:val="none" w:sz="0" w:space="0" w:color="000000"/>
+                <w:left w:val="none" w:sz="0" w:space="0" w:color="000000"/>
+                <w:right w:val="none" w:sz="0" w:space="0" w:color="000000"/>
+              </w:pBdr>
+              <w:spacing w:after="40" w:before="40" w:line="240"/>
+              <w:ind w:left="40" w:right="40" w:firstLine="0" w:firstLineChars="0"/>
+              <w:rPr>
+                <w:rFonts w:ascii="Arial" w:hAnsi="Arial" w:eastAsia="Arial" w:cs="Arial"/>
+                <w:i w:val="false"/>
+                <w:b w:val="false"/>
+                <w:u w:val="none"/>
+                <w:strike w:val="false"/>
+                <w:sz w:val="20"/>
+                <w:szCs w:val="20"/>
+                <w:color w:val="000000"/>
+              </w:rPr>
+            </w:pPr>
+            <w:r>
+              <w:rPr>
+                <w:rFonts w:ascii="Arial" w:hAnsi="Arial" w:eastAsia="Arial" w:cs="Arial"/>
+                <w:i w:val="false"/>
+                <w:b w:val="false"/>
+                <w:u w:val="none"/>
+                <w:strike w:val="false"/>
+                <w:sz w:val="20"/>
+                <w:szCs w:val="20"/>
+                <w:color w:val="000000"/>
+              </w:rPr>
+              <w:t xml:space="preserve">Idiosyncratic/unique items discussed</w:t>
+            </w:r>
+          </w:p>
+        </w:tc>
+        <w:tc>
+          <w:tcPr>
+            <w:tcBorders>
+              <w:bottom w:val="none" w:sz="0" w:space="0" w:color="000000"/>
+              <w:top w:val="none" w:sz="0" w:space="0" w:color="000000"/>
+              <w:left w:val="none" w:sz="0" w:space="0" w:color="000000"/>
+              <w:right w:val="none" w:sz="0" w:space="0" w:color="000000"/>
+            </w:tcBorders>
+            <w:shd w:val="clear" w:color="auto" w:fill="FFFFFF"/>
+            <w:tcMar>
+              <w:top w:w="0" w:type="dxa"/>
+              <w:bottom w:w="0" w:type="dxa"/>
+              <w:left w:w="0" w:type="dxa"/>
+              <w:right w:w="0" w:type="dxa"/>
+            </w:tcMar>
+            <w:vAlign w:val="top"/>
+          </w:tcPr>
+          <w:p>
+            <w:pPr>
+              <w:pStyle w:val="Normal"/>
+              <w:jc w:val="left"/>
+              <w:pBdr>
+                <w:bottom w:val="none" w:sz="0" w:space="0" w:color="000000"/>
+                <w:top w:val="none" w:sz="0" w:space="0" w:color="000000"/>
+                <w:left w:val="none" w:sz="0" w:space="0" w:color="000000"/>
+                <w:right w:val="none" w:sz="0" w:space="0" w:color="000000"/>
+              </w:pBdr>
+              <w:spacing w:after="40" w:before="40" w:line="240"/>
+              <w:ind w:left="40" w:right="40" w:firstLine="0" w:firstLineChars="0"/>
+              <w:rPr>
+                <w:rFonts w:ascii="Arial" w:hAnsi="Arial" w:eastAsia="Arial" w:cs="Arial"/>
+                <w:i w:val="false"/>
+                <w:b w:val="false"/>
+                <w:u w:val="none"/>
+                <w:strike w:val="false"/>
+                <w:sz w:val="20"/>
+                <w:szCs w:val="20"/>
+                <w:color w:val="000000"/>
+              </w:rPr>
+            </w:pPr>
+            <w:r>
+              <w:rPr>
+                <w:rFonts w:ascii="Arial" w:hAnsi="Arial" w:eastAsia="Arial" w:cs="Arial"/>
+                <w:i w:val="false"/>
+                <w:b w:val="false"/>
+                <w:u w:val="none"/>
+                <w:strike w:val="false"/>
+                <w:sz w:val="20"/>
+                <w:szCs w:val="20"/>
+                <w:color w:val="000000"/>
+              </w:rPr>
+              <w:t xml:space="preserve">26</w:t>
+            </w:r>
+          </w:p>
+        </w:tc>
+        <w:tc>
+          <w:tcPr>
+            <w:tcBorders>
+              <w:bottom w:val="none" w:sz="0" w:space="0" w:color="000000"/>
+              <w:top w:val="none" w:sz="0" w:space="0" w:color="000000"/>
+              <w:left w:val="none" w:sz="0" w:space="0" w:color="000000"/>
+              <w:right w:val="none" w:sz="0" w:space="0" w:color="000000"/>
+            </w:tcBorders>
+            <w:shd w:val="clear" w:color="auto" w:fill="FFFFFF"/>
+            <w:tcMar>
+              <w:top w:w="0" w:type="dxa"/>
+              <w:bottom w:w="0" w:type="dxa"/>
+              <w:left w:w="0" w:type="dxa"/>
+              <w:right w:w="0" w:type="dxa"/>
+            </w:tcMar>
+            <w:vAlign w:val="top"/>
+          </w:tcPr>
+          <w:p>
+            <w:pPr>
+              <w:pStyle w:val="Normal"/>
+              <w:jc w:val="left"/>
+              <w:pBdr>
+                <w:bottom w:val="none" w:sz="0" w:space="0" w:color="000000"/>
+                <w:top w:val="none" w:sz="0" w:space="0" w:color="000000"/>
+                <w:left w:val="none" w:sz="0" w:space="0" w:color="000000"/>
+                <w:right w:val="none" w:sz="0" w:space="0" w:color="000000"/>
+              </w:pBdr>
+              <w:spacing w:after="40" w:before="40" w:line="240"/>
+              <w:ind w:left="40" w:right="40" w:firstLine="0" w:firstLineChars="0"/>
+              <w:rPr>
+                <w:rFonts w:ascii="Arial" w:hAnsi="Arial" w:eastAsia="Arial" w:cs="Arial"/>
+                <w:i w:val="false"/>
+                <w:b w:val="false"/>
+                <w:u w:val="none"/>
+                <w:strike w:val="false"/>
+                <w:sz w:val="20"/>
+                <w:szCs w:val="20"/>
+                <w:color w:val="000000"/>
+              </w:rPr>
+            </w:pPr>
+            <w:r>
+              <w:rPr>
+                <w:rFonts w:ascii="Arial" w:hAnsi="Arial" w:eastAsia="Arial" w:cs="Arial"/>
+                <w:i w:val="false"/>
+                <w:b w:val="false"/>
+                <w:u w:val="none"/>
+                <w:strike w:val="false"/>
+                <w:sz w:val="20"/>
+                <w:szCs w:val="20"/>
+                <w:color w:val="000000"/>
+              </w:rPr>
+              <w:t xml:space="preserve">26/37</w:t>
+            </w:r>
+          </w:p>
+        </w:tc>
+        <w:tc>
+          <w:tcPr>
+            <w:tcBorders>
+              <w:bottom w:val="none" w:sz="0" w:space="0" w:color="000000"/>
+              <w:top w:val="none" w:sz="0" w:space="0" w:color="000000"/>
+              <w:left w:val="none" w:sz="0" w:space="0" w:color="000000"/>
+              <w:right w:val="none" w:sz="0" w:space="0" w:color="000000"/>
+            </w:tcBorders>
+            <w:shd w:val="clear" w:color="auto" w:fill="FFFFFF"/>
+            <w:tcMar>
+              <w:top w:w="0" w:type="dxa"/>
+              <w:bottom w:w="0" w:type="dxa"/>
+              <w:left w:w="0" w:type="dxa"/>
+              <w:right w:w="0" w:type="dxa"/>
+            </w:tcMar>
+            <w:vAlign w:val="top"/>
+          </w:tcPr>
+          <w:p>
+            <w:pPr>
+              <w:pStyle w:val="Normal"/>
+              <w:jc w:val="left"/>
+              <w:pBdr>
+                <w:bottom w:val="none" w:sz="0" w:space="0" w:color="000000"/>
+                <w:top w:val="none" w:sz="0" w:space="0" w:color="000000"/>
+                <w:left w:val="none" w:sz="0" w:space="0" w:color="000000"/>
+                <w:right w:val="none" w:sz="0" w:space="0" w:color="000000"/>
+              </w:pBdr>
+              <w:spacing w:after="40" w:before="40" w:line="240"/>
+              <w:ind w:left="40" w:right="40" w:firstLine="0" w:firstLineChars="0"/>
+              <w:rPr>
+                <w:rFonts w:ascii="Arial" w:hAnsi="Arial" w:eastAsia="Arial" w:cs="Arial"/>
+                <w:i w:val="false"/>
+                <w:b w:val="false"/>
+                <w:u w:val="none"/>
+                <w:strike w:val="false"/>
+                <w:sz w:val="20"/>
+                <w:szCs w:val="20"/>
+                <w:color w:val="000000"/>
+              </w:rPr>
+            </w:pPr>
+            <w:r>
+              <w:rPr>
+                <w:rFonts w:ascii="Arial" w:hAnsi="Arial" w:eastAsia="Arial" w:cs="Arial"/>
+                <w:i w:val="false"/>
+                <w:b w:val="false"/>
+                <w:u w:val="none"/>
+                <w:strike w:val="false"/>
+                <w:sz w:val="20"/>
+                <w:szCs w:val="20"/>
+                <w:color w:val="000000"/>
+              </w:rPr>
+              <w:t xml:space="preserve">70.3%</w:t>
+            </w:r>
+          </w:p>
+        </w:tc>
+      </w:tr>
+      <w:tr>
+        <w:trPr>
+          <w:trHeight w:val="615" w:hRule="auto"/>
+        </w:trPr>
+        <w:tc>
+          <w:tcPr>
+            <w:tcBorders>
+              <w:bottom w:val="none" w:sz="0" w:space="0" w:color="000000"/>
+              <w:top w:val="none" w:sz="0" w:space="0" w:color="000000"/>
+              <w:left w:val="none" w:sz="0" w:space="0" w:color="000000"/>
+              <w:right w:val="none" w:sz="0" w:space="0" w:color="000000"/>
+            </w:tcBorders>
+            <w:shd w:val="clear" w:color="auto" w:fill="FFFFFF"/>
+            <w:tcMar>
+              <w:top w:w="0" w:type="dxa"/>
+              <w:bottom w:w="0" w:type="dxa"/>
+              <w:left w:w="0" w:type="dxa"/>
+              <w:right w:w="0" w:type="dxa"/>
+            </w:tcMar>
+            <w:vAlign w:val="top"/>
+          </w:tcPr>
+          <w:p>
+            <w:pPr>
+              <w:pStyle w:val="Normal"/>
+              <w:jc w:val="left"/>
+              <w:pBdr>
+                <w:bottom w:val="none" w:sz="0" w:space="0" w:color="000000"/>
+                <w:top w:val="none" w:sz="0" w:space="0" w:color="000000"/>
+                <w:left w:val="none" w:sz="0" w:space="0" w:color="000000"/>
+                <w:right w:val="none" w:sz="0" w:space="0" w:color="000000"/>
+              </w:pBdr>
+              <w:spacing w:after="40" w:before="40" w:line="240"/>
+              <w:ind w:left="40" w:right="40" w:firstLine="0" w:firstLineChars="0"/>
+              <w:rPr>
+                <w:rFonts w:ascii="Arial" w:hAnsi="Arial" w:eastAsia="Arial" w:cs="Arial"/>
+                <w:i w:val="false"/>
+                <w:b w:val="false"/>
+                <w:u w:val="none"/>
+                <w:strike w:val="false"/>
+                <w:sz w:val="20"/>
+                <w:szCs w:val="20"/>
+                <w:color w:val="000000"/>
+              </w:rPr>
+            </w:pPr>
+            <w:r>
+              <w:rPr>
+                <w:rFonts w:ascii="Arial" w:hAnsi="Arial" w:eastAsia="Arial" w:cs="Arial"/>
+                <w:i w:val="false"/>
+                <w:b w:val="false"/>
+                <w:u w:val="none"/>
+                <w:strike w:val="false"/>
+                <w:sz w:val="20"/>
+                <w:szCs w:val="20"/>
+                <w:color w:val="000000"/>
+              </w:rPr>
+              <w:t xml:space="preserve">Compound items discussed</w:t>
+            </w:r>
+          </w:p>
+        </w:tc>
+        <w:tc>
+          <w:tcPr>
+            <w:tcBorders>
+              <w:bottom w:val="none" w:sz="0" w:space="0" w:color="000000"/>
+              <w:top w:val="none" w:sz="0" w:space="0" w:color="000000"/>
+              <w:left w:val="none" w:sz="0" w:space="0" w:color="000000"/>
+              <w:right w:val="none" w:sz="0" w:space="0" w:color="000000"/>
+            </w:tcBorders>
+            <w:shd w:val="clear" w:color="auto" w:fill="FFFFFF"/>
+            <w:tcMar>
+              <w:top w:w="0" w:type="dxa"/>
+              <w:bottom w:w="0" w:type="dxa"/>
+              <w:left w:w="0" w:type="dxa"/>
+              <w:right w:w="0" w:type="dxa"/>
+            </w:tcMar>
+            <w:vAlign w:val="top"/>
+          </w:tcPr>
+          <w:p>
+            <w:pPr>
+              <w:pStyle w:val="Normal"/>
+              <w:jc w:val="left"/>
+              <w:pBdr>
+                <w:bottom w:val="none" w:sz="0" w:space="0" w:color="000000"/>
+                <w:top w:val="none" w:sz="0" w:space="0" w:color="000000"/>
+                <w:left w:val="none" w:sz="0" w:space="0" w:color="000000"/>
+                <w:right w:val="none" w:sz="0" w:space="0" w:color="000000"/>
+              </w:pBdr>
+              <w:spacing w:after="40" w:before="40" w:line="240"/>
+              <w:ind w:left="40" w:right="40" w:firstLine="0" w:firstLineChars="0"/>
+              <w:rPr>
+                <w:rFonts w:ascii="Arial" w:hAnsi="Arial" w:eastAsia="Arial" w:cs="Arial"/>
+                <w:i w:val="false"/>
+                <w:b w:val="false"/>
+                <w:u w:val="none"/>
+                <w:strike w:val="false"/>
+                <w:sz w:val="20"/>
+                <w:szCs w:val="20"/>
+                <w:color w:val="000000"/>
+              </w:rPr>
+            </w:pPr>
+            <w:r>
+              <w:rPr>
+                <w:rFonts w:ascii="Arial" w:hAnsi="Arial" w:eastAsia="Arial" w:cs="Arial"/>
+                <w:i w:val="false"/>
+                <w:b w:val="false"/>
+                <w:u w:val="none"/>
+                <w:strike w:val="false"/>
+                <w:sz w:val="20"/>
+                <w:szCs w:val="20"/>
+                <w:color w:val="000000"/>
+              </w:rPr>
+              <w:t xml:space="preserve">24</w:t>
+            </w:r>
+          </w:p>
+        </w:tc>
+        <w:tc>
+          <w:tcPr>
+            <w:tcBorders>
+              <w:bottom w:val="none" w:sz="0" w:space="0" w:color="000000"/>
+              <w:top w:val="none" w:sz="0" w:space="0" w:color="000000"/>
+              <w:left w:val="none" w:sz="0" w:space="0" w:color="000000"/>
+              <w:right w:val="none" w:sz="0" w:space="0" w:color="000000"/>
+            </w:tcBorders>
+            <w:shd w:val="clear" w:color="auto" w:fill="FFFFFF"/>
+            <w:tcMar>
+              <w:top w:w="0" w:type="dxa"/>
+              <w:bottom w:w="0" w:type="dxa"/>
+              <w:left w:w="0" w:type="dxa"/>
+              <w:right w:w="0" w:type="dxa"/>
+            </w:tcMar>
+            <w:vAlign w:val="top"/>
+          </w:tcPr>
+          <w:p>
+            <w:pPr>
+              <w:pStyle w:val="Normal"/>
+              <w:jc w:val="left"/>
+              <w:pBdr>
+                <w:bottom w:val="none" w:sz="0" w:space="0" w:color="000000"/>
+                <w:top w:val="none" w:sz="0" w:space="0" w:color="000000"/>
+                <w:left w:val="none" w:sz="0" w:space="0" w:color="000000"/>
+                <w:right w:val="none" w:sz="0" w:space="0" w:color="000000"/>
+              </w:pBdr>
+              <w:spacing w:after="40" w:before="40" w:line="240"/>
+              <w:ind w:left="40" w:right="40" w:firstLine="0" w:firstLineChars="0"/>
+              <w:rPr>
+                <w:rFonts w:ascii="Arial" w:hAnsi="Arial" w:eastAsia="Arial" w:cs="Arial"/>
+                <w:i w:val="false"/>
+                <w:b w:val="false"/>
+                <w:u w:val="none"/>
+                <w:strike w:val="false"/>
+                <w:sz w:val="20"/>
+                <w:szCs w:val="20"/>
+                <w:color w:val="000000"/>
+              </w:rPr>
+            </w:pPr>
+            <w:r>
+              <w:rPr>
+                <w:rFonts w:ascii="Arial" w:hAnsi="Arial" w:eastAsia="Arial" w:cs="Arial"/>
+                <w:i w:val="false"/>
+                <w:b w:val="false"/>
+                <w:u w:val="none"/>
+                <w:strike w:val="false"/>
+                <w:sz w:val="20"/>
+                <w:szCs w:val="20"/>
+                <w:color w:val="000000"/>
+              </w:rPr>
+              <w:t xml:space="preserve">24/37</w:t>
+            </w:r>
+          </w:p>
+        </w:tc>
+        <w:tc>
+          <w:tcPr>
+            <w:tcBorders>
+              <w:bottom w:val="none" w:sz="0" w:space="0" w:color="000000"/>
+              <w:top w:val="none" w:sz="0" w:space="0" w:color="000000"/>
+              <w:left w:val="none" w:sz="0" w:space="0" w:color="000000"/>
+              <w:right w:val="none" w:sz="0" w:space="0" w:color="000000"/>
+            </w:tcBorders>
+            <w:shd w:val="clear" w:color="auto" w:fill="FFFFFF"/>
+            <w:tcMar>
+              <w:top w:w="0" w:type="dxa"/>
+              <w:bottom w:w="0" w:type="dxa"/>
+              <w:left w:w="0" w:type="dxa"/>
+              <w:right w:w="0" w:type="dxa"/>
+            </w:tcMar>
+            <w:vAlign w:val="top"/>
+          </w:tcPr>
+          <w:p>
+            <w:pPr>
+              <w:pStyle w:val="Normal"/>
+              <w:jc w:val="left"/>
+              <w:pBdr>
+                <w:bottom w:val="none" w:sz="0" w:space="0" w:color="000000"/>
+                <w:top w:val="none" w:sz="0" w:space="0" w:color="000000"/>
+                <w:left w:val="none" w:sz="0" w:space="0" w:color="000000"/>
+                <w:right w:val="none" w:sz="0" w:space="0" w:color="000000"/>
+              </w:pBdr>
+              <w:spacing w:after="40" w:before="40" w:line="240"/>
+              <w:ind w:left="40" w:right="40" w:firstLine="0" w:firstLineChars="0"/>
+              <w:rPr>
+                <w:rFonts w:ascii="Arial" w:hAnsi="Arial" w:eastAsia="Arial" w:cs="Arial"/>
+                <w:i w:val="false"/>
+                <w:b w:val="false"/>
+                <w:u w:val="none"/>
+                <w:strike w:val="false"/>
+                <w:sz w:val="20"/>
+                <w:szCs w:val="20"/>
+                <w:color w:val="000000"/>
+              </w:rPr>
+            </w:pPr>
+            <w:r>
+              <w:rPr>
+                <w:rFonts w:ascii="Arial" w:hAnsi="Arial" w:eastAsia="Arial" w:cs="Arial"/>
+                <w:i w:val="false"/>
+                <w:b w:val="false"/>
+                <w:u w:val="none"/>
+                <w:strike w:val="false"/>
+                <w:sz w:val="20"/>
+                <w:szCs w:val="20"/>
+                <w:color w:val="000000"/>
+              </w:rPr>
+              <w:t xml:space="preserve">64.9%</w:t>
+            </w:r>
+          </w:p>
+        </w:tc>
+      </w:tr>
+      <w:tr>
+        <w:trPr>
+          <w:trHeight w:val="617" w:hRule="auto"/>
+        </w:trPr>
+        <w:tc>
+          <w:tcPr>
+            <w:tcBorders>
+              <w:bottom w:val="none" w:sz="0" w:space="0" w:color="000000"/>
+              <w:top w:val="none" w:sz="0" w:space="0" w:color="000000"/>
+              <w:left w:val="none" w:sz="0" w:space="0" w:color="000000"/>
+              <w:right w:val="none" w:sz="0" w:space="0" w:color="000000"/>
+            </w:tcBorders>
+            <w:shd w:val="clear" w:color="auto" w:fill="FFFFFF"/>
+            <w:tcMar>
+              <w:top w:w="0" w:type="dxa"/>
+              <w:bottom w:w="0" w:type="dxa"/>
+              <w:left w:w="0" w:type="dxa"/>
+              <w:right w:w="0" w:type="dxa"/>
+            </w:tcMar>
+            <w:vAlign w:val="top"/>
+          </w:tcPr>
+          <w:p>
+            <w:pPr>
+              <w:pStyle w:val="Normal"/>
+              <w:jc w:val="left"/>
+              <w:pBdr>
+                <w:bottom w:val="none" w:sz="0" w:space="0" w:color="000000"/>
+                <w:top w:val="none" w:sz="0" w:space="0" w:color="000000"/>
+                <w:left w:val="none" w:sz="0" w:space="0" w:color="000000"/>
+                <w:right w:val="none" w:sz="0" w:space="0" w:color="000000"/>
+              </w:pBdr>
+              <w:spacing w:after="40" w:before="40" w:line="240"/>
+              <w:ind w:left="40" w:right="40" w:firstLine="0" w:firstLineChars="0"/>
+              <w:rPr>
+                <w:rFonts w:ascii="Arial" w:hAnsi="Arial" w:eastAsia="Arial" w:cs="Arial"/>
+                <w:i w:val="false"/>
+                <w:b w:val="false"/>
+                <w:u w:val="none"/>
+                <w:strike w:val="false"/>
+                <w:sz w:val="20"/>
+                <w:szCs w:val="20"/>
+                <w:color w:val="000000"/>
+              </w:rPr>
+            </w:pPr>
+            <w:r>
+              <w:rPr>
+                <w:rFonts w:ascii="Arial" w:hAnsi="Arial" w:eastAsia="Arial" w:cs="Arial"/>
+                <w:i w:val="false"/>
+                <w:b w:val="false"/>
+                <w:u w:val="none"/>
+                <w:strike w:val="false"/>
+                <w:sz w:val="20"/>
+                <w:szCs w:val="20"/>
+                <w:color w:val="000000"/>
+              </w:rPr>
+              <w:t xml:space="preserve">  ↳ Compound handling: multi-coded</w:t>
+            </w:r>
+          </w:p>
+        </w:tc>
+        <w:tc>
+          <w:tcPr>
+            <w:tcBorders>
+              <w:bottom w:val="none" w:sz="0" w:space="0" w:color="000000"/>
+              <w:top w:val="none" w:sz="0" w:space="0" w:color="000000"/>
+              <w:left w:val="none" w:sz="0" w:space="0" w:color="000000"/>
+              <w:right w:val="none" w:sz="0" w:space="0" w:color="000000"/>
+            </w:tcBorders>
+            <w:shd w:val="clear" w:color="auto" w:fill="FFFFFF"/>
+            <w:tcMar>
+              <w:top w:w="0" w:type="dxa"/>
+              <w:bottom w:w="0" w:type="dxa"/>
+              <w:left w:w="0" w:type="dxa"/>
+              <w:right w:w="0" w:type="dxa"/>
+            </w:tcMar>
+            <w:vAlign w:val="top"/>
+          </w:tcPr>
+          <w:p>
+            <w:pPr>
+              <w:pStyle w:val="Normal"/>
+              <w:jc w:val="left"/>
+              <w:pBdr>
+                <w:bottom w:val="none" w:sz="0" w:space="0" w:color="000000"/>
+                <w:top w:val="none" w:sz="0" w:space="0" w:color="000000"/>
+                <w:left w:val="none" w:sz="0" w:space="0" w:color="000000"/>
+                <w:right w:val="none" w:sz="0" w:space="0" w:color="000000"/>
+              </w:pBdr>
+              <w:spacing w:after="40" w:before="40" w:line="240"/>
+              <w:ind w:left="40" w:right="40" w:firstLine="0" w:firstLineChars="0"/>
+              <w:rPr>
+                <w:rFonts w:ascii="Arial" w:hAnsi="Arial" w:eastAsia="Arial" w:cs="Arial"/>
+                <w:i w:val="false"/>
+                <w:b w:val="false"/>
+                <w:u w:val="none"/>
+                <w:strike w:val="false"/>
+                <w:sz w:val="20"/>
+                <w:szCs w:val="20"/>
+                <w:color w:val="000000"/>
+              </w:rPr>
+            </w:pPr>
+            <w:r>
+              <w:rPr>
+                <w:rFonts w:ascii="Arial" w:hAnsi="Arial" w:eastAsia="Arial" w:cs="Arial"/>
+                <w:i w:val="false"/>
+                <w:b w:val="false"/>
+                <w:u w:val="none"/>
+                <w:strike w:val="false"/>
+                <w:sz w:val="20"/>
+                <w:szCs w:val="20"/>
+                <w:color w:val="000000"/>
+              </w:rPr>
+              <w:t xml:space="preserve">20</w:t>
+            </w:r>
+          </w:p>
+        </w:tc>
+        <w:tc>
+          <w:tcPr>
+            <w:tcBorders>
+              <w:bottom w:val="none" w:sz="0" w:space="0" w:color="000000"/>
+              <w:top w:val="none" w:sz="0" w:space="0" w:color="000000"/>
+              <w:left w:val="none" w:sz="0" w:space="0" w:color="000000"/>
+              <w:right w:val="none" w:sz="0" w:space="0" w:color="000000"/>
+            </w:tcBorders>
+            <w:shd w:val="clear" w:color="auto" w:fill="FFFFFF"/>
+            <w:tcMar>
+              <w:top w:w="0" w:type="dxa"/>
+              <w:bottom w:w="0" w:type="dxa"/>
+              <w:left w:w="0" w:type="dxa"/>
+              <w:right w:w="0" w:type="dxa"/>
+            </w:tcMar>
+            <w:vAlign w:val="top"/>
+          </w:tcPr>
+          <w:p>
+            <w:pPr>
+              <w:pStyle w:val="Normal"/>
+              <w:jc w:val="left"/>
+              <w:pBdr>
+                <w:bottom w:val="none" w:sz="0" w:space="0" w:color="000000"/>
+                <w:top w:val="none" w:sz="0" w:space="0" w:color="000000"/>
+                <w:left w:val="none" w:sz="0" w:space="0" w:color="000000"/>
+                <w:right w:val="none" w:sz="0" w:space="0" w:color="000000"/>
+              </w:pBdr>
+              <w:spacing w:after="40" w:before="40" w:line="240"/>
+              <w:ind w:left="40" w:right="40" w:firstLine="0" w:firstLineChars="0"/>
+              <w:rPr>
+                <w:rFonts w:ascii="Arial" w:hAnsi="Arial" w:eastAsia="Arial" w:cs="Arial"/>
+                <w:i w:val="false"/>
+                <w:b w:val="false"/>
+                <w:u w:val="none"/>
+                <w:strike w:val="false"/>
+                <w:sz w:val="20"/>
+                <w:szCs w:val="20"/>
+                <w:color w:val="000000"/>
+              </w:rPr>
+            </w:pPr>
+            <w:r>
+              <w:rPr>
+                <w:rFonts w:ascii="Arial" w:hAnsi="Arial" w:eastAsia="Arial" w:cs="Arial"/>
+                <w:i w:val="false"/>
+                <w:b w:val="false"/>
+                <w:u w:val="none"/>
+                <w:strike w:val="false"/>
+                <w:sz w:val="20"/>
+                <w:szCs w:val="20"/>
+                <w:color w:val="000000"/>
+              </w:rPr>
+              <w:t xml:space="preserve">20/24</w:t>
+            </w:r>
+          </w:p>
+        </w:tc>
+        <w:tc>
+          <w:tcPr>
+            <w:tcBorders>
+              <w:bottom w:val="none" w:sz="0" w:space="0" w:color="000000"/>
+              <w:top w:val="none" w:sz="0" w:space="0" w:color="000000"/>
+              <w:left w:val="none" w:sz="0" w:space="0" w:color="000000"/>
+              <w:right w:val="none" w:sz="0" w:space="0" w:color="000000"/>
+            </w:tcBorders>
+            <w:shd w:val="clear" w:color="auto" w:fill="FFFFFF"/>
+            <w:tcMar>
+              <w:top w:w="0" w:type="dxa"/>
+              <w:bottom w:w="0" w:type="dxa"/>
+              <w:left w:w="0" w:type="dxa"/>
+              <w:right w:w="0" w:type="dxa"/>
+            </w:tcMar>
+            <w:vAlign w:val="top"/>
+          </w:tcPr>
+          <w:p>
+            <w:pPr>
+              <w:pStyle w:val="Normal"/>
+              <w:jc w:val="left"/>
+              <w:pBdr>
+                <w:bottom w:val="none" w:sz="0" w:space="0" w:color="000000"/>
+                <w:top w:val="none" w:sz="0" w:space="0" w:color="000000"/>
+                <w:left w:val="none" w:sz="0" w:space="0" w:color="000000"/>
+                <w:right w:val="none" w:sz="0" w:space="0" w:color="000000"/>
+              </w:pBdr>
+              <w:spacing w:after="40" w:before="40" w:line="240"/>
+              <w:ind w:left="40" w:right="40" w:firstLine="0" w:firstLineChars="0"/>
+              <w:rPr>
+                <w:rFonts w:ascii="Arial" w:hAnsi="Arial" w:eastAsia="Arial" w:cs="Arial"/>
+                <w:i w:val="false"/>
+                <w:b w:val="false"/>
+                <w:u w:val="none"/>
+                <w:strike w:val="false"/>
+                <w:sz w:val="20"/>
+                <w:szCs w:val="20"/>
+                <w:color w:val="000000"/>
+              </w:rPr>
+            </w:pPr>
+            <w:r>
+              <w:rPr>
+                <w:rFonts w:ascii="Arial" w:hAnsi="Arial" w:eastAsia="Arial" w:cs="Arial"/>
+                <w:i w:val="false"/>
+                <w:b w:val="false"/>
+                <w:u w:val="none"/>
+                <w:strike w:val="false"/>
+                <w:sz w:val="20"/>
+                <w:szCs w:val="20"/>
+                <w:color w:val="000000"/>
+              </w:rPr>
+              <w:t xml:space="preserve">83.3%</w:t>
+            </w:r>
+          </w:p>
+        </w:tc>
+      </w:tr>
+      <w:tr>
+        <w:trPr>
+          <w:trHeight w:val="617" w:hRule="auto"/>
+        </w:trPr>
+        <w:tc>
+          <w:tcPr>
+            <w:tcBorders>
+              <w:bottom w:val="none" w:sz="0" w:space="0" w:color="000000"/>
+              <w:top w:val="none" w:sz="0" w:space="0" w:color="000000"/>
+              <w:left w:val="none" w:sz="0" w:space="0" w:color="000000"/>
+              <w:right w:val="none" w:sz="0" w:space="0" w:color="000000"/>
+            </w:tcBorders>
+            <w:shd w:val="clear" w:color="auto" w:fill="FFFFFF"/>
+            <w:tcMar>
+              <w:top w:w="0" w:type="dxa"/>
+              <w:bottom w:w="0" w:type="dxa"/>
+              <w:left w:w="0" w:type="dxa"/>
+              <w:right w:w="0" w:type="dxa"/>
+            </w:tcMar>
+            <w:vAlign w:val="top"/>
+          </w:tcPr>
+          <w:p>
+            <w:pPr>
+              <w:pStyle w:val="Normal"/>
+              <w:jc w:val="left"/>
+              <w:pBdr>
+                <w:bottom w:val="none" w:sz="0" w:space="0" w:color="000000"/>
+                <w:top w:val="none" w:sz="0" w:space="0" w:color="000000"/>
+                <w:left w:val="none" w:sz="0" w:space="0" w:color="000000"/>
+                <w:right w:val="none" w:sz="0" w:space="0" w:color="000000"/>
+              </w:pBdr>
+              <w:spacing w:after="40" w:before="40" w:line="240"/>
+              <w:ind w:left="40" w:right="40" w:firstLine="0" w:firstLineChars="0"/>
+              <w:rPr>
+                <w:rFonts w:ascii="Arial" w:hAnsi="Arial" w:eastAsia="Arial" w:cs="Arial"/>
+                <w:i w:val="false"/>
+                <w:b w:val="false"/>
+                <w:u w:val="none"/>
+                <w:strike w:val="false"/>
+                <w:sz w:val="20"/>
+                <w:szCs w:val="20"/>
+                <w:color w:val="000000"/>
+              </w:rPr>
+            </w:pPr>
+            <w:r>
+              <w:rPr>
+                <w:rFonts w:ascii="Arial" w:hAnsi="Arial" w:eastAsia="Arial" w:cs="Arial"/>
+                <w:i w:val="false"/>
+                <w:b w:val="false"/>
+                <w:u w:val="none"/>
+                <w:strike w:val="false"/>
+                <w:sz w:val="20"/>
+                <w:szCs w:val="20"/>
+                <w:color w:val="000000"/>
+              </w:rPr>
+              <w:t xml:space="preserve">  ↳ Compound handling: mono-coded</w:t>
+            </w:r>
+          </w:p>
+        </w:tc>
+        <w:tc>
+          <w:tcPr>
+            <w:tcBorders>
+              <w:bottom w:val="none" w:sz="0" w:space="0" w:color="000000"/>
+              <w:top w:val="none" w:sz="0" w:space="0" w:color="000000"/>
+              <w:left w:val="none" w:sz="0" w:space="0" w:color="000000"/>
+              <w:right w:val="none" w:sz="0" w:space="0" w:color="000000"/>
+            </w:tcBorders>
+            <w:shd w:val="clear" w:color="auto" w:fill="FFFFFF"/>
+            <w:tcMar>
+              <w:top w:w="0" w:type="dxa"/>
+              <w:bottom w:w="0" w:type="dxa"/>
+              <w:left w:w="0" w:type="dxa"/>
+              <w:right w:w="0" w:type="dxa"/>
+            </w:tcMar>
+            <w:vAlign w:val="top"/>
+          </w:tcPr>
+          <w:p>
+            <w:pPr>
+              <w:pStyle w:val="Normal"/>
+              <w:jc w:val="left"/>
+              <w:pBdr>
+                <w:bottom w:val="none" w:sz="0" w:space="0" w:color="000000"/>
+                <w:top w:val="none" w:sz="0" w:space="0" w:color="000000"/>
+                <w:left w:val="none" w:sz="0" w:space="0" w:color="000000"/>
+                <w:right w:val="none" w:sz="0" w:space="0" w:color="000000"/>
+              </w:pBdr>
+              <w:spacing w:after="40" w:before="40" w:line="240"/>
+              <w:ind w:left="40" w:right="40" w:firstLine="0" w:firstLineChars="0"/>
+              <w:rPr>
+                <w:rFonts w:ascii="Arial" w:hAnsi="Arial" w:eastAsia="Arial" w:cs="Arial"/>
+                <w:i w:val="false"/>
+                <w:b w:val="false"/>
+                <w:u w:val="none"/>
+                <w:strike w:val="false"/>
+                <w:sz w:val="20"/>
+                <w:szCs w:val="20"/>
+                <w:color w:val="000000"/>
+              </w:rPr>
+            </w:pPr>
+            <w:r>
+              <w:rPr>
+                <w:rFonts w:ascii="Arial" w:hAnsi="Arial" w:eastAsia="Arial" w:cs="Arial"/>
+                <w:i w:val="false"/>
+                <w:b w:val="false"/>
+                <w:u w:val="none"/>
+                <w:strike w:val="false"/>
+                <w:sz w:val="20"/>
+                <w:szCs w:val="20"/>
+                <w:color w:val="000000"/>
+              </w:rPr>
+              <w:t xml:space="preserve">2</w:t>
+            </w:r>
+          </w:p>
+        </w:tc>
+        <w:tc>
+          <w:tcPr>
+            <w:tcBorders>
+              <w:bottom w:val="none" w:sz="0" w:space="0" w:color="000000"/>
+              <w:top w:val="none" w:sz="0" w:space="0" w:color="000000"/>
+              <w:left w:val="none" w:sz="0" w:space="0" w:color="000000"/>
+              <w:right w:val="none" w:sz="0" w:space="0" w:color="000000"/>
+            </w:tcBorders>
+            <w:shd w:val="clear" w:color="auto" w:fill="FFFFFF"/>
+            <w:tcMar>
+              <w:top w:w="0" w:type="dxa"/>
+              <w:bottom w:w="0" w:type="dxa"/>
+              <w:left w:w="0" w:type="dxa"/>
+              <w:right w:w="0" w:type="dxa"/>
+            </w:tcMar>
+            <w:vAlign w:val="top"/>
+          </w:tcPr>
+          <w:p>
+            <w:pPr>
+              <w:pStyle w:val="Normal"/>
+              <w:jc w:val="left"/>
+              <w:pBdr>
+                <w:bottom w:val="none" w:sz="0" w:space="0" w:color="000000"/>
+                <w:top w:val="none" w:sz="0" w:space="0" w:color="000000"/>
+                <w:left w:val="none" w:sz="0" w:space="0" w:color="000000"/>
+                <w:right w:val="none" w:sz="0" w:space="0" w:color="000000"/>
+              </w:pBdr>
+              <w:spacing w:after="40" w:before="40" w:line="240"/>
+              <w:ind w:left="40" w:right="40" w:firstLine="0" w:firstLineChars="0"/>
+              <w:rPr>
+                <w:rFonts w:ascii="Arial" w:hAnsi="Arial" w:eastAsia="Arial" w:cs="Arial"/>
+                <w:i w:val="false"/>
+                <w:b w:val="false"/>
+                <w:u w:val="none"/>
+                <w:strike w:val="false"/>
+                <w:sz w:val="20"/>
+                <w:szCs w:val="20"/>
+                <w:color w:val="000000"/>
+              </w:rPr>
+            </w:pPr>
+            <w:r>
+              <w:rPr>
+                <w:rFonts w:ascii="Arial" w:hAnsi="Arial" w:eastAsia="Arial" w:cs="Arial"/>
+                <w:i w:val="false"/>
+                <w:b w:val="false"/>
+                <w:u w:val="none"/>
+                <w:strike w:val="false"/>
+                <w:sz w:val="20"/>
+                <w:szCs w:val="20"/>
+                <w:color w:val="000000"/>
+              </w:rPr>
+              <w:t xml:space="preserve">2/24</w:t>
+            </w:r>
+          </w:p>
+        </w:tc>
+        <w:tc>
+          <w:tcPr>
+            <w:tcBorders>
+              <w:bottom w:val="none" w:sz="0" w:space="0" w:color="000000"/>
+              <w:top w:val="none" w:sz="0" w:space="0" w:color="000000"/>
+              <w:left w:val="none" w:sz="0" w:space="0" w:color="000000"/>
+              <w:right w:val="none" w:sz="0" w:space="0" w:color="000000"/>
+            </w:tcBorders>
+            <w:shd w:val="clear" w:color="auto" w:fill="FFFFFF"/>
+            <w:tcMar>
+              <w:top w:w="0" w:type="dxa"/>
+              <w:bottom w:w="0" w:type="dxa"/>
+              <w:left w:w="0" w:type="dxa"/>
+              <w:right w:w="0" w:type="dxa"/>
+            </w:tcMar>
+            <w:vAlign w:val="top"/>
+          </w:tcPr>
+          <w:p>
+            <w:pPr>
+              <w:pStyle w:val="Normal"/>
+              <w:jc w:val="left"/>
+              <w:pBdr>
+                <w:bottom w:val="none" w:sz="0" w:space="0" w:color="000000"/>
+                <w:top w:val="none" w:sz="0" w:space="0" w:color="000000"/>
+                <w:left w:val="none" w:sz="0" w:space="0" w:color="000000"/>
+                <w:right w:val="none" w:sz="0" w:space="0" w:color="000000"/>
+              </w:pBdr>
+              <w:spacing w:after="40" w:before="40" w:line="240"/>
+              <w:ind w:left="40" w:right="40" w:firstLine="0" w:firstLineChars="0"/>
+              <w:rPr>
+                <w:rFonts w:ascii="Arial" w:hAnsi="Arial" w:eastAsia="Arial" w:cs="Arial"/>
+                <w:i w:val="false"/>
+                <w:b w:val="false"/>
+                <w:u w:val="none"/>
+                <w:strike w:val="false"/>
+                <w:sz w:val="20"/>
+                <w:szCs w:val="20"/>
+                <w:color w:val="000000"/>
+              </w:rPr>
+            </w:pPr>
+            <w:r>
+              <w:rPr>
+                <w:rFonts w:ascii="Arial" w:hAnsi="Arial" w:eastAsia="Arial" w:cs="Arial"/>
+                <w:i w:val="false"/>
+                <w:b w:val="false"/>
+                <w:u w:val="none"/>
+                <w:strike w:val="false"/>
+                <w:sz w:val="20"/>
+                <w:szCs w:val="20"/>
+                <w:color w:val="000000"/>
+              </w:rPr>
+              <w:t xml:space="preserve">8.3%</w:t>
+            </w:r>
+          </w:p>
+        </w:tc>
+      </w:tr>
+      <w:tr>
+        <w:trPr>
+          <w:trHeight w:val="617" w:hRule="auto"/>
+        </w:trPr>
+        <w:tc>
+          <w:tcPr>
+            <w:tcBorders>
+              <w:bottom w:val="single" w:sz="12" w:space="0" w:color="666666"/>
+              <w:top w:val="none" w:sz="0" w:space="0" w:color="000000"/>
+              <w:left w:val="none" w:sz="0" w:space="0" w:color="000000"/>
+              <w:right w:val="none" w:sz="0" w:space="0" w:color="000000"/>
+            </w:tcBorders>
+            <w:shd w:val="clear" w:color="auto" w:fill="FFFFFF"/>
+            <w:tcMar>
+              <w:top w:w="0" w:type="dxa"/>
+              <w:bottom w:w="0" w:type="dxa"/>
+              <w:left w:w="0" w:type="dxa"/>
+              <w:right w:w="0" w:type="dxa"/>
+            </w:tcMar>
+            <w:vAlign w:val="top"/>
+          </w:tcPr>
+          <w:p>
+            <w:pPr>
+              <w:pStyle w:val="Normal"/>
+              <w:jc w:val="left"/>
+              <w:pBdr>
+                <w:bottom w:val="none" w:sz="0" w:space="0" w:color="000000"/>
+                <w:top w:val="none" w:sz="0" w:space="0" w:color="000000"/>
+                <w:left w:val="none" w:sz="0" w:space="0" w:color="000000"/>
+                <w:right w:val="none" w:sz="0" w:space="0" w:color="000000"/>
+              </w:pBdr>
+              <w:spacing w:after="40" w:before="40" w:line="240"/>
+              <w:ind w:left="40" w:right="40" w:firstLine="0" w:firstLineChars="0"/>
+              <w:rPr>
+                <w:rFonts w:ascii="Arial" w:hAnsi="Arial" w:eastAsia="Arial" w:cs="Arial"/>
+                <w:i w:val="false"/>
+                <w:b w:val="false"/>
+                <w:u w:val="none"/>
+                <w:strike w:val="false"/>
+                <w:sz w:val="20"/>
+                <w:szCs w:val="20"/>
+                <w:color w:val="000000"/>
+              </w:rPr>
+            </w:pPr>
+            <w:r>
+              <w:rPr>
+                <w:rFonts w:ascii="Arial" w:hAnsi="Arial" w:eastAsia="Arial" w:cs="Arial"/>
+                <w:i w:val="false"/>
+                <w:b w:val="false"/>
+                <w:u w:val="none"/>
+                <w:strike w:val="false"/>
+                <w:sz w:val="20"/>
+                <w:szCs w:val="20"/>
+                <w:color w:val="000000"/>
+              </w:rPr>
+              <w:t xml:space="preserve">  ↳ Compound handling: other</w:t>
+            </w:r>
+          </w:p>
+        </w:tc>
+        <w:tc>
+          <w:tcPr>
+            <w:tcBorders>
+              <w:bottom w:val="single" w:sz="12" w:space="0" w:color="666666"/>
+              <w:top w:val="none" w:sz="0" w:space="0" w:color="000000"/>
+              <w:left w:val="none" w:sz="0" w:space="0" w:color="000000"/>
+              <w:right w:val="none" w:sz="0" w:space="0" w:color="000000"/>
+            </w:tcBorders>
+            <w:shd w:val="clear" w:color="auto" w:fill="FFFFFF"/>
+            <w:tcMar>
+              <w:top w:w="0" w:type="dxa"/>
+              <w:bottom w:w="0" w:type="dxa"/>
+              <w:left w:w="0" w:type="dxa"/>
+              <w:right w:w="0" w:type="dxa"/>
+            </w:tcMar>
+            <w:vAlign w:val="top"/>
+          </w:tcPr>
+          <w:p>
+            <w:pPr>
+              <w:pStyle w:val="Normal"/>
+              <w:jc w:val="left"/>
+              <w:pBdr>
+                <w:bottom w:val="none" w:sz="0" w:space="0" w:color="000000"/>
+                <w:top w:val="none" w:sz="0" w:space="0" w:color="000000"/>
+                <w:left w:val="none" w:sz="0" w:space="0" w:color="000000"/>
+                <w:right w:val="none" w:sz="0" w:space="0" w:color="000000"/>
+              </w:pBdr>
+              <w:spacing w:after="40" w:before="40" w:line="240"/>
+              <w:ind w:left="40" w:right="40" w:firstLine="0" w:firstLineChars="0"/>
+              <w:rPr>
+                <w:rFonts w:ascii="Arial" w:hAnsi="Arial" w:eastAsia="Arial" w:cs="Arial"/>
+                <w:i w:val="false"/>
+                <w:b w:val="false"/>
+                <w:u w:val="none"/>
+                <w:strike w:val="false"/>
+                <w:sz w:val="20"/>
+                <w:szCs w:val="20"/>
+                <w:color w:val="000000"/>
+              </w:rPr>
+            </w:pPr>
+            <w:r>
+              <w:rPr>
+                <w:rFonts w:ascii="Arial" w:hAnsi="Arial" w:eastAsia="Arial" w:cs="Arial"/>
+                <w:i w:val="false"/>
+                <w:b w:val="false"/>
+                <w:u w:val="none"/>
+                <w:strike w:val="false"/>
+                <w:sz w:val="20"/>
+                <w:szCs w:val="20"/>
+                <w:color w:val="000000"/>
+              </w:rPr>
+              <w:t xml:space="preserve">2</w:t>
+            </w:r>
+          </w:p>
+        </w:tc>
+        <w:tc>
+          <w:tcPr>
+            <w:tcBorders>
+              <w:bottom w:val="single" w:sz="12" w:space="0" w:color="666666"/>
+              <w:top w:val="none" w:sz="0" w:space="0" w:color="000000"/>
+              <w:left w:val="none" w:sz="0" w:space="0" w:color="000000"/>
+              <w:right w:val="none" w:sz="0" w:space="0" w:color="000000"/>
+            </w:tcBorders>
+            <w:shd w:val="clear" w:color="auto" w:fill="FFFFFF"/>
+            <w:tcMar>
+              <w:top w:w="0" w:type="dxa"/>
+              <w:bottom w:w="0" w:type="dxa"/>
+              <w:left w:w="0" w:type="dxa"/>
+              <w:right w:w="0" w:type="dxa"/>
+            </w:tcMar>
+            <w:vAlign w:val="top"/>
+          </w:tcPr>
+          <w:p>
+            <w:pPr>
+              <w:pStyle w:val="Normal"/>
+              <w:jc w:val="left"/>
+              <w:pBdr>
+                <w:bottom w:val="none" w:sz="0" w:space="0" w:color="000000"/>
+                <w:top w:val="none" w:sz="0" w:space="0" w:color="000000"/>
+                <w:left w:val="none" w:sz="0" w:space="0" w:color="000000"/>
+                <w:right w:val="none" w:sz="0" w:space="0" w:color="000000"/>
+              </w:pBdr>
+              <w:spacing w:after="40" w:before="40" w:line="240"/>
+              <w:ind w:left="40" w:right="40" w:firstLine="0" w:firstLineChars="0"/>
+              <w:rPr>
+                <w:rFonts w:ascii="Arial" w:hAnsi="Arial" w:eastAsia="Arial" w:cs="Arial"/>
+                <w:i w:val="false"/>
+                <w:b w:val="false"/>
+                <w:u w:val="none"/>
+                <w:strike w:val="false"/>
+                <w:sz w:val="20"/>
+                <w:szCs w:val="20"/>
+                <w:color w:val="000000"/>
+              </w:rPr>
+            </w:pPr>
+            <w:r>
+              <w:rPr>
+                <w:rFonts w:ascii="Arial" w:hAnsi="Arial" w:eastAsia="Arial" w:cs="Arial"/>
+                <w:i w:val="false"/>
+                <w:b w:val="false"/>
+                <w:u w:val="none"/>
+                <w:strike w:val="false"/>
+                <w:sz w:val="20"/>
+                <w:szCs w:val="20"/>
+                <w:color w:val="000000"/>
+              </w:rPr>
+              <w:t xml:space="preserve">2/24</w:t>
+            </w:r>
+          </w:p>
+        </w:tc>
+        <w:tc>
+          <w:tcPr>
+            <w:tcBorders>
+              <w:bottom w:val="single" w:sz="12" w:space="0" w:color="666666"/>
+              <w:top w:val="none" w:sz="0" w:space="0" w:color="000000"/>
+              <w:left w:val="none" w:sz="0" w:space="0" w:color="000000"/>
+              <w:right w:val="none" w:sz="0" w:space="0" w:color="000000"/>
+            </w:tcBorders>
+            <w:shd w:val="clear" w:color="auto" w:fill="FFFFFF"/>
+            <w:tcMar>
+              <w:top w:w="0" w:type="dxa"/>
+              <w:bottom w:w="0" w:type="dxa"/>
+              <w:left w:w="0" w:type="dxa"/>
+              <w:right w:w="0" w:type="dxa"/>
+            </w:tcMar>
+            <w:vAlign w:val="top"/>
+          </w:tcPr>
+          <w:p>
+            <w:pPr>
+              <w:pStyle w:val="Normal"/>
+              <w:jc w:val="left"/>
+              <w:pBdr>
+                <w:bottom w:val="none" w:sz="0" w:space="0" w:color="000000"/>
+                <w:top w:val="none" w:sz="0" w:space="0" w:color="000000"/>
+                <w:left w:val="none" w:sz="0" w:space="0" w:color="000000"/>
+                <w:right w:val="none" w:sz="0" w:space="0" w:color="000000"/>
+              </w:pBdr>
+              <w:spacing w:after="40" w:before="40" w:line="240"/>
+              <w:ind w:left="40" w:right="40" w:firstLine="0" w:firstLineChars="0"/>
+              <w:rPr>
+                <w:rFonts w:ascii="Arial" w:hAnsi="Arial" w:eastAsia="Arial" w:cs="Arial"/>
+                <w:i w:val="false"/>
+                <w:b w:val="false"/>
+                <w:u w:val="none"/>
+                <w:strike w:val="false"/>
+                <w:sz w:val="20"/>
+                <w:szCs w:val="20"/>
+                <w:color w:val="000000"/>
+              </w:rPr>
+            </w:pPr>
+            <w:r>
+              <w:rPr>
+                <w:rFonts w:ascii="Arial" w:hAnsi="Arial" w:eastAsia="Arial" w:cs="Arial"/>
+                <w:i w:val="false"/>
+                <w:b w:val="false"/>
+                <w:u w:val="none"/>
+                <w:strike w:val="false"/>
+                <w:sz w:val="20"/>
+                <w:szCs w:val="20"/>
+                <w:color w:val="000000"/>
+              </w:rPr>
+              <w:t xml:space="preserve">8.3%</w:t>
+            </w:r>
+          </w:p>
+        </w:tc>
+      </w:tr>
+    </w:tbl>
+    <w:p>
+      <w:pPr>
+        <w:pStyle w:val="Normal"/>
+      </w:pPr>
+      <w:r>
+        <w:t xml:space="preserve"/>
+      </w:r>
+    </w:p>
+    <w:p>
+      <w:pPr>
+        <w:pStyle w:val="TableCaption"/>
+        <w:jc w:val="center"/>
+        <w:keepNext/>
+        <w:pBdr>
+          <w:bottom w:val="none" w:sz="0" w:space="0" w:color="000000"/>
+          <w:top w:val="none" w:sz="0" w:space="0" w:color="000000"/>
+          <w:left w:val="none" w:sz="0" w:space="0" w:color="000000"/>
+          <w:right w:val="none" w:sz="0" w:space="0" w:color="000000"/>
+        </w:pBdr>
+        <w:spacing w:after="60" w:before="60" w:line="240"/>
+        <w:ind w:left="60" w:right="60" w:firstLine="0" w:firstLineChars="0"/>
+      </w:pPr>
+      <w:r>
+        <w:t xml:space="preserve">Table W. Reported scale-selection criteria among studies conducting a scale search (N = 32)</w:t>
+      </w:r>
+    </w:p>
+    <w:tbl xmlns:a="http://schemas.openxmlformats.org/drawingml/2006/main" xmlns:pic="http://schemas.openxmlformats.org/drawingml/2006/picture">
+      <w:tblPr>
+        <w:tblLayout w:type="autofit"/>
+        <w:jc w:val="center"/>
+        <w:tblW w:type="pct" w:w="5000"/>
+        <w:tblLook w:firstRow="1" w:lastRow="0" w:firstColumn="0" w:lastColumn="0" w:noHBand="0" w:noVBand="1"/>
+      </w:tblPr>
+      <w:tr>
+        <w:trPr>
+          <w:trHeight w:val="614" w:hRule="auto"/>
+          <w:tblHeader/>
+        </w:trPr>
+        <w:tc>
+          <w:tcPr>
+            <w:tcBorders>
+              <w:bottom w:val="single" w:sz="12" w:space="0" w:color="666666"/>
+              <w:top w:val="single" w:sz="12" w:space="0" w:color="666666"/>
+              <w:left w:val="none" w:sz="0" w:space="0" w:color="000000"/>
+              <w:right w:val="none" w:sz="0" w:space="0" w:color="000000"/>
+            </w:tcBorders>
+            <w:shd w:val="clear" w:color="auto" w:fill="FFFFFF"/>
+            <w:tcMar>
+              <w:top w:w="0" w:type="dxa"/>
+              <w:bottom w:w="0" w:type="dxa"/>
+              <w:left w:w="0" w:type="dxa"/>
+              <w:right w:w="0" w:type="dxa"/>
+            </w:tcMar>
+            <w:vAlign w:val="top"/>
+          </w:tcPr>
+          <w:p>
+            <w:pPr>
+              <w:pStyle w:val="Normal"/>
+              <w:jc w:val="left"/>
+              <w:pBdr>
+                <w:bottom w:val="none" w:sz="0" w:space="0" w:color="000000"/>
+                <w:top w:val="none" w:sz="0" w:space="0" w:color="000000"/>
+                <w:left w:val="none" w:sz="0" w:space="0" w:color="000000"/>
+                <w:right w:val="none" w:sz="0" w:space="0" w:color="000000"/>
+              </w:pBdr>
+              <w:spacing w:after="40" w:before="40" w:line="240"/>
+              <w:ind w:left="40" w:right="40" w:firstLine="0" w:firstLineChars="0"/>
+              <w:rPr>
+                <w:rFonts w:ascii="Arial" w:hAnsi="Arial" w:eastAsia="Arial" w:cs="Arial"/>
+                <w:i w:val="false"/>
+                <w:b w:val="false"/>
+                <w:u w:val="none"/>
+                <w:strike w:val="false"/>
+                <w:sz w:val="20"/>
+                <w:szCs w:val="20"/>
+                <w:color w:val="000000"/>
+              </w:rPr>
+            </w:pPr>
+            <w:r>
+              <w:rPr>
+                <w:rFonts w:ascii="Arial" w:hAnsi="Arial" w:eastAsia="Arial" w:cs="Arial"/>
+                <w:i w:val="false"/>
+                <w:b w:val="false"/>
+                <w:u w:val="none"/>
+                <w:strike w:val="false"/>
+                <w:sz w:val="20"/>
+                <w:szCs w:val="20"/>
+                <w:color w:val="000000"/>
+              </w:rPr>
+              <w:t xml:space="preserve">Selection criteria format</w:t>
+            </w:r>
+          </w:p>
+        </w:tc>
+        <w:tc>
+          <w:tcPr>
+            <w:tcBorders>
+              <w:bottom w:val="single" w:sz="12" w:space="0" w:color="666666"/>
+              <w:top w:val="single" w:sz="12" w:space="0" w:color="666666"/>
+              <w:left w:val="none" w:sz="0" w:space="0" w:color="000000"/>
+              <w:right w:val="none" w:sz="0" w:space="0" w:color="000000"/>
+            </w:tcBorders>
+            <w:shd w:val="clear" w:color="auto" w:fill="FFFFFF"/>
+            <w:tcMar>
+              <w:top w:w="0" w:type="dxa"/>
+              <w:bottom w:w="0" w:type="dxa"/>
+              <w:left w:w="0" w:type="dxa"/>
+              <w:right w:w="0" w:type="dxa"/>
+            </w:tcMar>
+            <w:vAlign w:val="top"/>
+          </w:tcPr>
+          <w:p>
+            <w:pPr>
+              <w:pStyle w:val="Normal"/>
+              <w:jc w:val="left"/>
+              <w:pBdr>
+                <w:bottom w:val="none" w:sz="0" w:space="0" w:color="000000"/>
+                <w:top w:val="none" w:sz="0" w:space="0" w:color="000000"/>
+                <w:left w:val="none" w:sz="0" w:space="0" w:color="000000"/>
+                <w:right w:val="none" w:sz="0" w:space="0" w:color="000000"/>
+              </w:pBdr>
+              <w:spacing w:after="40" w:before="40" w:line="240"/>
+              <w:ind w:left="40" w:right="40" w:firstLine="0" w:firstLineChars="0"/>
+              <w:rPr>
+                <w:rFonts w:ascii="Arial" w:hAnsi="Arial" w:eastAsia="Arial" w:cs="Arial"/>
+                <w:i w:val="false"/>
+                <w:b w:val="false"/>
+                <w:u w:val="none"/>
+                <w:strike w:val="false"/>
+                <w:sz w:val="20"/>
+                <w:szCs w:val="20"/>
+                <w:color w:val="000000"/>
+              </w:rPr>
+            </w:pPr>
+            <w:r>
+              <w:rPr>
+                <w:rFonts w:ascii="Arial" w:hAnsi="Arial" w:eastAsia="Arial" w:cs="Arial"/>
+                <w:i w:val="false"/>
+                <w:b w:val="false"/>
+                <w:u w:val="none"/>
+                <w:strike w:val="false"/>
+                <w:sz w:val="20"/>
+                <w:szCs w:val="20"/>
+                <w:color w:val="000000"/>
+              </w:rPr>
+              <w:t xml:space="preserve">n_true</w:t>
+            </w:r>
+          </w:p>
+        </w:tc>
+        <w:tc>
+          <w:tcPr>
+            <w:tcBorders>
+              <w:bottom w:val="single" w:sz="12" w:space="0" w:color="666666"/>
+              <w:top w:val="single" w:sz="12" w:space="0" w:color="666666"/>
+              <w:left w:val="none" w:sz="0" w:space="0" w:color="000000"/>
+              <w:right w:val="none" w:sz="0" w:space="0" w:color="000000"/>
+            </w:tcBorders>
+            <w:shd w:val="clear" w:color="auto" w:fill="FFFFFF"/>
+            <w:tcMar>
+              <w:top w:w="0" w:type="dxa"/>
+              <w:bottom w:w="0" w:type="dxa"/>
+              <w:left w:w="0" w:type="dxa"/>
+              <w:right w:w="0" w:type="dxa"/>
+            </w:tcMar>
+            <w:vAlign w:val="top"/>
+          </w:tcPr>
+          <w:p>
+            <w:pPr>
+              <w:pStyle w:val="Normal"/>
+              <w:jc w:val="left"/>
+              <w:pBdr>
+                <w:bottom w:val="none" w:sz="0" w:space="0" w:color="000000"/>
+                <w:top w:val="none" w:sz="0" w:space="0" w:color="000000"/>
+                <w:left w:val="none" w:sz="0" w:space="0" w:color="000000"/>
+                <w:right w:val="none" w:sz="0" w:space="0" w:color="000000"/>
+              </w:pBdr>
+              <w:spacing w:after="40" w:before="40" w:line="240"/>
+              <w:ind w:left="40" w:right="40" w:firstLine="0" w:firstLineChars="0"/>
+              <w:rPr>
+                <w:rFonts w:ascii="Arial" w:hAnsi="Arial" w:eastAsia="Arial" w:cs="Arial"/>
+                <w:i w:val="false"/>
+                <w:b w:val="false"/>
+                <w:u w:val="none"/>
+                <w:strike w:val="false"/>
+                <w:sz w:val="20"/>
+                <w:szCs w:val="20"/>
+                <w:color w:val="000000"/>
+              </w:rPr>
+            </w:pPr>
+            <w:r>
+              <w:rPr>
+                <w:rFonts w:ascii="Arial" w:hAnsi="Arial" w:eastAsia="Arial" w:cs="Arial"/>
+                <w:i w:val="false"/>
+                <w:b w:val="false"/>
+                <w:u w:val="none"/>
+                <w:strike w:val="false"/>
+                <w:sz w:val="20"/>
+                <w:szCs w:val="20"/>
+                <w:color w:val="000000"/>
+              </w:rPr>
+              <w:t xml:space="preserve">Proportion</w:t>
+            </w:r>
+          </w:p>
+        </w:tc>
+        <w:tc>
+          <w:tcPr>
+            <w:tcBorders>
+              <w:bottom w:val="single" w:sz="12" w:space="0" w:color="666666"/>
+              <w:top w:val="single" w:sz="12" w:space="0" w:color="666666"/>
+              <w:left w:val="none" w:sz="0" w:space="0" w:color="000000"/>
+              <w:right w:val="none" w:sz="0" w:space="0" w:color="000000"/>
+            </w:tcBorders>
+            <w:shd w:val="clear" w:color="auto" w:fill="FFFFFF"/>
+            <w:tcMar>
+              <w:top w:w="0" w:type="dxa"/>
+              <w:bottom w:w="0" w:type="dxa"/>
+              <w:left w:w="0" w:type="dxa"/>
+              <w:right w:w="0" w:type="dxa"/>
+            </w:tcMar>
+            <w:vAlign w:val="top"/>
+          </w:tcPr>
+          <w:p>
+            <w:pPr>
+              <w:pStyle w:val="Normal"/>
+              <w:jc w:val="left"/>
+              <w:pBdr>
+                <w:bottom w:val="none" w:sz="0" w:space="0" w:color="000000"/>
+                <w:top w:val="none" w:sz="0" w:space="0" w:color="000000"/>
+                <w:left w:val="none" w:sz="0" w:space="0" w:color="000000"/>
+                <w:right w:val="none" w:sz="0" w:space="0" w:color="000000"/>
+              </w:pBdr>
+              <w:spacing w:after="40" w:before="40" w:line="240"/>
+              <w:ind w:left="40" w:right="40" w:firstLine="0" w:firstLineChars="0"/>
+              <w:rPr>
+                <w:rFonts w:ascii="Arial" w:hAnsi="Arial" w:eastAsia="Arial" w:cs="Arial"/>
+                <w:i w:val="false"/>
+                <w:b w:val="false"/>
+                <w:u w:val="none"/>
+                <w:strike w:val="false"/>
+                <w:sz w:val="20"/>
+                <w:szCs w:val="20"/>
+                <w:color w:val="000000"/>
+              </w:rPr>
+            </w:pPr>
+            <w:r>
+              <w:rPr>
+                <w:rFonts w:ascii="Arial" w:hAnsi="Arial" w:eastAsia="Arial" w:cs="Arial"/>
+                <w:i w:val="false"/>
+                <w:b w:val="false"/>
+                <w:u w:val="none"/>
+                <w:strike w:val="false"/>
+                <w:sz w:val="20"/>
+                <w:szCs w:val="20"/>
+                <w:color w:val="000000"/>
+              </w:rPr>
+              <w:t xml:space="preserve">Percentage</w:t>
+            </w:r>
+          </w:p>
+        </w:tc>
+      </w:tr>
+      <w:tr>
+        <w:trPr>
+          <w:trHeight w:val="577" w:hRule="auto"/>
+        </w:trPr>
+        <w:tc>
+          <w:tcPr>
+            <w:tcBorders>
+              <w:bottom w:val="none" w:sz="0" w:space="0" w:color="000000"/>
+              <w:top w:val="single" w:sz="12" w:space="0" w:color="666666"/>
+              <w:left w:val="none" w:sz="0" w:space="0" w:color="000000"/>
+              <w:right w:val="none" w:sz="0" w:space="0" w:color="000000"/>
+            </w:tcBorders>
+            <w:shd w:val="clear" w:color="auto" w:fill="FFFFFF"/>
+            <w:tcMar>
+              <w:top w:w="0" w:type="dxa"/>
+              <w:bottom w:w="0" w:type="dxa"/>
+              <w:left w:w="0" w:type="dxa"/>
+              <w:right w:w="0" w:type="dxa"/>
+            </w:tcMar>
+            <w:vAlign w:val="top"/>
+          </w:tcPr>
+          <w:p>
+            <w:pPr>
+              <w:pStyle w:val="Normal"/>
+              <w:jc w:val="left"/>
+              <w:pBdr>
+                <w:bottom w:val="none" w:sz="0" w:space="0" w:color="000000"/>
+                <w:top w:val="none" w:sz="0" w:space="0" w:color="000000"/>
+                <w:left w:val="none" w:sz="0" w:space="0" w:color="000000"/>
+                <w:right w:val="none" w:sz="0" w:space="0" w:color="000000"/>
+              </w:pBdr>
+              <w:spacing w:after="40" w:before="40" w:line="240"/>
+              <w:ind w:left="40" w:right="40" w:firstLine="0" w:firstLineChars="0"/>
+              <w:rPr>
+                <w:rFonts w:ascii="Arial" w:hAnsi="Arial" w:eastAsia="Arial" w:cs="Arial"/>
+                <w:i w:val="false"/>
+                <w:b w:val="false"/>
+                <w:u w:val="none"/>
+                <w:strike w:val="false"/>
+                <w:sz w:val="20"/>
+                <w:szCs w:val="20"/>
+                <w:color w:val="000000"/>
+              </w:rPr>
+            </w:pPr>
+            <w:r>
+              <w:rPr>
+                <w:rFonts w:ascii="Arial" w:hAnsi="Arial" w:eastAsia="Arial" w:cs="Arial"/>
+                <w:i w:val="false"/>
+                <w:b w:val="false"/>
+                <w:u w:val="none"/>
+                <w:strike w:val="false"/>
+                <w:sz w:val="20"/>
+                <w:szCs w:val="20"/>
+                <w:color w:val="000000"/>
+              </w:rPr>
+              <w:t xml:space="preserve">Both inclusion &amp; exclusion</w:t>
+            </w:r>
+          </w:p>
+        </w:tc>
+        <w:tc>
+          <w:tcPr>
+            <w:tcBorders>
+              <w:bottom w:val="none" w:sz="0" w:space="0" w:color="000000"/>
+              <w:top w:val="single" w:sz="12" w:space="0" w:color="666666"/>
+              <w:left w:val="none" w:sz="0" w:space="0" w:color="000000"/>
+              <w:right w:val="none" w:sz="0" w:space="0" w:color="000000"/>
+            </w:tcBorders>
+            <w:shd w:val="clear" w:color="auto" w:fill="FFFFFF"/>
+            <w:tcMar>
+              <w:top w:w="0" w:type="dxa"/>
+              <w:bottom w:w="0" w:type="dxa"/>
+              <w:left w:w="0" w:type="dxa"/>
+              <w:right w:w="0" w:type="dxa"/>
+            </w:tcMar>
+            <w:vAlign w:val="top"/>
+          </w:tcPr>
+          <w:p>
+            <w:pPr>
+              <w:pStyle w:val="Normal"/>
+              <w:jc w:val="left"/>
+              <w:pBdr>
+                <w:bottom w:val="none" w:sz="0" w:space="0" w:color="000000"/>
+                <w:top w:val="none" w:sz="0" w:space="0" w:color="000000"/>
+                <w:left w:val="none" w:sz="0" w:space="0" w:color="000000"/>
+                <w:right w:val="none" w:sz="0" w:space="0" w:color="000000"/>
+              </w:pBdr>
+              <w:spacing w:after="40" w:before="40" w:line="240"/>
+              <w:ind w:left="40" w:right="40" w:firstLine="0" w:firstLineChars="0"/>
+              <w:rPr>
+                <w:rFonts w:ascii="Arial" w:hAnsi="Arial" w:eastAsia="Arial" w:cs="Arial"/>
+                <w:i w:val="false"/>
+                <w:b w:val="false"/>
+                <w:u w:val="none"/>
+                <w:strike w:val="false"/>
+                <w:sz w:val="20"/>
+                <w:szCs w:val="20"/>
+                <w:color w:val="000000"/>
+              </w:rPr>
+            </w:pPr>
+            <w:r>
+              <w:rPr>
+                <w:rFonts w:ascii="Arial" w:hAnsi="Arial" w:eastAsia="Arial" w:cs="Arial"/>
+                <w:i w:val="false"/>
+                <w:b w:val="false"/>
+                <w:u w:val="none"/>
+                <w:strike w:val="false"/>
+                <w:sz w:val="20"/>
+                <w:szCs w:val="20"/>
+                <w:color w:val="000000"/>
+              </w:rPr>
+              <w:t xml:space="preserve">21</w:t>
+            </w:r>
+          </w:p>
+        </w:tc>
+        <w:tc>
+          <w:tcPr>
+            <w:tcBorders>
+              <w:bottom w:val="none" w:sz="0" w:space="0" w:color="000000"/>
+              <w:top w:val="single" w:sz="12" w:space="0" w:color="666666"/>
+              <w:left w:val="none" w:sz="0" w:space="0" w:color="000000"/>
+              <w:right w:val="none" w:sz="0" w:space="0" w:color="000000"/>
+            </w:tcBorders>
+            <w:shd w:val="clear" w:color="auto" w:fill="FFFFFF"/>
+            <w:tcMar>
+              <w:top w:w="0" w:type="dxa"/>
+              <w:bottom w:w="0" w:type="dxa"/>
+              <w:left w:w="0" w:type="dxa"/>
+              <w:right w:w="0" w:type="dxa"/>
+            </w:tcMar>
+            <w:vAlign w:val="top"/>
+          </w:tcPr>
+          <w:p>
+            <w:pPr>
+              <w:pStyle w:val="Normal"/>
+              <w:jc w:val="left"/>
+              <w:pBdr>
+                <w:bottom w:val="none" w:sz="0" w:space="0" w:color="000000"/>
+                <w:top w:val="none" w:sz="0" w:space="0" w:color="000000"/>
+                <w:left w:val="none" w:sz="0" w:space="0" w:color="000000"/>
+                <w:right w:val="none" w:sz="0" w:space="0" w:color="000000"/>
+              </w:pBdr>
+              <w:spacing w:after="40" w:before="40" w:line="240"/>
+              <w:ind w:left="40" w:right="40" w:firstLine="0" w:firstLineChars="0"/>
+              <w:rPr>
+                <w:rFonts w:ascii="Arial" w:hAnsi="Arial" w:eastAsia="Arial" w:cs="Arial"/>
+                <w:i w:val="false"/>
+                <w:b w:val="false"/>
+                <w:u w:val="none"/>
+                <w:strike w:val="false"/>
+                <w:sz w:val="20"/>
+                <w:szCs w:val="20"/>
+                <w:color w:val="000000"/>
+              </w:rPr>
+            </w:pPr>
+            <w:r>
+              <w:rPr>
+                <w:rFonts w:ascii="Arial" w:hAnsi="Arial" w:eastAsia="Arial" w:cs="Arial"/>
+                <w:i w:val="false"/>
+                <w:b w:val="false"/>
+                <w:u w:val="none"/>
+                <w:strike w:val="false"/>
+                <w:sz w:val="20"/>
+                <w:szCs w:val="20"/>
+                <w:color w:val="000000"/>
+              </w:rPr>
+              <w:t xml:space="preserve">21/32</w:t>
+            </w:r>
+          </w:p>
+        </w:tc>
+        <w:tc>
+          <w:tcPr>
+            <w:tcBorders>
+              <w:bottom w:val="none" w:sz="0" w:space="0" w:color="000000"/>
+              <w:top w:val="single" w:sz="12" w:space="0" w:color="666666"/>
+              <w:left w:val="none" w:sz="0" w:space="0" w:color="000000"/>
+              <w:right w:val="none" w:sz="0" w:space="0" w:color="000000"/>
+            </w:tcBorders>
+            <w:shd w:val="clear" w:color="auto" w:fill="FFFFFF"/>
+            <w:tcMar>
+              <w:top w:w="0" w:type="dxa"/>
+              <w:bottom w:w="0" w:type="dxa"/>
+              <w:left w:w="0" w:type="dxa"/>
+              <w:right w:w="0" w:type="dxa"/>
+            </w:tcMar>
+            <w:vAlign w:val="top"/>
+          </w:tcPr>
+          <w:p>
+            <w:pPr>
+              <w:pStyle w:val="Normal"/>
+              <w:jc w:val="left"/>
+              <w:pBdr>
+                <w:bottom w:val="none" w:sz="0" w:space="0" w:color="000000"/>
+                <w:top w:val="none" w:sz="0" w:space="0" w:color="000000"/>
+                <w:left w:val="none" w:sz="0" w:space="0" w:color="000000"/>
+                <w:right w:val="none" w:sz="0" w:space="0" w:color="000000"/>
+              </w:pBdr>
+              <w:spacing w:after="40" w:before="40" w:line="240"/>
+              <w:ind w:left="40" w:right="40" w:firstLine="0" w:firstLineChars="0"/>
+              <w:rPr>
+                <w:rFonts w:ascii="Arial" w:hAnsi="Arial" w:eastAsia="Arial" w:cs="Arial"/>
+                <w:i w:val="false"/>
+                <w:b w:val="false"/>
+                <w:u w:val="none"/>
+                <w:strike w:val="false"/>
+                <w:sz w:val="20"/>
+                <w:szCs w:val="20"/>
+                <w:color w:val="000000"/>
+              </w:rPr>
+            </w:pPr>
+            <w:r>
+              <w:rPr>
+                <w:rFonts w:ascii="Arial" w:hAnsi="Arial" w:eastAsia="Arial" w:cs="Arial"/>
+                <w:i w:val="false"/>
+                <w:b w:val="false"/>
+                <w:u w:val="none"/>
+                <w:strike w:val="false"/>
+                <w:sz w:val="20"/>
+                <w:szCs w:val="20"/>
+                <w:color w:val="000000"/>
+              </w:rPr>
+              <w:t xml:space="preserve">65.6%</w:t>
+            </w:r>
+          </w:p>
+        </w:tc>
+      </w:tr>
+      <w:tr>
+        <w:trPr>
+          <w:trHeight w:val="614" w:hRule="auto"/>
+        </w:trPr>
+        <w:tc>
+          <w:tcPr>
+            <w:tcBorders>
+              <w:bottom w:val="none" w:sz="0" w:space="0" w:color="000000"/>
+              <w:top w:val="none" w:sz="0" w:space="0" w:color="000000"/>
+              <w:left w:val="none" w:sz="0" w:space="0" w:color="000000"/>
+              <w:right w:val="none" w:sz="0" w:space="0" w:color="000000"/>
+            </w:tcBorders>
+            <w:shd w:val="clear" w:color="auto" w:fill="FFFFFF"/>
+            <w:tcMar>
+              <w:top w:w="0" w:type="dxa"/>
+              <w:bottom w:w="0" w:type="dxa"/>
+              <w:left w:w="0" w:type="dxa"/>
+              <w:right w:w="0" w:type="dxa"/>
+            </w:tcMar>
+            <w:vAlign w:val="top"/>
+          </w:tcPr>
+          <w:p>
+            <w:pPr>
+              <w:pStyle w:val="Normal"/>
+              <w:jc w:val="left"/>
+              <w:pBdr>
+                <w:bottom w:val="none" w:sz="0" w:space="0" w:color="000000"/>
+                <w:top w:val="none" w:sz="0" w:space="0" w:color="000000"/>
+                <w:left w:val="none" w:sz="0" w:space="0" w:color="000000"/>
+                <w:right w:val="none" w:sz="0" w:space="0" w:color="000000"/>
+              </w:pBdr>
+              <w:spacing w:after="40" w:before="40" w:line="240"/>
+              <w:ind w:left="40" w:right="40" w:firstLine="0" w:firstLineChars="0"/>
+              <w:rPr>
+                <w:rFonts w:ascii="Arial" w:hAnsi="Arial" w:eastAsia="Arial" w:cs="Arial"/>
+                <w:i w:val="false"/>
+                <w:b w:val="false"/>
+                <w:u w:val="none"/>
+                <w:strike w:val="false"/>
+                <w:sz w:val="20"/>
+                <w:szCs w:val="20"/>
+                <w:color w:val="000000"/>
+              </w:rPr>
+            </w:pPr>
+            <w:r>
+              <w:rPr>
+                <w:rFonts w:ascii="Arial" w:hAnsi="Arial" w:eastAsia="Arial" w:cs="Arial"/>
+                <w:i w:val="false"/>
+                <w:b w:val="false"/>
+                <w:u w:val="none"/>
+                <w:strike w:val="false"/>
+                <w:sz w:val="20"/>
+                <w:szCs w:val="20"/>
+                <w:color w:val="000000"/>
+              </w:rPr>
+              <w:t xml:space="preserve">Inclusion only</w:t>
+            </w:r>
+          </w:p>
+        </w:tc>
+        <w:tc>
+          <w:tcPr>
+            <w:tcBorders>
+              <w:bottom w:val="none" w:sz="0" w:space="0" w:color="000000"/>
+              <w:top w:val="none" w:sz="0" w:space="0" w:color="000000"/>
+              <w:left w:val="none" w:sz="0" w:space="0" w:color="000000"/>
+              <w:right w:val="none" w:sz="0" w:space="0" w:color="000000"/>
+            </w:tcBorders>
+            <w:shd w:val="clear" w:color="auto" w:fill="FFFFFF"/>
+            <w:tcMar>
+              <w:top w:w="0" w:type="dxa"/>
+              <w:bottom w:w="0" w:type="dxa"/>
+              <w:left w:w="0" w:type="dxa"/>
+              <w:right w:w="0" w:type="dxa"/>
+            </w:tcMar>
+            <w:vAlign w:val="top"/>
+          </w:tcPr>
+          <w:p>
+            <w:pPr>
+              <w:pStyle w:val="Normal"/>
+              <w:jc w:val="left"/>
+              <w:pBdr>
+                <w:bottom w:val="none" w:sz="0" w:space="0" w:color="000000"/>
+                <w:top w:val="none" w:sz="0" w:space="0" w:color="000000"/>
+                <w:left w:val="none" w:sz="0" w:space="0" w:color="000000"/>
+                <w:right w:val="none" w:sz="0" w:space="0" w:color="000000"/>
+              </w:pBdr>
+              <w:spacing w:after="40" w:before="40" w:line="240"/>
+              <w:ind w:left="40" w:right="40" w:firstLine="0" w:firstLineChars="0"/>
+              <w:rPr>
+                <w:rFonts w:ascii="Arial" w:hAnsi="Arial" w:eastAsia="Arial" w:cs="Arial"/>
+                <w:i w:val="false"/>
+                <w:b w:val="false"/>
+                <w:u w:val="none"/>
+                <w:strike w:val="false"/>
+                <w:sz w:val="20"/>
+                <w:szCs w:val="20"/>
+                <w:color w:val="000000"/>
+              </w:rPr>
+            </w:pPr>
+            <w:r>
+              <w:rPr>
+                <w:rFonts w:ascii="Arial" w:hAnsi="Arial" w:eastAsia="Arial" w:cs="Arial"/>
+                <w:i w:val="false"/>
+                <w:b w:val="false"/>
+                <w:u w:val="none"/>
+                <w:strike w:val="false"/>
+                <w:sz w:val="20"/>
+                <w:szCs w:val="20"/>
+                <w:color w:val="000000"/>
+              </w:rPr>
+              <w:t xml:space="preserve">7</w:t>
+            </w:r>
+          </w:p>
+        </w:tc>
+        <w:tc>
+          <w:tcPr>
+            <w:tcBorders>
+              <w:bottom w:val="none" w:sz="0" w:space="0" w:color="000000"/>
+              <w:top w:val="none" w:sz="0" w:space="0" w:color="000000"/>
+              <w:left w:val="none" w:sz="0" w:space="0" w:color="000000"/>
+              <w:right w:val="none" w:sz="0" w:space="0" w:color="000000"/>
+            </w:tcBorders>
+            <w:shd w:val="clear" w:color="auto" w:fill="FFFFFF"/>
+            <w:tcMar>
+              <w:top w:w="0" w:type="dxa"/>
+              <w:bottom w:w="0" w:type="dxa"/>
+              <w:left w:w="0" w:type="dxa"/>
+              <w:right w:w="0" w:type="dxa"/>
+            </w:tcMar>
+            <w:vAlign w:val="top"/>
+          </w:tcPr>
+          <w:p>
+            <w:pPr>
+              <w:pStyle w:val="Normal"/>
+              <w:jc w:val="left"/>
+              <w:pBdr>
+                <w:bottom w:val="none" w:sz="0" w:space="0" w:color="000000"/>
+                <w:top w:val="none" w:sz="0" w:space="0" w:color="000000"/>
+                <w:left w:val="none" w:sz="0" w:space="0" w:color="000000"/>
+                <w:right w:val="none" w:sz="0" w:space="0" w:color="000000"/>
+              </w:pBdr>
+              <w:spacing w:after="40" w:before="40" w:line="240"/>
+              <w:ind w:left="40" w:right="40" w:firstLine="0" w:firstLineChars="0"/>
+              <w:rPr>
+                <w:rFonts w:ascii="Arial" w:hAnsi="Arial" w:eastAsia="Arial" w:cs="Arial"/>
+                <w:i w:val="false"/>
+                <w:b w:val="false"/>
+                <w:u w:val="none"/>
+                <w:strike w:val="false"/>
+                <w:sz w:val="20"/>
+                <w:szCs w:val="20"/>
+                <w:color w:val="000000"/>
+              </w:rPr>
+            </w:pPr>
+            <w:r>
+              <w:rPr>
+                <w:rFonts w:ascii="Arial" w:hAnsi="Arial" w:eastAsia="Arial" w:cs="Arial"/>
+                <w:i w:val="false"/>
+                <w:b w:val="false"/>
+                <w:u w:val="none"/>
+                <w:strike w:val="false"/>
+                <w:sz w:val="20"/>
+                <w:szCs w:val="20"/>
+                <w:color w:val="000000"/>
+              </w:rPr>
+              <w:t xml:space="preserve">7/32</w:t>
+            </w:r>
+          </w:p>
+        </w:tc>
+        <w:tc>
+          <w:tcPr>
+            <w:tcBorders>
+              <w:bottom w:val="none" w:sz="0" w:space="0" w:color="000000"/>
+              <w:top w:val="none" w:sz="0" w:space="0" w:color="000000"/>
+              <w:left w:val="none" w:sz="0" w:space="0" w:color="000000"/>
+              <w:right w:val="none" w:sz="0" w:space="0" w:color="000000"/>
+            </w:tcBorders>
+            <w:shd w:val="clear" w:color="auto" w:fill="FFFFFF"/>
+            <w:tcMar>
+              <w:top w:w="0" w:type="dxa"/>
+              <w:bottom w:w="0" w:type="dxa"/>
+              <w:left w:w="0" w:type="dxa"/>
+              <w:right w:w="0" w:type="dxa"/>
+            </w:tcMar>
+            <w:vAlign w:val="top"/>
+          </w:tcPr>
+          <w:p>
+            <w:pPr>
+              <w:pStyle w:val="Normal"/>
+              <w:jc w:val="left"/>
+              <w:pBdr>
+                <w:bottom w:val="none" w:sz="0" w:space="0" w:color="000000"/>
+                <w:top w:val="none" w:sz="0" w:space="0" w:color="000000"/>
+                <w:left w:val="none" w:sz="0" w:space="0" w:color="000000"/>
+                <w:right w:val="none" w:sz="0" w:space="0" w:color="000000"/>
+              </w:pBdr>
+              <w:spacing w:after="40" w:before="40" w:line="240"/>
+              <w:ind w:left="40" w:right="40" w:firstLine="0" w:firstLineChars="0"/>
+              <w:rPr>
+                <w:rFonts w:ascii="Arial" w:hAnsi="Arial" w:eastAsia="Arial" w:cs="Arial"/>
+                <w:i w:val="false"/>
+                <w:b w:val="false"/>
+                <w:u w:val="none"/>
+                <w:strike w:val="false"/>
+                <w:sz w:val="20"/>
+                <w:szCs w:val="20"/>
+                <w:color w:val="000000"/>
+              </w:rPr>
+            </w:pPr>
+            <w:r>
+              <w:rPr>
+                <w:rFonts w:ascii="Arial" w:hAnsi="Arial" w:eastAsia="Arial" w:cs="Arial"/>
+                <w:i w:val="false"/>
+                <w:b w:val="false"/>
+                <w:u w:val="none"/>
+                <w:strike w:val="false"/>
+                <w:sz w:val="20"/>
+                <w:szCs w:val="20"/>
+                <w:color w:val="000000"/>
+              </w:rPr>
+              <w:t xml:space="preserve">21.9%</w:t>
+            </w:r>
+          </w:p>
+        </w:tc>
+      </w:tr>
+      <w:tr>
+        <w:trPr>
+          <w:trHeight w:val="577" w:hRule="auto"/>
+        </w:trPr>
+        <w:tc>
+          <w:tcPr>
+            <w:tcBorders>
+              <w:bottom w:val="none" w:sz="0" w:space="0" w:color="000000"/>
+              <w:top w:val="none" w:sz="0" w:space="0" w:color="000000"/>
+              <w:left w:val="none" w:sz="0" w:space="0" w:color="000000"/>
+              <w:right w:val="none" w:sz="0" w:space="0" w:color="000000"/>
+            </w:tcBorders>
+            <w:shd w:val="clear" w:color="auto" w:fill="FFFFFF"/>
+            <w:tcMar>
+              <w:top w:w="0" w:type="dxa"/>
+              <w:bottom w:w="0" w:type="dxa"/>
+              <w:left w:w="0" w:type="dxa"/>
+              <w:right w:w="0" w:type="dxa"/>
+            </w:tcMar>
+            <w:vAlign w:val="top"/>
+          </w:tcPr>
+          <w:p>
+            <w:pPr>
+              <w:pStyle w:val="Normal"/>
+              <w:jc w:val="left"/>
+              <w:pBdr>
+                <w:bottom w:val="none" w:sz="0" w:space="0" w:color="000000"/>
+                <w:top w:val="none" w:sz="0" w:space="0" w:color="000000"/>
+                <w:left w:val="none" w:sz="0" w:space="0" w:color="000000"/>
+                <w:right w:val="none" w:sz="0" w:space="0" w:color="000000"/>
+              </w:pBdr>
+              <w:spacing w:after="40" w:before="40" w:line="240"/>
+              <w:ind w:left="40" w:right="40" w:firstLine="0" w:firstLineChars="0"/>
+              <w:rPr>
+                <w:rFonts w:ascii="Arial" w:hAnsi="Arial" w:eastAsia="Arial" w:cs="Arial"/>
+                <w:i w:val="false"/>
+                <w:b w:val="false"/>
+                <w:u w:val="none"/>
+                <w:strike w:val="false"/>
+                <w:sz w:val="20"/>
+                <w:szCs w:val="20"/>
+                <w:color w:val="000000"/>
+              </w:rPr>
+            </w:pPr>
+            <w:r>
+              <w:rPr>
+                <w:rFonts w:ascii="Arial" w:hAnsi="Arial" w:eastAsia="Arial" w:cs="Arial"/>
+                <w:i w:val="false"/>
+                <w:b w:val="false"/>
+                <w:u w:val="none"/>
+                <w:strike w:val="false"/>
+                <w:sz w:val="20"/>
+                <w:szCs w:val="20"/>
+                <w:color w:val="000000"/>
+              </w:rPr>
+              <w:t xml:space="preserve">Neither inclusion nor exclusion</w:t>
+            </w:r>
+          </w:p>
+        </w:tc>
+        <w:tc>
+          <w:tcPr>
+            <w:tcBorders>
+              <w:bottom w:val="none" w:sz="0" w:space="0" w:color="000000"/>
+              <w:top w:val="none" w:sz="0" w:space="0" w:color="000000"/>
+              <w:left w:val="none" w:sz="0" w:space="0" w:color="000000"/>
+              <w:right w:val="none" w:sz="0" w:space="0" w:color="000000"/>
+            </w:tcBorders>
+            <w:shd w:val="clear" w:color="auto" w:fill="FFFFFF"/>
+            <w:tcMar>
+              <w:top w:w="0" w:type="dxa"/>
+              <w:bottom w:w="0" w:type="dxa"/>
+              <w:left w:w="0" w:type="dxa"/>
+              <w:right w:w="0" w:type="dxa"/>
+            </w:tcMar>
+            <w:vAlign w:val="top"/>
+          </w:tcPr>
+          <w:p>
+            <w:pPr>
+              <w:pStyle w:val="Normal"/>
+              <w:jc w:val="left"/>
+              <w:pBdr>
+                <w:bottom w:val="none" w:sz="0" w:space="0" w:color="000000"/>
+                <w:top w:val="none" w:sz="0" w:space="0" w:color="000000"/>
+                <w:left w:val="none" w:sz="0" w:space="0" w:color="000000"/>
+                <w:right w:val="none" w:sz="0" w:space="0" w:color="000000"/>
+              </w:pBdr>
+              <w:spacing w:after="40" w:before="40" w:line="240"/>
+              <w:ind w:left="40" w:right="40" w:firstLine="0" w:firstLineChars="0"/>
+              <w:rPr>
+                <w:rFonts w:ascii="Arial" w:hAnsi="Arial" w:eastAsia="Arial" w:cs="Arial"/>
+                <w:i w:val="false"/>
+                <w:b w:val="false"/>
+                <w:u w:val="none"/>
+                <w:strike w:val="false"/>
+                <w:sz w:val="20"/>
+                <w:szCs w:val="20"/>
+                <w:color w:val="000000"/>
+              </w:rPr>
+            </w:pPr>
+            <w:r>
+              <w:rPr>
+                <w:rFonts w:ascii="Arial" w:hAnsi="Arial" w:eastAsia="Arial" w:cs="Arial"/>
+                <w:i w:val="false"/>
+                <w:b w:val="false"/>
+                <w:u w:val="none"/>
+                <w:strike w:val="false"/>
+                <w:sz w:val="20"/>
+                <w:szCs w:val="20"/>
+                <w:color w:val="000000"/>
+              </w:rPr>
+              <w:t xml:space="preserve">3</w:t>
+            </w:r>
+          </w:p>
+        </w:tc>
+        <w:tc>
+          <w:tcPr>
+            <w:tcBorders>
+              <w:bottom w:val="none" w:sz="0" w:space="0" w:color="000000"/>
+              <w:top w:val="none" w:sz="0" w:space="0" w:color="000000"/>
+              <w:left w:val="none" w:sz="0" w:space="0" w:color="000000"/>
+              <w:right w:val="none" w:sz="0" w:space="0" w:color="000000"/>
+            </w:tcBorders>
+            <w:shd w:val="clear" w:color="auto" w:fill="FFFFFF"/>
+            <w:tcMar>
+              <w:top w:w="0" w:type="dxa"/>
+              <w:bottom w:w="0" w:type="dxa"/>
+              <w:left w:w="0" w:type="dxa"/>
+              <w:right w:w="0" w:type="dxa"/>
+            </w:tcMar>
+            <w:vAlign w:val="top"/>
+          </w:tcPr>
+          <w:p>
+            <w:pPr>
+              <w:pStyle w:val="Normal"/>
+              <w:jc w:val="left"/>
+              <w:pBdr>
+                <w:bottom w:val="none" w:sz="0" w:space="0" w:color="000000"/>
+                <w:top w:val="none" w:sz="0" w:space="0" w:color="000000"/>
+                <w:left w:val="none" w:sz="0" w:space="0" w:color="000000"/>
+                <w:right w:val="none" w:sz="0" w:space="0" w:color="000000"/>
+              </w:pBdr>
+              <w:spacing w:after="40" w:before="40" w:line="240"/>
+              <w:ind w:left="40" w:right="40" w:firstLine="0" w:firstLineChars="0"/>
+              <w:rPr>
+                <w:rFonts w:ascii="Arial" w:hAnsi="Arial" w:eastAsia="Arial" w:cs="Arial"/>
+                <w:i w:val="false"/>
+                <w:b w:val="false"/>
+                <w:u w:val="none"/>
+                <w:strike w:val="false"/>
+                <w:sz w:val="20"/>
+                <w:szCs w:val="20"/>
+                <w:color w:val="000000"/>
+              </w:rPr>
+            </w:pPr>
+            <w:r>
+              <w:rPr>
+                <w:rFonts w:ascii="Arial" w:hAnsi="Arial" w:eastAsia="Arial" w:cs="Arial"/>
+                <w:i w:val="false"/>
+                <w:b w:val="false"/>
+                <w:u w:val="none"/>
+                <w:strike w:val="false"/>
+                <w:sz w:val="20"/>
+                <w:szCs w:val="20"/>
+                <w:color w:val="000000"/>
+              </w:rPr>
+              <w:t xml:space="preserve">3/32</w:t>
+            </w:r>
+          </w:p>
+        </w:tc>
+        <w:tc>
+          <w:tcPr>
+            <w:tcBorders>
+              <w:bottom w:val="none" w:sz="0" w:space="0" w:color="000000"/>
+              <w:top w:val="none" w:sz="0" w:space="0" w:color="000000"/>
+              <w:left w:val="none" w:sz="0" w:space="0" w:color="000000"/>
+              <w:right w:val="none" w:sz="0" w:space="0" w:color="000000"/>
+            </w:tcBorders>
+            <w:shd w:val="clear" w:color="auto" w:fill="FFFFFF"/>
+            <w:tcMar>
+              <w:top w:w="0" w:type="dxa"/>
+              <w:bottom w:w="0" w:type="dxa"/>
+              <w:left w:w="0" w:type="dxa"/>
+              <w:right w:w="0" w:type="dxa"/>
+            </w:tcMar>
+            <w:vAlign w:val="top"/>
+          </w:tcPr>
+          <w:p>
+            <w:pPr>
+              <w:pStyle w:val="Normal"/>
+              <w:jc w:val="left"/>
+              <w:pBdr>
+                <w:bottom w:val="none" w:sz="0" w:space="0" w:color="000000"/>
+                <w:top w:val="none" w:sz="0" w:space="0" w:color="000000"/>
+                <w:left w:val="none" w:sz="0" w:space="0" w:color="000000"/>
+                <w:right w:val="none" w:sz="0" w:space="0" w:color="000000"/>
+              </w:pBdr>
+              <w:spacing w:after="40" w:before="40" w:line="240"/>
+              <w:ind w:left="40" w:right="40" w:firstLine="0" w:firstLineChars="0"/>
+              <w:rPr>
+                <w:rFonts w:ascii="Arial" w:hAnsi="Arial" w:eastAsia="Arial" w:cs="Arial"/>
+                <w:i w:val="false"/>
+                <w:b w:val="false"/>
+                <w:u w:val="none"/>
+                <w:strike w:val="false"/>
+                <w:sz w:val="20"/>
+                <w:szCs w:val="20"/>
+                <w:color w:val="000000"/>
+              </w:rPr>
+            </w:pPr>
+            <w:r>
+              <w:rPr>
+                <w:rFonts w:ascii="Arial" w:hAnsi="Arial" w:eastAsia="Arial" w:cs="Arial"/>
+                <w:i w:val="false"/>
+                <w:b w:val="false"/>
+                <w:u w:val="none"/>
+                <w:strike w:val="false"/>
+                <w:sz w:val="20"/>
+                <w:szCs w:val="20"/>
+                <w:color w:val="000000"/>
+              </w:rPr>
+              <w:t xml:space="preserve">9.4%</w:t>
+            </w:r>
+          </w:p>
+        </w:tc>
+      </w:tr>
+      <w:tr>
+        <w:trPr>
+          <w:trHeight w:val="614" w:hRule="auto"/>
+        </w:trPr>
+        <w:tc>
+          <w:tcPr>
+            <w:tcBorders>
+              <w:bottom w:val="single" w:sz="12" w:space="0" w:color="666666"/>
+              <w:top w:val="none" w:sz="0" w:space="0" w:color="000000"/>
+              <w:left w:val="none" w:sz="0" w:space="0" w:color="000000"/>
+              <w:right w:val="none" w:sz="0" w:space="0" w:color="000000"/>
+            </w:tcBorders>
+            <w:shd w:val="clear" w:color="auto" w:fill="FFFFFF"/>
+            <w:tcMar>
+              <w:top w:w="0" w:type="dxa"/>
+              <w:bottom w:w="0" w:type="dxa"/>
+              <w:left w:w="0" w:type="dxa"/>
+              <w:right w:w="0" w:type="dxa"/>
+            </w:tcMar>
+            <w:vAlign w:val="top"/>
+          </w:tcPr>
+          <w:p>
+            <w:pPr>
+              <w:pStyle w:val="Normal"/>
+              <w:jc w:val="left"/>
+              <w:pBdr>
+                <w:bottom w:val="none" w:sz="0" w:space="0" w:color="000000"/>
+                <w:top w:val="none" w:sz="0" w:space="0" w:color="000000"/>
+                <w:left w:val="none" w:sz="0" w:space="0" w:color="000000"/>
+                <w:right w:val="none" w:sz="0" w:space="0" w:color="000000"/>
+              </w:pBdr>
+              <w:spacing w:after="40" w:before="40" w:line="240"/>
+              <w:ind w:left="40" w:right="40" w:firstLine="0" w:firstLineChars="0"/>
+              <w:rPr>
+                <w:rFonts w:ascii="Arial" w:hAnsi="Arial" w:eastAsia="Arial" w:cs="Arial"/>
+                <w:i w:val="false"/>
+                <w:b w:val="false"/>
+                <w:u w:val="none"/>
+                <w:strike w:val="false"/>
+                <w:sz w:val="20"/>
+                <w:szCs w:val="20"/>
+                <w:color w:val="000000"/>
+              </w:rPr>
+            </w:pPr>
+            <w:r>
+              <w:rPr>
+                <w:rFonts w:ascii="Arial" w:hAnsi="Arial" w:eastAsia="Arial" w:cs="Arial"/>
+                <w:i w:val="false"/>
+                <w:b w:val="false"/>
+                <w:u w:val="none"/>
+                <w:strike w:val="false"/>
+                <w:sz w:val="20"/>
+                <w:szCs w:val="20"/>
+                <w:color w:val="000000"/>
+              </w:rPr>
+              <w:t xml:space="preserve">Exclusions only</w:t>
+            </w:r>
+          </w:p>
+        </w:tc>
+        <w:tc>
+          <w:tcPr>
+            <w:tcBorders>
+              <w:bottom w:val="single" w:sz="12" w:space="0" w:color="666666"/>
+              <w:top w:val="none" w:sz="0" w:space="0" w:color="000000"/>
+              <w:left w:val="none" w:sz="0" w:space="0" w:color="000000"/>
+              <w:right w:val="none" w:sz="0" w:space="0" w:color="000000"/>
+            </w:tcBorders>
+            <w:shd w:val="clear" w:color="auto" w:fill="FFFFFF"/>
+            <w:tcMar>
+              <w:top w:w="0" w:type="dxa"/>
+              <w:bottom w:w="0" w:type="dxa"/>
+              <w:left w:w="0" w:type="dxa"/>
+              <w:right w:w="0" w:type="dxa"/>
+            </w:tcMar>
+            <w:vAlign w:val="top"/>
+          </w:tcPr>
+          <w:p>
+            <w:pPr>
+              <w:pStyle w:val="Normal"/>
+              <w:jc w:val="left"/>
+              <w:pBdr>
+                <w:bottom w:val="none" w:sz="0" w:space="0" w:color="000000"/>
+                <w:top w:val="none" w:sz="0" w:space="0" w:color="000000"/>
+                <w:left w:val="none" w:sz="0" w:space="0" w:color="000000"/>
+                <w:right w:val="none" w:sz="0" w:space="0" w:color="000000"/>
+              </w:pBdr>
+              <w:spacing w:after="40" w:before="40" w:line="240"/>
+              <w:ind w:left="40" w:right="40" w:firstLine="0" w:firstLineChars="0"/>
+              <w:rPr>
+                <w:rFonts w:ascii="Arial" w:hAnsi="Arial" w:eastAsia="Arial" w:cs="Arial"/>
+                <w:i w:val="false"/>
+                <w:b w:val="false"/>
+                <w:u w:val="none"/>
+                <w:strike w:val="false"/>
+                <w:sz w:val="20"/>
+                <w:szCs w:val="20"/>
+                <w:color w:val="000000"/>
+              </w:rPr>
+            </w:pPr>
+            <w:r>
+              <w:rPr>
+                <w:rFonts w:ascii="Arial" w:hAnsi="Arial" w:eastAsia="Arial" w:cs="Arial"/>
+                <w:i w:val="false"/>
+                <w:b w:val="false"/>
+                <w:u w:val="none"/>
+                <w:strike w:val="false"/>
+                <w:sz w:val="20"/>
+                <w:szCs w:val="20"/>
+                <w:color w:val="000000"/>
+              </w:rPr>
+              <w:t xml:space="preserve">1</w:t>
+            </w:r>
+          </w:p>
+        </w:tc>
+        <w:tc>
+          <w:tcPr>
+            <w:tcBorders>
+              <w:bottom w:val="single" w:sz="12" w:space="0" w:color="666666"/>
+              <w:top w:val="none" w:sz="0" w:space="0" w:color="000000"/>
+              <w:left w:val="none" w:sz="0" w:space="0" w:color="000000"/>
+              <w:right w:val="none" w:sz="0" w:space="0" w:color="000000"/>
+            </w:tcBorders>
+            <w:shd w:val="clear" w:color="auto" w:fill="FFFFFF"/>
+            <w:tcMar>
+              <w:top w:w="0" w:type="dxa"/>
+              <w:bottom w:w="0" w:type="dxa"/>
+              <w:left w:w="0" w:type="dxa"/>
+              <w:right w:w="0" w:type="dxa"/>
+            </w:tcMar>
+            <w:vAlign w:val="top"/>
+          </w:tcPr>
+          <w:p>
+            <w:pPr>
+              <w:pStyle w:val="Normal"/>
+              <w:jc w:val="left"/>
+              <w:pBdr>
+                <w:bottom w:val="none" w:sz="0" w:space="0" w:color="000000"/>
+                <w:top w:val="none" w:sz="0" w:space="0" w:color="000000"/>
+                <w:left w:val="none" w:sz="0" w:space="0" w:color="000000"/>
+                <w:right w:val="none" w:sz="0" w:space="0" w:color="000000"/>
+              </w:pBdr>
+              <w:spacing w:after="40" w:before="40" w:line="240"/>
+              <w:ind w:left="40" w:right="40" w:firstLine="0" w:firstLineChars="0"/>
+              <w:rPr>
+                <w:rFonts w:ascii="Arial" w:hAnsi="Arial" w:eastAsia="Arial" w:cs="Arial"/>
+                <w:i w:val="false"/>
+                <w:b w:val="false"/>
+                <w:u w:val="none"/>
+                <w:strike w:val="false"/>
+                <w:sz w:val="20"/>
+                <w:szCs w:val="20"/>
+                <w:color w:val="000000"/>
+              </w:rPr>
+            </w:pPr>
+            <w:r>
+              <w:rPr>
+                <w:rFonts w:ascii="Arial" w:hAnsi="Arial" w:eastAsia="Arial" w:cs="Arial"/>
+                <w:i w:val="false"/>
+                <w:b w:val="false"/>
+                <w:u w:val="none"/>
+                <w:strike w:val="false"/>
+                <w:sz w:val="20"/>
+                <w:szCs w:val="20"/>
+                <w:color w:val="000000"/>
+              </w:rPr>
+              <w:t xml:space="preserve">1/32</w:t>
+            </w:r>
+          </w:p>
+        </w:tc>
+        <w:tc>
+          <w:tcPr>
+            <w:tcBorders>
+              <w:bottom w:val="single" w:sz="12" w:space="0" w:color="666666"/>
+              <w:top w:val="none" w:sz="0" w:space="0" w:color="000000"/>
+              <w:left w:val="none" w:sz="0" w:space="0" w:color="000000"/>
+              <w:right w:val="none" w:sz="0" w:space="0" w:color="000000"/>
+            </w:tcBorders>
+            <w:shd w:val="clear" w:color="auto" w:fill="FFFFFF"/>
+            <w:tcMar>
+              <w:top w:w="0" w:type="dxa"/>
+              <w:bottom w:w="0" w:type="dxa"/>
+              <w:left w:w="0" w:type="dxa"/>
+              <w:right w:w="0" w:type="dxa"/>
+            </w:tcMar>
+            <w:vAlign w:val="top"/>
+          </w:tcPr>
+          <w:p>
+            <w:pPr>
+              <w:pStyle w:val="Normal"/>
+              <w:jc w:val="left"/>
+              <w:pBdr>
+                <w:bottom w:val="none" w:sz="0" w:space="0" w:color="000000"/>
+                <w:top w:val="none" w:sz="0" w:space="0" w:color="000000"/>
+                <w:left w:val="none" w:sz="0" w:space="0" w:color="000000"/>
+                <w:right w:val="none" w:sz="0" w:space="0" w:color="000000"/>
+              </w:pBdr>
+              <w:spacing w:after="40" w:before="40" w:line="240"/>
+              <w:ind w:left="40" w:right="40" w:firstLine="0" w:firstLineChars="0"/>
+              <w:rPr>
+                <w:rFonts w:ascii="Arial" w:hAnsi="Arial" w:eastAsia="Arial" w:cs="Arial"/>
+                <w:i w:val="false"/>
+                <w:b w:val="false"/>
+                <w:u w:val="none"/>
+                <w:strike w:val="false"/>
+                <w:sz w:val="20"/>
+                <w:szCs w:val="20"/>
+                <w:color w:val="000000"/>
+              </w:rPr>
+            </w:pPr>
+            <w:r>
+              <w:rPr>
+                <w:rFonts w:ascii="Arial" w:hAnsi="Arial" w:eastAsia="Arial" w:cs="Arial"/>
+                <w:i w:val="false"/>
+                <w:b w:val="false"/>
+                <w:u w:val="none"/>
+                <w:strike w:val="false"/>
+                <w:sz w:val="20"/>
+                <w:szCs w:val="20"/>
+                <w:color w:val="000000"/>
+              </w:rPr>
+              <w:t xml:space="preserve">3.1%</w:t>
+            </w:r>
+          </w:p>
+        </w:tc>
+      </w:tr>
+    </w:tbl>
+    <w:p>
+      <w:pPr>
+        <w:pStyle w:val="Normal"/>
+      </w:pPr>
+      <w:r>
+        <w:t xml:space="preserve"/>
+      </w:r>
+    </w:p>
+    <w:p>
+      <w:pPr>
+        <w:pStyle w:val="TableCaption"/>
+        <w:jc w:val="center"/>
+        <w:keepNext/>
+        <w:pBdr>
+          <w:bottom w:val="none" w:sz="0" w:space="0" w:color="000000"/>
+          <w:top w:val="none" w:sz="0" w:space="0" w:color="000000"/>
+          <w:left w:val="none" w:sz="0" w:space="0" w:color="000000"/>
+          <w:right w:val="none" w:sz="0" w:space="0" w:color="000000"/>
+        </w:pBdr>
+        <w:spacing w:after="60" w:before="60" w:line="240"/>
+        <w:ind w:left="60" w:right="60" w:firstLine="0" w:firstLineChars="0"/>
+      </w:pPr>
+      <w:r>
+        <w:t xml:space="preserve">Table H. Prevalence of specific inclusion criteria among studies reporting inclusion criteria  (N = 28)</w:t>
+      </w:r>
+    </w:p>
+    <w:tbl xmlns:a="http://schemas.openxmlformats.org/drawingml/2006/main" xmlns:pic="http://schemas.openxmlformats.org/drawingml/2006/picture">
+      <w:tblPr>
+        <w:tblLayout w:type="autofit"/>
+        <w:jc w:val="center"/>
+        <w:tblW w:type="pct" w:w="5000"/>
+        <w:tblLook w:firstRow="1" w:lastRow="0" w:firstColumn="0" w:lastColumn="0" w:noHBand="0" w:noVBand="1"/>
+      </w:tblPr>
+      <w:tr>
+        <w:trPr>
+          <w:trHeight w:val="612" w:hRule="auto"/>
+          <w:tblHeader/>
+        </w:trPr>
+        <w:tc>
+          <w:tcPr>
+            <w:tcBorders>
+              <w:bottom w:val="single" w:sz="12" w:space="0" w:color="666666"/>
+              <w:top w:val="single" w:sz="12" w:space="0" w:color="666666"/>
+              <w:left w:val="none" w:sz="0" w:space="0" w:color="000000"/>
+              <w:right w:val="none" w:sz="0" w:space="0" w:color="000000"/>
+            </w:tcBorders>
+            <w:shd w:val="clear" w:color="auto" w:fill="FFFFFF"/>
+            <w:tcMar>
+              <w:top w:w="0" w:type="dxa"/>
+              <w:bottom w:w="0" w:type="dxa"/>
+              <w:left w:w="0" w:type="dxa"/>
+              <w:right w:w="0" w:type="dxa"/>
+            </w:tcMar>
+            <w:vAlign w:val="top"/>
+          </w:tcPr>
+          <w:p>
+            <w:pPr>
+              <w:pStyle w:val="Normal"/>
+              <w:jc w:val="left"/>
+              <w:pBdr>
+                <w:bottom w:val="none" w:sz="0" w:space="0" w:color="000000"/>
+                <w:top w:val="none" w:sz="0" w:space="0" w:color="000000"/>
+                <w:left w:val="none" w:sz="0" w:space="0" w:color="000000"/>
+                <w:right w:val="none" w:sz="0" w:space="0" w:color="000000"/>
+              </w:pBdr>
+              <w:spacing w:after="40" w:before="40" w:line="240"/>
+              <w:ind w:left="40" w:right="40" w:firstLine="0" w:firstLineChars="0"/>
+              <w:rPr>
+                <w:rFonts w:ascii="Arial" w:hAnsi="Arial" w:eastAsia="Arial" w:cs="Arial"/>
+                <w:i w:val="false"/>
+                <w:b w:val="false"/>
+                <w:u w:val="none"/>
+                <w:strike w:val="false"/>
+                <w:sz w:val="20"/>
+                <w:szCs w:val="20"/>
+                <w:color w:val="000000"/>
+              </w:rPr>
+            </w:pPr>
+            <w:r>
+              <w:rPr>
+                <w:rFonts w:ascii="Arial" w:hAnsi="Arial" w:eastAsia="Arial" w:cs="Arial"/>
+                <w:i w:val="false"/>
+                <w:b w:val="false"/>
+                <w:u w:val="none"/>
+                <w:strike w:val="false"/>
+                <w:sz w:val="20"/>
+                <w:szCs w:val="20"/>
+                <w:color w:val="000000"/>
+              </w:rPr>
+              <w:t xml:space="preserve">Inclusion criteria</w:t>
+            </w:r>
+          </w:p>
+        </w:tc>
+        <w:tc>
+          <w:tcPr>
+            <w:tcBorders>
+              <w:bottom w:val="single" w:sz="12" w:space="0" w:color="666666"/>
+              <w:top w:val="single" w:sz="12" w:space="0" w:color="666666"/>
+              <w:left w:val="none" w:sz="0" w:space="0" w:color="000000"/>
+              <w:right w:val="none" w:sz="0" w:space="0" w:color="000000"/>
+            </w:tcBorders>
+            <w:shd w:val="clear" w:color="auto" w:fill="FFFFFF"/>
+            <w:tcMar>
+              <w:top w:w="0" w:type="dxa"/>
+              <w:bottom w:w="0" w:type="dxa"/>
+              <w:left w:w="0" w:type="dxa"/>
+              <w:right w:w="0" w:type="dxa"/>
+            </w:tcMar>
+            <w:vAlign w:val="top"/>
+          </w:tcPr>
+          <w:p>
+            <w:pPr>
+              <w:pStyle w:val="Normal"/>
+              <w:jc w:val="left"/>
+              <w:pBdr>
+                <w:bottom w:val="none" w:sz="0" w:space="0" w:color="000000"/>
+                <w:top w:val="none" w:sz="0" w:space="0" w:color="000000"/>
+                <w:left w:val="none" w:sz="0" w:space="0" w:color="000000"/>
+                <w:right w:val="none" w:sz="0" w:space="0" w:color="000000"/>
+              </w:pBdr>
+              <w:spacing w:after="40" w:before="40" w:line="240"/>
+              <w:ind w:left="40" w:right="40" w:firstLine="0" w:firstLineChars="0"/>
+              <w:rPr>
+                <w:rFonts w:ascii="Arial" w:hAnsi="Arial" w:eastAsia="Arial" w:cs="Arial"/>
+                <w:i w:val="false"/>
+                <w:b w:val="false"/>
+                <w:u w:val="none"/>
+                <w:strike w:val="false"/>
+                <w:sz w:val="20"/>
+                <w:szCs w:val="20"/>
+                <w:color w:val="000000"/>
+              </w:rPr>
+            </w:pPr>
+            <w:r>
+              <w:rPr>
+                <w:rFonts w:ascii="Arial" w:hAnsi="Arial" w:eastAsia="Arial" w:cs="Arial"/>
+                <w:i w:val="false"/>
+                <w:b w:val="false"/>
+                <w:u w:val="none"/>
+                <w:strike w:val="false"/>
+                <w:sz w:val="20"/>
+                <w:szCs w:val="20"/>
+                <w:color w:val="000000"/>
+              </w:rPr>
+              <w:t xml:space="preserve">n_true</w:t>
+            </w:r>
+          </w:p>
+        </w:tc>
+        <w:tc>
+          <w:tcPr>
+            <w:tcBorders>
+              <w:bottom w:val="single" w:sz="12" w:space="0" w:color="666666"/>
+              <w:top w:val="single" w:sz="12" w:space="0" w:color="666666"/>
+              <w:left w:val="none" w:sz="0" w:space="0" w:color="000000"/>
+              <w:right w:val="none" w:sz="0" w:space="0" w:color="000000"/>
+            </w:tcBorders>
+            <w:shd w:val="clear" w:color="auto" w:fill="FFFFFF"/>
+            <w:tcMar>
+              <w:top w:w="0" w:type="dxa"/>
+              <w:bottom w:w="0" w:type="dxa"/>
+              <w:left w:w="0" w:type="dxa"/>
+              <w:right w:w="0" w:type="dxa"/>
+            </w:tcMar>
+            <w:vAlign w:val="top"/>
+          </w:tcPr>
+          <w:p>
+            <w:pPr>
+              <w:pStyle w:val="Normal"/>
+              <w:jc w:val="left"/>
+              <w:pBdr>
+                <w:bottom w:val="none" w:sz="0" w:space="0" w:color="000000"/>
+                <w:top w:val="none" w:sz="0" w:space="0" w:color="000000"/>
+                <w:left w:val="none" w:sz="0" w:space="0" w:color="000000"/>
+                <w:right w:val="none" w:sz="0" w:space="0" w:color="000000"/>
+              </w:pBdr>
+              <w:spacing w:after="40" w:before="40" w:line="240"/>
+              <w:ind w:left="40" w:right="40" w:firstLine="0" w:firstLineChars="0"/>
+              <w:rPr>
+                <w:rFonts w:ascii="Arial" w:hAnsi="Arial" w:eastAsia="Arial" w:cs="Arial"/>
+                <w:i w:val="false"/>
+                <w:b w:val="false"/>
+                <w:u w:val="none"/>
+                <w:strike w:val="false"/>
+                <w:sz w:val="20"/>
+                <w:szCs w:val="20"/>
+                <w:color w:val="000000"/>
+              </w:rPr>
+            </w:pPr>
+            <w:r>
+              <w:rPr>
+                <w:rFonts w:ascii="Arial" w:hAnsi="Arial" w:eastAsia="Arial" w:cs="Arial"/>
+                <w:i w:val="false"/>
+                <w:b w:val="false"/>
+                <w:u w:val="none"/>
+                <w:strike w:val="false"/>
+                <w:sz w:val="20"/>
+                <w:szCs w:val="20"/>
+                <w:color w:val="000000"/>
+              </w:rPr>
+              <w:t xml:space="preserve">Proportion</w:t>
+            </w:r>
+          </w:p>
+        </w:tc>
+        <w:tc>
+          <w:tcPr>
+            <w:tcBorders>
+              <w:bottom w:val="single" w:sz="12" w:space="0" w:color="666666"/>
+              <w:top w:val="single" w:sz="12" w:space="0" w:color="666666"/>
+              <w:left w:val="none" w:sz="0" w:space="0" w:color="000000"/>
+              <w:right w:val="none" w:sz="0" w:space="0" w:color="000000"/>
+            </w:tcBorders>
+            <w:shd w:val="clear" w:color="auto" w:fill="FFFFFF"/>
+            <w:tcMar>
+              <w:top w:w="0" w:type="dxa"/>
+              <w:bottom w:w="0" w:type="dxa"/>
+              <w:left w:w="0" w:type="dxa"/>
+              <w:right w:w="0" w:type="dxa"/>
+            </w:tcMar>
+            <w:vAlign w:val="top"/>
+          </w:tcPr>
+          <w:p>
+            <w:pPr>
+              <w:pStyle w:val="Normal"/>
+              <w:jc w:val="left"/>
+              <w:pBdr>
+                <w:bottom w:val="none" w:sz="0" w:space="0" w:color="000000"/>
+                <w:top w:val="none" w:sz="0" w:space="0" w:color="000000"/>
+                <w:left w:val="none" w:sz="0" w:space="0" w:color="000000"/>
+                <w:right w:val="none" w:sz="0" w:space="0" w:color="000000"/>
+              </w:pBdr>
+              <w:spacing w:after="40" w:before="40" w:line="240"/>
+              <w:ind w:left="40" w:right="40" w:firstLine="0" w:firstLineChars="0"/>
+              <w:rPr>
+                <w:rFonts w:ascii="Arial" w:hAnsi="Arial" w:eastAsia="Arial" w:cs="Arial"/>
+                <w:i w:val="false"/>
+                <w:b w:val="false"/>
+                <w:u w:val="none"/>
+                <w:strike w:val="false"/>
+                <w:sz w:val="20"/>
+                <w:szCs w:val="20"/>
+                <w:color w:val="000000"/>
+              </w:rPr>
+            </w:pPr>
+            <w:r>
+              <w:rPr>
+                <w:rFonts w:ascii="Arial" w:hAnsi="Arial" w:eastAsia="Arial" w:cs="Arial"/>
+                <w:i w:val="false"/>
+                <w:b w:val="false"/>
+                <w:u w:val="none"/>
+                <w:strike w:val="false"/>
+                <w:sz w:val="20"/>
+                <w:szCs w:val="20"/>
+                <w:color w:val="000000"/>
+              </w:rPr>
+              <w:t xml:space="preserve">Percent</w:t>
+            </w:r>
+          </w:p>
+        </w:tc>
+      </w:tr>
+      <w:tr>
+        <w:trPr>
+          <w:trHeight w:val="614" w:hRule="auto"/>
+        </w:trPr>
+        <w:tc>
+          <w:tcPr>
+            <w:tcBorders>
+              <w:bottom w:val="none" w:sz="0" w:space="0" w:color="000000"/>
+              <w:top w:val="single" w:sz="12" w:space="0" w:color="666666"/>
+              <w:left w:val="none" w:sz="0" w:space="0" w:color="000000"/>
+              <w:right w:val="none" w:sz="0" w:space="0" w:color="000000"/>
+            </w:tcBorders>
+            <w:shd w:val="clear" w:color="auto" w:fill="FFFFFF"/>
+            <w:tcMar>
+              <w:top w:w="0" w:type="dxa"/>
+              <w:bottom w:w="0" w:type="dxa"/>
+              <w:left w:w="0" w:type="dxa"/>
+              <w:right w:w="0" w:type="dxa"/>
+            </w:tcMar>
+            <w:vAlign w:val="top"/>
+          </w:tcPr>
+          <w:p>
+            <w:pPr>
+              <w:pStyle w:val="Normal"/>
+              <w:jc w:val="left"/>
+              <w:pBdr>
+                <w:bottom w:val="none" w:sz="0" w:space="0" w:color="000000"/>
+                <w:top w:val="none" w:sz="0" w:space="0" w:color="000000"/>
+                <w:left w:val="none" w:sz="0" w:space="0" w:color="000000"/>
+                <w:right w:val="none" w:sz="0" w:space="0" w:color="000000"/>
+              </w:pBdr>
+              <w:spacing w:after="40" w:before="40" w:line="240"/>
+              <w:ind w:left="40" w:right="40" w:firstLine="0" w:firstLineChars="0"/>
+              <w:rPr>
+                <w:rFonts w:ascii="Arial" w:hAnsi="Arial" w:eastAsia="Arial" w:cs="Arial"/>
+                <w:i w:val="false"/>
+                <w:b w:val="false"/>
+                <w:u w:val="none"/>
+                <w:strike w:val="false"/>
+                <w:sz w:val="20"/>
+                <w:szCs w:val="20"/>
+                <w:color w:val="000000"/>
+              </w:rPr>
+            </w:pPr>
+            <w:r>
+              <w:rPr>
+                <w:rFonts w:ascii="Arial" w:hAnsi="Arial" w:eastAsia="Arial" w:cs="Arial"/>
+                <w:i w:val="false"/>
+                <w:b w:val="false"/>
+                <w:u w:val="none"/>
+                <w:strike w:val="false"/>
+                <w:sz w:val="20"/>
+                <w:szCs w:val="20"/>
+                <w:color w:val="000000"/>
+              </w:rPr>
+              <w:t xml:space="preserve">language</w:t>
+            </w:r>
+          </w:p>
+        </w:tc>
+        <w:tc>
+          <w:tcPr>
+            <w:tcBorders>
+              <w:bottom w:val="none" w:sz="0" w:space="0" w:color="000000"/>
+              <w:top w:val="single" w:sz="12" w:space="0" w:color="666666"/>
+              <w:left w:val="none" w:sz="0" w:space="0" w:color="000000"/>
+              <w:right w:val="none" w:sz="0" w:space="0" w:color="000000"/>
+            </w:tcBorders>
+            <w:shd w:val="clear" w:color="auto" w:fill="FFFFFF"/>
+            <w:tcMar>
+              <w:top w:w="0" w:type="dxa"/>
+              <w:bottom w:w="0" w:type="dxa"/>
+              <w:left w:w="0" w:type="dxa"/>
+              <w:right w:w="0" w:type="dxa"/>
+            </w:tcMar>
+            <w:vAlign w:val="top"/>
+          </w:tcPr>
+          <w:p>
+            <w:pPr>
+              <w:pStyle w:val="Normal"/>
+              <w:jc w:val="left"/>
+              <w:pBdr>
+                <w:bottom w:val="none" w:sz="0" w:space="0" w:color="000000"/>
+                <w:top w:val="none" w:sz="0" w:space="0" w:color="000000"/>
+                <w:left w:val="none" w:sz="0" w:space="0" w:color="000000"/>
+                <w:right w:val="none" w:sz="0" w:space="0" w:color="000000"/>
+              </w:pBdr>
+              <w:spacing w:after="40" w:before="40" w:line="240"/>
+              <w:ind w:left="40" w:right="40" w:firstLine="0" w:firstLineChars="0"/>
+              <w:rPr>
+                <w:rFonts w:ascii="Arial" w:hAnsi="Arial" w:eastAsia="Arial" w:cs="Arial"/>
+                <w:i w:val="false"/>
+                <w:b w:val="false"/>
+                <w:u w:val="none"/>
+                <w:strike w:val="false"/>
+                <w:sz w:val="20"/>
+                <w:szCs w:val="20"/>
+                <w:color w:val="000000"/>
+              </w:rPr>
+            </w:pPr>
+            <w:r>
+              <w:rPr>
+                <w:rFonts w:ascii="Arial" w:hAnsi="Arial" w:eastAsia="Arial" w:cs="Arial"/>
+                <w:i w:val="false"/>
+                <w:b w:val="false"/>
+                <w:u w:val="none"/>
+                <w:strike w:val="false"/>
+                <w:sz w:val="20"/>
+                <w:szCs w:val="20"/>
+                <w:color w:val="000000"/>
+              </w:rPr>
+              <w:t xml:space="preserve">17</w:t>
+            </w:r>
+          </w:p>
+        </w:tc>
+        <w:tc>
+          <w:tcPr>
+            <w:tcBorders>
+              <w:bottom w:val="none" w:sz="0" w:space="0" w:color="000000"/>
+              <w:top w:val="single" w:sz="12" w:space="0" w:color="666666"/>
+              <w:left w:val="none" w:sz="0" w:space="0" w:color="000000"/>
+              <w:right w:val="none" w:sz="0" w:space="0" w:color="000000"/>
+            </w:tcBorders>
+            <w:shd w:val="clear" w:color="auto" w:fill="FFFFFF"/>
+            <w:tcMar>
+              <w:top w:w="0" w:type="dxa"/>
+              <w:bottom w:w="0" w:type="dxa"/>
+              <w:left w:w="0" w:type="dxa"/>
+              <w:right w:w="0" w:type="dxa"/>
+            </w:tcMar>
+            <w:vAlign w:val="top"/>
+          </w:tcPr>
+          <w:p>
+            <w:pPr>
+              <w:pStyle w:val="Normal"/>
+              <w:jc w:val="left"/>
+              <w:pBdr>
+                <w:bottom w:val="none" w:sz="0" w:space="0" w:color="000000"/>
+                <w:top w:val="none" w:sz="0" w:space="0" w:color="000000"/>
+                <w:left w:val="none" w:sz="0" w:space="0" w:color="000000"/>
+                <w:right w:val="none" w:sz="0" w:space="0" w:color="000000"/>
+              </w:pBdr>
+              <w:spacing w:after="40" w:before="40" w:line="240"/>
+              <w:ind w:left="40" w:right="40" w:firstLine="0" w:firstLineChars="0"/>
+              <w:rPr>
+                <w:rFonts w:ascii="Arial" w:hAnsi="Arial" w:eastAsia="Arial" w:cs="Arial"/>
+                <w:i w:val="false"/>
+                <w:b w:val="false"/>
+                <w:u w:val="none"/>
+                <w:strike w:val="false"/>
+                <w:sz w:val="20"/>
+                <w:szCs w:val="20"/>
+                <w:color w:val="000000"/>
+              </w:rPr>
+            </w:pPr>
+            <w:r>
+              <w:rPr>
+                <w:rFonts w:ascii="Arial" w:hAnsi="Arial" w:eastAsia="Arial" w:cs="Arial"/>
+                <w:i w:val="false"/>
+                <w:b w:val="false"/>
+                <w:u w:val="none"/>
+                <w:strike w:val="false"/>
+                <w:sz w:val="20"/>
+                <w:szCs w:val="20"/>
+                <w:color w:val="000000"/>
+              </w:rPr>
+              <w:t xml:space="preserve">17/28</w:t>
+            </w:r>
+          </w:p>
+        </w:tc>
+        <w:tc>
+          <w:tcPr>
+            <w:tcBorders>
+              <w:bottom w:val="none" w:sz="0" w:space="0" w:color="000000"/>
+              <w:top w:val="single" w:sz="12" w:space="0" w:color="666666"/>
+              <w:left w:val="none" w:sz="0" w:space="0" w:color="000000"/>
+              <w:right w:val="none" w:sz="0" w:space="0" w:color="000000"/>
+            </w:tcBorders>
+            <w:shd w:val="clear" w:color="auto" w:fill="FFFFFF"/>
+            <w:tcMar>
+              <w:top w:w="0" w:type="dxa"/>
+              <w:bottom w:w="0" w:type="dxa"/>
+              <w:left w:w="0" w:type="dxa"/>
+              <w:right w:w="0" w:type="dxa"/>
+            </w:tcMar>
+            <w:vAlign w:val="top"/>
+          </w:tcPr>
+          <w:p>
+            <w:pPr>
+              <w:pStyle w:val="Normal"/>
+              <w:jc w:val="left"/>
+              <w:pBdr>
+                <w:bottom w:val="none" w:sz="0" w:space="0" w:color="000000"/>
+                <w:top w:val="none" w:sz="0" w:space="0" w:color="000000"/>
+                <w:left w:val="none" w:sz="0" w:space="0" w:color="000000"/>
+                <w:right w:val="none" w:sz="0" w:space="0" w:color="000000"/>
+              </w:pBdr>
+              <w:spacing w:after="40" w:before="40" w:line="240"/>
+              <w:ind w:left="40" w:right="40" w:firstLine="0" w:firstLineChars="0"/>
+              <w:rPr>
+                <w:rFonts w:ascii="Arial" w:hAnsi="Arial" w:eastAsia="Arial" w:cs="Arial"/>
+                <w:i w:val="false"/>
+                <w:b w:val="false"/>
+                <w:u w:val="none"/>
+                <w:strike w:val="false"/>
+                <w:sz w:val="20"/>
+                <w:szCs w:val="20"/>
+                <w:color w:val="000000"/>
+              </w:rPr>
+            </w:pPr>
+            <w:r>
+              <w:rPr>
+                <w:rFonts w:ascii="Arial" w:hAnsi="Arial" w:eastAsia="Arial" w:cs="Arial"/>
+                <w:i w:val="false"/>
+                <w:b w:val="false"/>
+                <w:u w:val="none"/>
+                <w:strike w:val="false"/>
+                <w:sz w:val="20"/>
+                <w:szCs w:val="20"/>
+                <w:color w:val="000000"/>
+              </w:rPr>
+              <w:t xml:space="preserve">60.7%</w:t>
+            </w:r>
+          </w:p>
+        </w:tc>
+      </w:tr>
+      <w:tr>
+        <w:trPr>
+          <w:trHeight w:val="617" w:hRule="auto"/>
+        </w:trPr>
+        <w:tc>
+          <w:tcPr>
+            <w:tcBorders>
+              <w:bottom w:val="none" w:sz="0" w:space="0" w:color="000000"/>
+              <w:top w:val="none" w:sz="0" w:space="0" w:color="000000"/>
+              <w:left w:val="none" w:sz="0" w:space="0" w:color="000000"/>
+              <w:right w:val="none" w:sz="0" w:space="0" w:color="000000"/>
+            </w:tcBorders>
+            <w:shd w:val="clear" w:color="auto" w:fill="FFFFFF"/>
+            <w:tcMar>
+              <w:top w:w="0" w:type="dxa"/>
+              <w:bottom w:w="0" w:type="dxa"/>
+              <w:left w:w="0" w:type="dxa"/>
+              <w:right w:w="0" w:type="dxa"/>
+            </w:tcMar>
+            <w:vAlign w:val="top"/>
+          </w:tcPr>
+          <w:p>
+            <w:pPr>
+              <w:pStyle w:val="Normal"/>
+              <w:jc w:val="left"/>
+              <w:pBdr>
+                <w:bottom w:val="none" w:sz="0" w:space="0" w:color="000000"/>
+                <w:top w:val="none" w:sz="0" w:space="0" w:color="000000"/>
+                <w:left w:val="none" w:sz="0" w:space="0" w:color="000000"/>
+                <w:right w:val="none" w:sz="0" w:space="0" w:color="000000"/>
+              </w:pBdr>
+              <w:spacing w:after="40" w:before="40" w:line="240"/>
+              <w:ind w:left="40" w:right="40" w:firstLine="0" w:firstLineChars="0"/>
+              <w:rPr>
+                <w:rFonts w:ascii="Arial" w:hAnsi="Arial" w:eastAsia="Arial" w:cs="Arial"/>
+                <w:i w:val="false"/>
+                <w:b w:val="false"/>
+                <w:u w:val="none"/>
+                <w:strike w:val="false"/>
+                <w:sz w:val="20"/>
+                <w:szCs w:val="20"/>
+                <w:color w:val="000000"/>
+              </w:rPr>
+            </w:pPr>
+            <w:r>
+              <w:rPr>
+                <w:rFonts w:ascii="Arial" w:hAnsi="Arial" w:eastAsia="Arial" w:cs="Arial"/>
+                <w:i w:val="false"/>
+                <w:b w:val="false"/>
+                <w:u w:val="none"/>
+                <w:strike w:val="false"/>
+                <w:sz w:val="20"/>
+                <w:szCs w:val="20"/>
+                <w:color w:val="000000"/>
+              </w:rPr>
+              <w:t xml:space="preserve">frequency</w:t>
+            </w:r>
+          </w:p>
+        </w:tc>
+        <w:tc>
+          <w:tcPr>
+            <w:tcBorders>
+              <w:bottom w:val="none" w:sz="0" w:space="0" w:color="000000"/>
+              <w:top w:val="none" w:sz="0" w:space="0" w:color="000000"/>
+              <w:left w:val="none" w:sz="0" w:space="0" w:color="000000"/>
+              <w:right w:val="none" w:sz="0" w:space="0" w:color="000000"/>
+            </w:tcBorders>
+            <w:shd w:val="clear" w:color="auto" w:fill="FFFFFF"/>
+            <w:tcMar>
+              <w:top w:w="0" w:type="dxa"/>
+              <w:bottom w:w="0" w:type="dxa"/>
+              <w:left w:w="0" w:type="dxa"/>
+              <w:right w:w="0" w:type="dxa"/>
+            </w:tcMar>
+            <w:vAlign w:val="top"/>
+          </w:tcPr>
+          <w:p>
+            <w:pPr>
+              <w:pStyle w:val="Normal"/>
+              <w:jc w:val="left"/>
+              <w:pBdr>
+                <w:bottom w:val="none" w:sz="0" w:space="0" w:color="000000"/>
+                <w:top w:val="none" w:sz="0" w:space="0" w:color="000000"/>
+                <w:left w:val="none" w:sz="0" w:space="0" w:color="000000"/>
+                <w:right w:val="none" w:sz="0" w:space="0" w:color="000000"/>
+              </w:pBdr>
+              <w:spacing w:after="40" w:before="40" w:line="240"/>
+              <w:ind w:left="40" w:right="40" w:firstLine="0" w:firstLineChars="0"/>
+              <w:rPr>
+                <w:rFonts w:ascii="Arial" w:hAnsi="Arial" w:eastAsia="Arial" w:cs="Arial"/>
+                <w:i w:val="false"/>
+                <w:b w:val="false"/>
+                <w:u w:val="none"/>
+                <w:strike w:val="false"/>
+                <w:sz w:val="20"/>
+                <w:szCs w:val="20"/>
+                <w:color w:val="000000"/>
+              </w:rPr>
+            </w:pPr>
+            <w:r>
+              <w:rPr>
+                <w:rFonts w:ascii="Arial" w:hAnsi="Arial" w:eastAsia="Arial" w:cs="Arial"/>
+                <w:i w:val="false"/>
+                <w:b w:val="false"/>
+                <w:u w:val="none"/>
+                <w:strike w:val="false"/>
+                <w:sz w:val="20"/>
+                <w:szCs w:val="20"/>
+                <w:color w:val="000000"/>
+              </w:rPr>
+              <w:t xml:space="preserve">14</w:t>
+            </w:r>
+          </w:p>
+        </w:tc>
+        <w:tc>
+          <w:tcPr>
+            <w:tcBorders>
+              <w:bottom w:val="none" w:sz="0" w:space="0" w:color="000000"/>
+              <w:top w:val="none" w:sz="0" w:space="0" w:color="000000"/>
+              <w:left w:val="none" w:sz="0" w:space="0" w:color="000000"/>
+              <w:right w:val="none" w:sz="0" w:space="0" w:color="000000"/>
+            </w:tcBorders>
+            <w:shd w:val="clear" w:color="auto" w:fill="FFFFFF"/>
+            <w:tcMar>
+              <w:top w:w="0" w:type="dxa"/>
+              <w:bottom w:w="0" w:type="dxa"/>
+              <w:left w:w="0" w:type="dxa"/>
+              <w:right w:w="0" w:type="dxa"/>
+            </w:tcMar>
+            <w:vAlign w:val="top"/>
+          </w:tcPr>
+          <w:p>
+            <w:pPr>
+              <w:pStyle w:val="Normal"/>
+              <w:jc w:val="left"/>
+              <w:pBdr>
+                <w:bottom w:val="none" w:sz="0" w:space="0" w:color="000000"/>
+                <w:top w:val="none" w:sz="0" w:space="0" w:color="000000"/>
+                <w:left w:val="none" w:sz="0" w:space="0" w:color="000000"/>
+                <w:right w:val="none" w:sz="0" w:space="0" w:color="000000"/>
+              </w:pBdr>
+              <w:spacing w:after="40" w:before="40" w:line="240"/>
+              <w:ind w:left="40" w:right="40" w:firstLine="0" w:firstLineChars="0"/>
+              <w:rPr>
+                <w:rFonts w:ascii="Arial" w:hAnsi="Arial" w:eastAsia="Arial" w:cs="Arial"/>
+                <w:i w:val="false"/>
+                <w:b w:val="false"/>
+                <w:u w:val="none"/>
+                <w:strike w:val="false"/>
+                <w:sz w:val="20"/>
+                <w:szCs w:val="20"/>
+                <w:color w:val="000000"/>
+              </w:rPr>
+            </w:pPr>
+            <w:r>
+              <w:rPr>
+                <w:rFonts w:ascii="Arial" w:hAnsi="Arial" w:eastAsia="Arial" w:cs="Arial"/>
+                <w:i w:val="false"/>
+                <w:b w:val="false"/>
+                <w:u w:val="none"/>
+                <w:strike w:val="false"/>
+                <w:sz w:val="20"/>
+                <w:szCs w:val="20"/>
+                <w:color w:val="000000"/>
+              </w:rPr>
+              <w:t xml:space="preserve">14/28</w:t>
+            </w:r>
+          </w:p>
+        </w:tc>
+        <w:tc>
+          <w:tcPr>
+            <w:tcBorders>
+              <w:bottom w:val="none" w:sz="0" w:space="0" w:color="000000"/>
+              <w:top w:val="none" w:sz="0" w:space="0" w:color="000000"/>
+              <w:left w:val="none" w:sz="0" w:space="0" w:color="000000"/>
+              <w:right w:val="none" w:sz="0" w:space="0" w:color="000000"/>
+            </w:tcBorders>
+            <w:shd w:val="clear" w:color="auto" w:fill="FFFFFF"/>
+            <w:tcMar>
+              <w:top w:w="0" w:type="dxa"/>
+              <w:bottom w:w="0" w:type="dxa"/>
+              <w:left w:w="0" w:type="dxa"/>
+              <w:right w:w="0" w:type="dxa"/>
+            </w:tcMar>
+            <w:vAlign w:val="top"/>
+          </w:tcPr>
+          <w:p>
+            <w:pPr>
+              <w:pStyle w:val="Normal"/>
+              <w:jc w:val="left"/>
+              <w:pBdr>
+                <w:bottom w:val="none" w:sz="0" w:space="0" w:color="000000"/>
+                <w:top w:val="none" w:sz="0" w:space="0" w:color="000000"/>
+                <w:left w:val="none" w:sz="0" w:space="0" w:color="000000"/>
+                <w:right w:val="none" w:sz="0" w:space="0" w:color="000000"/>
+              </w:pBdr>
+              <w:spacing w:after="40" w:before="40" w:line="240"/>
+              <w:ind w:left="40" w:right="40" w:firstLine="0" w:firstLineChars="0"/>
+              <w:rPr>
+                <w:rFonts w:ascii="Arial" w:hAnsi="Arial" w:eastAsia="Arial" w:cs="Arial"/>
+                <w:i w:val="false"/>
+                <w:b w:val="false"/>
+                <w:u w:val="none"/>
+                <w:strike w:val="false"/>
+                <w:sz w:val="20"/>
+                <w:szCs w:val="20"/>
+                <w:color w:val="000000"/>
+              </w:rPr>
+            </w:pPr>
+            <w:r>
+              <w:rPr>
+                <w:rFonts w:ascii="Arial" w:hAnsi="Arial" w:eastAsia="Arial" w:cs="Arial"/>
+                <w:i w:val="false"/>
+                <w:b w:val="false"/>
+                <w:u w:val="none"/>
+                <w:strike w:val="false"/>
+                <w:sz w:val="20"/>
+                <w:szCs w:val="20"/>
+                <w:color w:val="000000"/>
+              </w:rPr>
+              <w:t xml:space="preserve">50.0%</w:t>
+            </w:r>
+          </w:p>
+        </w:tc>
+      </w:tr>
+      <w:tr>
+        <w:trPr>
+          <w:trHeight w:val="614" w:hRule="auto"/>
+        </w:trPr>
+        <w:tc>
+          <w:tcPr>
+            <w:tcBorders>
+              <w:bottom w:val="none" w:sz="0" w:space="0" w:color="000000"/>
+              <w:top w:val="none" w:sz="0" w:space="0" w:color="000000"/>
+              <w:left w:val="none" w:sz="0" w:space="0" w:color="000000"/>
+              <w:right w:val="none" w:sz="0" w:space="0" w:color="000000"/>
+            </w:tcBorders>
+            <w:shd w:val="clear" w:color="auto" w:fill="FFFFFF"/>
+            <w:tcMar>
+              <w:top w:w="0" w:type="dxa"/>
+              <w:bottom w:w="0" w:type="dxa"/>
+              <w:left w:w="0" w:type="dxa"/>
+              <w:right w:w="0" w:type="dxa"/>
+            </w:tcMar>
+            <w:vAlign w:val="top"/>
+          </w:tcPr>
+          <w:p>
+            <w:pPr>
+              <w:pStyle w:val="Normal"/>
+              <w:jc w:val="left"/>
+              <w:pBdr>
+                <w:bottom w:val="none" w:sz="0" w:space="0" w:color="000000"/>
+                <w:top w:val="none" w:sz="0" w:space="0" w:color="000000"/>
+                <w:left w:val="none" w:sz="0" w:space="0" w:color="000000"/>
+                <w:right w:val="none" w:sz="0" w:space="0" w:color="000000"/>
+              </w:pBdr>
+              <w:spacing w:after="40" w:before="40" w:line="240"/>
+              <w:ind w:left="40" w:right="40" w:firstLine="0" w:firstLineChars="0"/>
+              <w:rPr>
+                <w:rFonts w:ascii="Arial" w:hAnsi="Arial" w:eastAsia="Arial" w:cs="Arial"/>
+                <w:i w:val="false"/>
+                <w:b w:val="false"/>
+                <w:u w:val="none"/>
+                <w:strike w:val="false"/>
+                <w:sz w:val="20"/>
+                <w:szCs w:val="20"/>
+                <w:color w:val="000000"/>
+              </w:rPr>
+            </w:pPr>
+            <w:r>
+              <w:rPr>
+                <w:rFonts w:ascii="Arial" w:hAnsi="Arial" w:eastAsia="Arial" w:cs="Arial"/>
+                <w:i w:val="false"/>
+                <w:b w:val="false"/>
+                <w:u w:val="none"/>
+                <w:strike w:val="false"/>
+                <w:sz w:val="20"/>
+                <w:szCs w:val="20"/>
+                <w:color w:val="000000"/>
+              </w:rPr>
+              <w:t xml:space="preserve">availability</w:t>
+            </w:r>
+          </w:p>
+        </w:tc>
+        <w:tc>
+          <w:tcPr>
+            <w:tcBorders>
+              <w:bottom w:val="none" w:sz="0" w:space="0" w:color="000000"/>
+              <w:top w:val="none" w:sz="0" w:space="0" w:color="000000"/>
+              <w:left w:val="none" w:sz="0" w:space="0" w:color="000000"/>
+              <w:right w:val="none" w:sz="0" w:space="0" w:color="000000"/>
+            </w:tcBorders>
+            <w:shd w:val="clear" w:color="auto" w:fill="FFFFFF"/>
+            <w:tcMar>
+              <w:top w:w="0" w:type="dxa"/>
+              <w:bottom w:w="0" w:type="dxa"/>
+              <w:left w:w="0" w:type="dxa"/>
+              <w:right w:w="0" w:type="dxa"/>
+            </w:tcMar>
+            <w:vAlign w:val="top"/>
+          </w:tcPr>
+          <w:p>
+            <w:pPr>
+              <w:pStyle w:val="Normal"/>
+              <w:jc w:val="left"/>
+              <w:pBdr>
+                <w:bottom w:val="none" w:sz="0" w:space="0" w:color="000000"/>
+                <w:top w:val="none" w:sz="0" w:space="0" w:color="000000"/>
+                <w:left w:val="none" w:sz="0" w:space="0" w:color="000000"/>
+                <w:right w:val="none" w:sz="0" w:space="0" w:color="000000"/>
+              </w:pBdr>
+              <w:spacing w:after="40" w:before="40" w:line="240"/>
+              <w:ind w:left="40" w:right="40" w:firstLine="0" w:firstLineChars="0"/>
+              <w:rPr>
+                <w:rFonts w:ascii="Arial" w:hAnsi="Arial" w:eastAsia="Arial" w:cs="Arial"/>
+                <w:i w:val="false"/>
+                <w:b w:val="false"/>
+                <w:u w:val="none"/>
+                <w:strike w:val="false"/>
+                <w:sz w:val="20"/>
+                <w:szCs w:val="20"/>
+                <w:color w:val="000000"/>
+              </w:rPr>
+            </w:pPr>
+            <w:r>
+              <w:rPr>
+                <w:rFonts w:ascii="Arial" w:hAnsi="Arial" w:eastAsia="Arial" w:cs="Arial"/>
+                <w:i w:val="false"/>
+                <w:b w:val="false"/>
+                <w:u w:val="none"/>
+                <w:strike w:val="false"/>
+                <w:sz w:val="20"/>
+                <w:szCs w:val="20"/>
+                <w:color w:val="000000"/>
+              </w:rPr>
+              <w:t xml:space="preserve">8</w:t>
+            </w:r>
+          </w:p>
+        </w:tc>
+        <w:tc>
+          <w:tcPr>
+            <w:tcBorders>
+              <w:bottom w:val="none" w:sz="0" w:space="0" w:color="000000"/>
+              <w:top w:val="none" w:sz="0" w:space="0" w:color="000000"/>
+              <w:left w:val="none" w:sz="0" w:space="0" w:color="000000"/>
+              <w:right w:val="none" w:sz="0" w:space="0" w:color="000000"/>
+            </w:tcBorders>
+            <w:shd w:val="clear" w:color="auto" w:fill="FFFFFF"/>
+            <w:tcMar>
+              <w:top w:w="0" w:type="dxa"/>
+              <w:bottom w:w="0" w:type="dxa"/>
+              <w:left w:w="0" w:type="dxa"/>
+              <w:right w:w="0" w:type="dxa"/>
+            </w:tcMar>
+            <w:vAlign w:val="top"/>
+          </w:tcPr>
+          <w:p>
+            <w:pPr>
+              <w:pStyle w:val="Normal"/>
+              <w:jc w:val="left"/>
+              <w:pBdr>
+                <w:bottom w:val="none" w:sz="0" w:space="0" w:color="000000"/>
+                <w:top w:val="none" w:sz="0" w:space="0" w:color="000000"/>
+                <w:left w:val="none" w:sz="0" w:space="0" w:color="000000"/>
+                <w:right w:val="none" w:sz="0" w:space="0" w:color="000000"/>
+              </w:pBdr>
+              <w:spacing w:after="40" w:before="40" w:line="240"/>
+              <w:ind w:left="40" w:right="40" w:firstLine="0" w:firstLineChars="0"/>
+              <w:rPr>
+                <w:rFonts w:ascii="Arial" w:hAnsi="Arial" w:eastAsia="Arial" w:cs="Arial"/>
+                <w:i w:val="false"/>
+                <w:b w:val="false"/>
+                <w:u w:val="none"/>
+                <w:strike w:val="false"/>
+                <w:sz w:val="20"/>
+                <w:szCs w:val="20"/>
+                <w:color w:val="000000"/>
+              </w:rPr>
+            </w:pPr>
+            <w:r>
+              <w:rPr>
+                <w:rFonts w:ascii="Arial" w:hAnsi="Arial" w:eastAsia="Arial" w:cs="Arial"/>
+                <w:i w:val="false"/>
+                <w:b w:val="false"/>
+                <w:u w:val="none"/>
+                <w:strike w:val="false"/>
+                <w:sz w:val="20"/>
+                <w:szCs w:val="20"/>
+                <w:color w:val="000000"/>
+              </w:rPr>
+              <w:t xml:space="preserve">8/28</w:t>
+            </w:r>
+          </w:p>
+        </w:tc>
+        <w:tc>
+          <w:tcPr>
+            <w:tcBorders>
+              <w:bottom w:val="none" w:sz="0" w:space="0" w:color="000000"/>
+              <w:top w:val="none" w:sz="0" w:space="0" w:color="000000"/>
+              <w:left w:val="none" w:sz="0" w:space="0" w:color="000000"/>
+              <w:right w:val="none" w:sz="0" w:space="0" w:color="000000"/>
+            </w:tcBorders>
+            <w:shd w:val="clear" w:color="auto" w:fill="FFFFFF"/>
+            <w:tcMar>
+              <w:top w:w="0" w:type="dxa"/>
+              <w:bottom w:w="0" w:type="dxa"/>
+              <w:left w:w="0" w:type="dxa"/>
+              <w:right w:w="0" w:type="dxa"/>
+            </w:tcMar>
+            <w:vAlign w:val="top"/>
+          </w:tcPr>
+          <w:p>
+            <w:pPr>
+              <w:pStyle w:val="Normal"/>
+              <w:jc w:val="left"/>
+              <w:pBdr>
+                <w:bottom w:val="none" w:sz="0" w:space="0" w:color="000000"/>
+                <w:top w:val="none" w:sz="0" w:space="0" w:color="000000"/>
+                <w:left w:val="none" w:sz="0" w:space="0" w:color="000000"/>
+                <w:right w:val="none" w:sz="0" w:space="0" w:color="000000"/>
+              </w:pBdr>
+              <w:spacing w:after="40" w:before="40" w:line="240"/>
+              <w:ind w:left="40" w:right="40" w:firstLine="0" w:firstLineChars="0"/>
+              <w:rPr>
+                <w:rFonts w:ascii="Arial" w:hAnsi="Arial" w:eastAsia="Arial" w:cs="Arial"/>
+                <w:i w:val="false"/>
+                <w:b w:val="false"/>
+                <w:u w:val="none"/>
+                <w:strike w:val="false"/>
+                <w:sz w:val="20"/>
+                <w:szCs w:val="20"/>
+                <w:color w:val="000000"/>
+              </w:rPr>
+            </w:pPr>
+            <w:r>
+              <w:rPr>
+                <w:rFonts w:ascii="Arial" w:hAnsi="Arial" w:eastAsia="Arial" w:cs="Arial"/>
+                <w:i w:val="false"/>
+                <w:b w:val="false"/>
+                <w:u w:val="none"/>
+                <w:strike w:val="false"/>
+                <w:sz w:val="20"/>
+                <w:szCs w:val="20"/>
+                <w:color w:val="000000"/>
+              </w:rPr>
+              <w:t xml:space="preserve">28.6%</w:t>
+            </w:r>
+          </w:p>
+        </w:tc>
+      </w:tr>
+      <w:tr>
+        <w:trPr>
+          <w:trHeight w:val="617" w:hRule="auto"/>
+        </w:trPr>
+        <w:tc>
+          <w:tcPr>
+            <w:tcBorders>
+              <w:bottom w:val="none" w:sz="0" w:space="0" w:color="000000"/>
+              <w:top w:val="none" w:sz="0" w:space="0" w:color="000000"/>
+              <w:left w:val="none" w:sz="0" w:space="0" w:color="000000"/>
+              <w:right w:val="none" w:sz="0" w:space="0" w:color="000000"/>
+            </w:tcBorders>
+            <w:shd w:val="clear" w:color="auto" w:fill="FFFFFF"/>
+            <w:tcMar>
+              <w:top w:w="0" w:type="dxa"/>
+              <w:bottom w:w="0" w:type="dxa"/>
+              <w:left w:w="0" w:type="dxa"/>
+              <w:right w:w="0" w:type="dxa"/>
+            </w:tcMar>
+            <w:vAlign w:val="top"/>
+          </w:tcPr>
+          <w:p>
+            <w:pPr>
+              <w:pStyle w:val="Normal"/>
+              <w:jc w:val="left"/>
+              <w:pBdr>
+                <w:bottom w:val="none" w:sz="0" w:space="0" w:color="000000"/>
+                <w:top w:val="none" w:sz="0" w:space="0" w:color="000000"/>
+                <w:left w:val="none" w:sz="0" w:space="0" w:color="000000"/>
+                <w:right w:val="none" w:sz="0" w:space="0" w:color="000000"/>
+              </w:pBdr>
+              <w:spacing w:after="40" w:before="40" w:line="240"/>
+              <w:ind w:left="40" w:right="40" w:firstLine="0" w:firstLineChars="0"/>
+              <w:rPr>
+                <w:rFonts w:ascii="Arial" w:hAnsi="Arial" w:eastAsia="Arial" w:cs="Arial"/>
+                <w:i w:val="false"/>
+                <w:b w:val="false"/>
+                <w:u w:val="none"/>
+                <w:strike w:val="false"/>
+                <w:sz w:val="20"/>
+                <w:szCs w:val="20"/>
+                <w:color w:val="000000"/>
+              </w:rPr>
+            </w:pPr>
+            <w:r>
+              <w:rPr>
+                <w:rFonts w:ascii="Arial" w:hAnsi="Arial" w:eastAsia="Arial" w:cs="Arial"/>
+                <w:i w:val="false"/>
+                <w:b w:val="false"/>
+                <w:u w:val="none"/>
+                <w:strike w:val="false"/>
+                <w:sz w:val="20"/>
+                <w:szCs w:val="20"/>
+                <w:color w:val="000000"/>
+              </w:rPr>
+              <w:t xml:space="preserve">release date/recency</w:t>
+            </w:r>
+          </w:p>
+        </w:tc>
+        <w:tc>
+          <w:tcPr>
+            <w:tcBorders>
+              <w:bottom w:val="none" w:sz="0" w:space="0" w:color="000000"/>
+              <w:top w:val="none" w:sz="0" w:space="0" w:color="000000"/>
+              <w:left w:val="none" w:sz="0" w:space="0" w:color="000000"/>
+              <w:right w:val="none" w:sz="0" w:space="0" w:color="000000"/>
+            </w:tcBorders>
+            <w:shd w:val="clear" w:color="auto" w:fill="FFFFFF"/>
+            <w:tcMar>
+              <w:top w:w="0" w:type="dxa"/>
+              <w:bottom w:w="0" w:type="dxa"/>
+              <w:left w:w="0" w:type="dxa"/>
+              <w:right w:w="0" w:type="dxa"/>
+            </w:tcMar>
+            <w:vAlign w:val="top"/>
+          </w:tcPr>
+          <w:p>
+            <w:pPr>
+              <w:pStyle w:val="Normal"/>
+              <w:jc w:val="left"/>
+              <w:pBdr>
+                <w:bottom w:val="none" w:sz="0" w:space="0" w:color="000000"/>
+                <w:top w:val="none" w:sz="0" w:space="0" w:color="000000"/>
+                <w:left w:val="none" w:sz="0" w:space="0" w:color="000000"/>
+                <w:right w:val="none" w:sz="0" w:space="0" w:color="000000"/>
+              </w:pBdr>
+              <w:spacing w:after="40" w:before="40" w:line="240"/>
+              <w:ind w:left="40" w:right="40" w:firstLine="0" w:firstLineChars="0"/>
+              <w:rPr>
+                <w:rFonts w:ascii="Arial" w:hAnsi="Arial" w:eastAsia="Arial" w:cs="Arial"/>
+                <w:i w:val="false"/>
+                <w:b w:val="false"/>
+                <w:u w:val="none"/>
+                <w:strike w:val="false"/>
+                <w:sz w:val="20"/>
+                <w:szCs w:val="20"/>
+                <w:color w:val="000000"/>
+              </w:rPr>
+            </w:pPr>
+            <w:r>
+              <w:rPr>
+                <w:rFonts w:ascii="Arial" w:hAnsi="Arial" w:eastAsia="Arial" w:cs="Arial"/>
+                <w:i w:val="false"/>
+                <w:b w:val="false"/>
+                <w:u w:val="none"/>
+                <w:strike w:val="false"/>
+                <w:sz w:val="20"/>
+                <w:szCs w:val="20"/>
+                <w:color w:val="000000"/>
+              </w:rPr>
+              <w:t xml:space="preserve">8</w:t>
+            </w:r>
+          </w:p>
+        </w:tc>
+        <w:tc>
+          <w:tcPr>
+            <w:tcBorders>
+              <w:bottom w:val="none" w:sz="0" w:space="0" w:color="000000"/>
+              <w:top w:val="none" w:sz="0" w:space="0" w:color="000000"/>
+              <w:left w:val="none" w:sz="0" w:space="0" w:color="000000"/>
+              <w:right w:val="none" w:sz="0" w:space="0" w:color="000000"/>
+            </w:tcBorders>
+            <w:shd w:val="clear" w:color="auto" w:fill="FFFFFF"/>
+            <w:tcMar>
+              <w:top w:w="0" w:type="dxa"/>
+              <w:bottom w:w="0" w:type="dxa"/>
+              <w:left w:w="0" w:type="dxa"/>
+              <w:right w:w="0" w:type="dxa"/>
+            </w:tcMar>
+            <w:vAlign w:val="top"/>
+          </w:tcPr>
+          <w:p>
+            <w:pPr>
+              <w:pStyle w:val="Normal"/>
+              <w:jc w:val="left"/>
+              <w:pBdr>
+                <w:bottom w:val="none" w:sz="0" w:space="0" w:color="000000"/>
+                <w:top w:val="none" w:sz="0" w:space="0" w:color="000000"/>
+                <w:left w:val="none" w:sz="0" w:space="0" w:color="000000"/>
+                <w:right w:val="none" w:sz="0" w:space="0" w:color="000000"/>
+              </w:pBdr>
+              <w:spacing w:after="40" w:before="40" w:line="240"/>
+              <w:ind w:left="40" w:right="40" w:firstLine="0" w:firstLineChars="0"/>
+              <w:rPr>
+                <w:rFonts w:ascii="Arial" w:hAnsi="Arial" w:eastAsia="Arial" w:cs="Arial"/>
+                <w:i w:val="false"/>
+                <w:b w:val="false"/>
+                <w:u w:val="none"/>
+                <w:strike w:val="false"/>
+                <w:sz w:val="20"/>
+                <w:szCs w:val="20"/>
+                <w:color w:val="000000"/>
+              </w:rPr>
+            </w:pPr>
+            <w:r>
+              <w:rPr>
+                <w:rFonts w:ascii="Arial" w:hAnsi="Arial" w:eastAsia="Arial" w:cs="Arial"/>
+                <w:i w:val="false"/>
+                <w:b w:val="false"/>
+                <w:u w:val="none"/>
+                <w:strike w:val="false"/>
+                <w:sz w:val="20"/>
+                <w:szCs w:val="20"/>
+                <w:color w:val="000000"/>
+              </w:rPr>
+              <w:t xml:space="preserve">8/28</w:t>
+            </w:r>
+          </w:p>
+        </w:tc>
+        <w:tc>
+          <w:tcPr>
+            <w:tcBorders>
+              <w:bottom w:val="none" w:sz="0" w:space="0" w:color="000000"/>
+              <w:top w:val="none" w:sz="0" w:space="0" w:color="000000"/>
+              <w:left w:val="none" w:sz="0" w:space="0" w:color="000000"/>
+              <w:right w:val="none" w:sz="0" w:space="0" w:color="000000"/>
+            </w:tcBorders>
+            <w:shd w:val="clear" w:color="auto" w:fill="FFFFFF"/>
+            <w:tcMar>
+              <w:top w:w="0" w:type="dxa"/>
+              <w:bottom w:w="0" w:type="dxa"/>
+              <w:left w:w="0" w:type="dxa"/>
+              <w:right w:w="0" w:type="dxa"/>
+            </w:tcMar>
+            <w:vAlign w:val="top"/>
+          </w:tcPr>
+          <w:p>
+            <w:pPr>
+              <w:pStyle w:val="Normal"/>
+              <w:jc w:val="left"/>
+              <w:pBdr>
+                <w:bottom w:val="none" w:sz="0" w:space="0" w:color="000000"/>
+                <w:top w:val="none" w:sz="0" w:space="0" w:color="000000"/>
+                <w:left w:val="none" w:sz="0" w:space="0" w:color="000000"/>
+                <w:right w:val="none" w:sz="0" w:space="0" w:color="000000"/>
+              </w:pBdr>
+              <w:spacing w:after="40" w:before="40" w:line="240"/>
+              <w:ind w:left="40" w:right="40" w:firstLine="0" w:firstLineChars="0"/>
+              <w:rPr>
+                <w:rFonts w:ascii="Arial" w:hAnsi="Arial" w:eastAsia="Arial" w:cs="Arial"/>
+                <w:i w:val="false"/>
+                <w:b w:val="false"/>
+                <w:u w:val="none"/>
+                <w:strike w:val="false"/>
+                <w:sz w:val="20"/>
+                <w:szCs w:val="20"/>
+                <w:color w:val="000000"/>
+              </w:rPr>
+            </w:pPr>
+            <w:r>
+              <w:rPr>
+                <w:rFonts w:ascii="Arial" w:hAnsi="Arial" w:eastAsia="Arial" w:cs="Arial"/>
+                <w:i w:val="false"/>
+                <w:b w:val="false"/>
+                <w:u w:val="none"/>
+                <w:strike w:val="false"/>
+                <w:sz w:val="20"/>
+                <w:szCs w:val="20"/>
+                <w:color w:val="000000"/>
+              </w:rPr>
+              <w:t xml:space="preserve">28.6%</w:t>
+            </w:r>
+          </w:p>
+        </w:tc>
+      </w:tr>
+      <w:tr>
+        <w:trPr>
+          <w:trHeight w:val="577" w:hRule="auto"/>
+        </w:trPr>
+        <w:tc>
+          <w:tcPr>
+            <w:tcBorders>
+              <w:bottom w:val="none" w:sz="0" w:space="0" w:color="000000"/>
+              <w:top w:val="none" w:sz="0" w:space="0" w:color="000000"/>
+              <w:left w:val="none" w:sz="0" w:space="0" w:color="000000"/>
+              <w:right w:val="none" w:sz="0" w:space="0" w:color="000000"/>
+            </w:tcBorders>
+            <w:shd w:val="clear" w:color="auto" w:fill="FFFFFF"/>
+            <w:tcMar>
+              <w:top w:w="0" w:type="dxa"/>
+              <w:bottom w:w="0" w:type="dxa"/>
+              <w:left w:w="0" w:type="dxa"/>
+              <w:right w:w="0" w:type="dxa"/>
+            </w:tcMar>
+            <w:vAlign w:val="top"/>
+          </w:tcPr>
+          <w:p>
+            <w:pPr>
+              <w:pStyle w:val="Normal"/>
+              <w:jc w:val="left"/>
+              <w:pBdr>
+                <w:bottom w:val="none" w:sz="0" w:space="0" w:color="000000"/>
+                <w:top w:val="none" w:sz="0" w:space="0" w:color="000000"/>
+                <w:left w:val="none" w:sz="0" w:space="0" w:color="000000"/>
+                <w:right w:val="none" w:sz="0" w:space="0" w:color="000000"/>
+              </w:pBdr>
+              <w:spacing w:after="40" w:before="40" w:line="240"/>
+              <w:ind w:left="40" w:right="40" w:firstLine="0" w:firstLineChars="0"/>
+              <w:rPr>
+                <w:rFonts w:ascii="Arial" w:hAnsi="Arial" w:eastAsia="Arial" w:cs="Arial"/>
+                <w:i w:val="false"/>
+                <w:b w:val="false"/>
+                <w:u w:val="none"/>
+                <w:strike w:val="false"/>
+                <w:sz w:val="20"/>
+                <w:szCs w:val="20"/>
+                <w:color w:val="000000"/>
+              </w:rPr>
+            </w:pPr>
+            <w:r>
+              <w:rPr>
+                <w:rFonts w:ascii="Arial" w:hAnsi="Arial" w:eastAsia="Arial" w:cs="Arial"/>
+                <w:i w:val="false"/>
+                <w:b w:val="false"/>
+                <w:u w:val="none"/>
+                <w:strike w:val="false"/>
+                <w:sz w:val="20"/>
+                <w:szCs w:val="20"/>
+                <w:color w:val="000000"/>
+              </w:rPr>
+              <w:t xml:space="preserve">clinical relevance</w:t>
+            </w:r>
+          </w:p>
+        </w:tc>
+        <w:tc>
+          <w:tcPr>
+            <w:tcBorders>
+              <w:bottom w:val="none" w:sz="0" w:space="0" w:color="000000"/>
+              <w:top w:val="none" w:sz="0" w:space="0" w:color="000000"/>
+              <w:left w:val="none" w:sz="0" w:space="0" w:color="000000"/>
+              <w:right w:val="none" w:sz="0" w:space="0" w:color="000000"/>
+            </w:tcBorders>
+            <w:shd w:val="clear" w:color="auto" w:fill="FFFFFF"/>
+            <w:tcMar>
+              <w:top w:w="0" w:type="dxa"/>
+              <w:bottom w:w="0" w:type="dxa"/>
+              <w:left w:w="0" w:type="dxa"/>
+              <w:right w:w="0" w:type="dxa"/>
+            </w:tcMar>
+            <w:vAlign w:val="top"/>
+          </w:tcPr>
+          <w:p>
+            <w:pPr>
+              <w:pStyle w:val="Normal"/>
+              <w:jc w:val="left"/>
+              <w:pBdr>
+                <w:bottom w:val="none" w:sz="0" w:space="0" w:color="000000"/>
+                <w:top w:val="none" w:sz="0" w:space="0" w:color="000000"/>
+                <w:left w:val="none" w:sz="0" w:space="0" w:color="000000"/>
+                <w:right w:val="none" w:sz="0" w:space="0" w:color="000000"/>
+              </w:pBdr>
+              <w:spacing w:after="40" w:before="40" w:line="240"/>
+              <w:ind w:left="40" w:right="40" w:firstLine="0" w:firstLineChars="0"/>
+              <w:rPr>
+                <w:rFonts w:ascii="Arial" w:hAnsi="Arial" w:eastAsia="Arial" w:cs="Arial"/>
+                <w:i w:val="false"/>
+                <w:b w:val="false"/>
+                <w:u w:val="none"/>
+                <w:strike w:val="false"/>
+                <w:sz w:val="20"/>
+                <w:szCs w:val="20"/>
+                <w:color w:val="000000"/>
+              </w:rPr>
+            </w:pPr>
+            <w:r>
+              <w:rPr>
+                <w:rFonts w:ascii="Arial" w:hAnsi="Arial" w:eastAsia="Arial" w:cs="Arial"/>
+                <w:i w:val="false"/>
+                <w:b w:val="false"/>
+                <w:u w:val="none"/>
+                <w:strike w:val="false"/>
+                <w:sz w:val="20"/>
+                <w:szCs w:val="20"/>
+                <w:color w:val="000000"/>
+              </w:rPr>
+              <w:t xml:space="preserve">6</w:t>
+            </w:r>
+          </w:p>
+        </w:tc>
+        <w:tc>
+          <w:tcPr>
+            <w:tcBorders>
+              <w:bottom w:val="none" w:sz="0" w:space="0" w:color="000000"/>
+              <w:top w:val="none" w:sz="0" w:space="0" w:color="000000"/>
+              <w:left w:val="none" w:sz="0" w:space="0" w:color="000000"/>
+              <w:right w:val="none" w:sz="0" w:space="0" w:color="000000"/>
+            </w:tcBorders>
+            <w:shd w:val="clear" w:color="auto" w:fill="FFFFFF"/>
+            <w:tcMar>
+              <w:top w:w="0" w:type="dxa"/>
+              <w:bottom w:w="0" w:type="dxa"/>
+              <w:left w:w="0" w:type="dxa"/>
+              <w:right w:w="0" w:type="dxa"/>
+            </w:tcMar>
+            <w:vAlign w:val="top"/>
+          </w:tcPr>
+          <w:p>
+            <w:pPr>
+              <w:pStyle w:val="Normal"/>
+              <w:jc w:val="left"/>
+              <w:pBdr>
+                <w:bottom w:val="none" w:sz="0" w:space="0" w:color="000000"/>
+                <w:top w:val="none" w:sz="0" w:space="0" w:color="000000"/>
+                <w:left w:val="none" w:sz="0" w:space="0" w:color="000000"/>
+                <w:right w:val="none" w:sz="0" w:space="0" w:color="000000"/>
+              </w:pBdr>
+              <w:spacing w:after="40" w:before="40" w:line="240"/>
+              <w:ind w:left="40" w:right="40" w:firstLine="0" w:firstLineChars="0"/>
+              <w:rPr>
+                <w:rFonts w:ascii="Arial" w:hAnsi="Arial" w:eastAsia="Arial" w:cs="Arial"/>
+                <w:i w:val="false"/>
+                <w:b w:val="false"/>
+                <w:u w:val="none"/>
+                <w:strike w:val="false"/>
+                <w:sz w:val="20"/>
+                <w:szCs w:val="20"/>
+                <w:color w:val="000000"/>
+              </w:rPr>
+            </w:pPr>
+            <w:r>
+              <w:rPr>
+                <w:rFonts w:ascii="Arial" w:hAnsi="Arial" w:eastAsia="Arial" w:cs="Arial"/>
+                <w:i w:val="false"/>
+                <w:b w:val="false"/>
+                <w:u w:val="none"/>
+                <w:strike w:val="false"/>
+                <w:sz w:val="20"/>
+                <w:szCs w:val="20"/>
+                <w:color w:val="000000"/>
+              </w:rPr>
+              <w:t xml:space="preserve">6/28</w:t>
+            </w:r>
+          </w:p>
+        </w:tc>
+        <w:tc>
+          <w:tcPr>
+            <w:tcBorders>
+              <w:bottom w:val="none" w:sz="0" w:space="0" w:color="000000"/>
+              <w:top w:val="none" w:sz="0" w:space="0" w:color="000000"/>
+              <w:left w:val="none" w:sz="0" w:space="0" w:color="000000"/>
+              <w:right w:val="none" w:sz="0" w:space="0" w:color="000000"/>
+            </w:tcBorders>
+            <w:shd w:val="clear" w:color="auto" w:fill="FFFFFF"/>
+            <w:tcMar>
+              <w:top w:w="0" w:type="dxa"/>
+              <w:bottom w:w="0" w:type="dxa"/>
+              <w:left w:w="0" w:type="dxa"/>
+              <w:right w:w="0" w:type="dxa"/>
+            </w:tcMar>
+            <w:vAlign w:val="top"/>
+          </w:tcPr>
+          <w:p>
+            <w:pPr>
+              <w:pStyle w:val="Normal"/>
+              <w:jc w:val="left"/>
+              <w:pBdr>
+                <w:bottom w:val="none" w:sz="0" w:space="0" w:color="000000"/>
+                <w:top w:val="none" w:sz="0" w:space="0" w:color="000000"/>
+                <w:left w:val="none" w:sz="0" w:space="0" w:color="000000"/>
+                <w:right w:val="none" w:sz="0" w:space="0" w:color="000000"/>
+              </w:pBdr>
+              <w:spacing w:after="40" w:before="40" w:line="240"/>
+              <w:ind w:left="40" w:right="40" w:firstLine="0" w:firstLineChars="0"/>
+              <w:rPr>
+                <w:rFonts w:ascii="Arial" w:hAnsi="Arial" w:eastAsia="Arial" w:cs="Arial"/>
+                <w:i w:val="false"/>
+                <w:b w:val="false"/>
+                <w:u w:val="none"/>
+                <w:strike w:val="false"/>
+                <w:sz w:val="20"/>
+                <w:szCs w:val="20"/>
+                <w:color w:val="000000"/>
+              </w:rPr>
+            </w:pPr>
+            <w:r>
+              <w:rPr>
+                <w:rFonts w:ascii="Arial" w:hAnsi="Arial" w:eastAsia="Arial" w:cs="Arial"/>
+                <w:i w:val="false"/>
+                <w:b w:val="false"/>
+                <w:u w:val="none"/>
+                <w:strike w:val="false"/>
+                <w:sz w:val="20"/>
+                <w:szCs w:val="20"/>
+                <w:color w:val="000000"/>
+              </w:rPr>
+              <w:t xml:space="preserve">21.4%</w:t>
+            </w:r>
+          </w:p>
+        </w:tc>
+      </w:tr>
+      <w:tr>
+        <w:trPr>
+          <w:trHeight w:val="577" w:hRule="auto"/>
+        </w:trPr>
+        <w:tc>
+          <w:tcPr>
+            <w:tcBorders>
+              <w:bottom w:val="single" w:sz="12" w:space="0" w:color="666666"/>
+              <w:top w:val="none" w:sz="0" w:space="0" w:color="000000"/>
+              <w:left w:val="none" w:sz="0" w:space="0" w:color="000000"/>
+              <w:right w:val="none" w:sz="0" w:space="0" w:color="000000"/>
+            </w:tcBorders>
+            <w:shd w:val="clear" w:color="auto" w:fill="FFFFFF"/>
+            <w:tcMar>
+              <w:top w:w="0" w:type="dxa"/>
+              <w:bottom w:w="0" w:type="dxa"/>
+              <w:left w:w="0" w:type="dxa"/>
+              <w:right w:w="0" w:type="dxa"/>
+            </w:tcMar>
+            <w:vAlign w:val="top"/>
+          </w:tcPr>
+          <w:p>
+            <w:pPr>
+              <w:pStyle w:val="Normal"/>
+              <w:jc w:val="left"/>
+              <w:pBdr>
+                <w:bottom w:val="none" w:sz="0" w:space="0" w:color="000000"/>
+                <w:top w:val="none" w:sz="0" w:space="0" w:color="000000"/>
+                <w:left w:val="none" w:sz="0" w:space="0" w:color="000000"/>
+                <w:right w:val="none" w:sz="0" w:space="0" w:color="000000"/>
+              </w:pBdr>
+              <w:spacing w:after="40" w:before="40" w:line="240"/>
+              <w:ind w:left="40" w:right="40" w:firstLine="0" w:firstLineChars="0"/>
+              <w:rPr>
+                <w:rFonts w:ascii="Arial" w:hAnsi="Arial" w:eastAsia="Arial" w:cs="Arial"/>
+                <w:i w:val="false"/>
+                <w:b w:val="false"/>
+                <w:u w:val="none"/>
+                <w:strike w:val="false"/>
+                <w:sz w:val="20"/>
+                <w:szCs w:val="20"/>
+                <w:color w:val="000000"/>
+              </w:rPr>
+            </w:pPr>
+            <w:r>
+              <w:rPr>
+                <w:rFonts w:ascii="Arial" w:hAnsi="Arial" w:eastAsia="Arial" w:cs="Arial"/>
+                <w:i w:val="false"/>
+                <w:b w:val="false"/>
+                <w:u w:val="none"/>
+                <w:strike w:val="false"/>
+                <w:sz w:val="20"/>
+                <w:szCs w:val="20"/>
+                <w:color w:val="000000"/>
+              </w:rPr>
+              <w:t xml:space="preserve">minimum citation threshold</w:t>
+            </w:r>
+          </w:p>
+        </w:tc>
+        <w:tc>
+          <w:tcPr>
+            <w:tcBorders>
+              <w:bottom w:val="single" w:sz="12" w:space="0" w:color="666666"/>
+              <w:top w:val="none" w:sz="0" w:space="0" w:color="000000"/>
+              <w:left w:val="none" w:sz="0" w:space="0" w:color="000000"/>
+              <w:right w:val="none" w:sz="0" w:space="0" w:color="000000"/>
+            </w:tcBorders>
+            <w:shd w:val="clear" w:color="auto" w:fill="FFFFFF"/>
+            <w:tcMar>
+              <w:top w:w="0" w:type="dxa"/>
+              <w:bottom w:w="0" w:type="dxa"/>
+              <w:left w:w="0" w:type="dxa"/>
+              <w:right w:w="0" w:type="dxa"/>
+            </w:tcMar>
+            <w:vAlign w:val="top"/>
+          </w:tcPr>
+          <w:p>
+            <w:pPr>
+              <w:pStyle w:val="Normal"/>
+              <w:jc w:val="left"/>
+              <w:pBdr>
+                <w:bottom w:val="none" w:sz="0" w:space="0" w:color="000000"/>
+                <w:top w:val="none" w:sz="0" w:space="0" w:color="000000"/>
+                <w:left w:val="none" w:sz="0" w:space="0" w:color="000000"/>
+                <w:right w:val="none" w:sz="0" w:space="0" w:color="000000"/>
+              </w:pBdr>
+              <w:spacing w:after="40" w:before="40" w:line="240"/>
+              <w:ind w:left="40" w:right="40" w:firstLine="0" w:firstLineChars="0"/>
+              <w:rPr>
+                <w:rFonts w:ascii="Arial" w:hAnsi="Arial" w:eastAsia="Arial" w:cs="Arial"/>
+                <w:i w:val="false"/>
+                <w:b w:val="false"/>
+                <w:u w:val="none"/>
+                <w:strike w:val="false"/>
+                <w:sz w:val="20"/>
+                <w:szCs w:val="20"/>
+                <w:color w:val="000000"/>
+              </w:rPr>
+            </w:pPr>
+            <w:r>
+              <w:rPr>
+                <w:rFonts w:ascii="Arial" w:hAnsi="Arial" w:eastAsia="Arial" w:cs="Arial"/>
+                <w:i w:val="false"/>
+                <w:b w:val="false"/>
+                <w:u w:val="none"/>
+                <w:strike w:val="false"/>
+                <w:sz w:val="20"/>
+                <w:szCs w:val="20"/>
+                <w:color w:val="000000"/>
+              </w:rPr>
+              <w:t xml:space="preserve">4</w:t>
+            </w:r>
+          </w:p>
+        </w:tc>
+        <w:tc>
+          <w:tcPr>
+            <w:tcBorders>
+              <w:bottom w:val="single" w:sz="12" w:space="0" w:color="666666"/>
+              <w:top w:val="none" w:sz="0" w:space="0" w:color="000000"/>
+              <w:left w:val="none" w:sz="0" w:space="0" w:color="000000"/>
+              <w:right w:val="none" w:sz="0" w:space="0" w:color="000000"/>
+            </w:tcBorders>
+            <w:shd w:val="clear" w:color="auto" w:fill="FFFFFF"/>
+            <w:tcMar>
+              <w:top w:w="0" w:type="dxa"/>
+              <w:bottom w:w="0" w:type="dxa"/>
+              <w:left w:w="0" w:type="dxa"/>
+              <w:right w:w="0" w:type="dxa"/>
+            </w:tcMar>
+            <w:vAlign w:val="top"/>
+          </w:tcPr>
+          <w:p>
+            <w:pPr>
+              <w:pStyle w:val="Normal"/>
+              <w:jc w:val="left"/>
+              <w:pBdr>
+                <w:bottom w:val="none" w:sz="0" w:space="0" w:color="000000"/>
+                <w:top w:val="none" w:sz="0" w:space="0" w:color="000000"/>
+                <w:left w:val="none" w:sz="0" w:space="0" w:color="000000"/>
+                <w:right w:val="none" w:sz="0" w:space="0" w:color="000000"/>
+              </w:pBdr>
+              <w:spacing w:after="40" w:before="40" w:line="240"/>
+              <w:ind w:left="40" w:right="40" w:firstLine="0" w:firstLineChars="0"/>
+              <w:rPr>
+                <w:rFonts w:ascii="Arial" w:hAnsi="Arial" w:eastAsia="Arial" w:cs="Arial"/>
+                <w:i w:val="false"/>
+                <w:b w:val="false"/>
+                <w:u w:val="none"/>
+                <w:strike w:val="false"/>
+                <w:sz w:val="20"/>
+                <w:szCs w:val="20"/>
+                <w:color w:val="000000"/>
+              </w:rPr>
+            </w:pPr>
+            <w:r>
+              <w:rPr>
+                <w:rFonts w:ascii="Arial" w:hAnsi="Arial" w:eastAsia="Arial" w:cs="Arial"/>
+                <w:i w:val="false"/>
+                <w:b w:val="false"/>
+                <w:u w:val="none"/>
+                <w:strike w:val="false"/>
+                <w:sz w:val="20"/>
+                <w:szCs w:val="20"/>
+                <w:color w:val="000000"/>
+              </w:rPr>
+              <w:t xml:space="preserve">4/28</w:t>
+            </w:r>
+          </w:p>
+        </w:tc>
+        <w:tc>
+          <w:tcPr>
+            <w:tcBorders>
+              <w:bottom w:val="single" w:sz="12" w:space="0" w:color="666666"/>
+              <w:top w:val="none" w:sz="0" w:space="0" w:color="000000"/>
+              <w:left w:val="none" w:sz="0" w:space="0" w:color="000000"/>
+              <w:right w:val="none" w:sz="0" w:space="0" w:color="000000"/>
+            </w:tcBorders>
+            <w:shd w:val="clear" w:color="auto" w:fill="FFFFFF"/>
+            <w:tcMar>
+              <w:top w:w="0" w:type="dxa"/>
+              <w:bottom w:w="0" w:type="dxa"/>
+              <w:left w:w="0" w:type="dxa"/>
+              <w:right w:w="0" w:type="dxa"/>
+            </w:tcMar>
+            <w:vAlign w:val="top"/>
+          </w:tcPr>
+          <w:p>
+            <w:pPr>
+              <w:pStyle w:val="Normal"/>
+              <w:jc w:val="left"/>
+              <w:pBdr>
+                <w:bottom w:val="none" w:sz="0" w:space="0" w:color="000000"/>
+                <w:top w:val="none" w:sz="0" w:space="0" w:color="000000"/>
+                <w:left w:val="none" w:sz="0" w:space="0" w:color="000000"/>
+                <w:right w:val="none" w:sz="0" w:space="0" w:color="000000"/>
+              </w:pBdr>
+              <w:spacing w:after="40" w:before="40" w:line="240"/>
+              <w:ind w:left="40" w:right="40" w:firstLine="0" w:firstLineChars="0"/>
+              <w:rPr>
+                <w:rFonts w:ascii="Arial" w:hAnsi="Arial" w:eastAsia="Arial" w:cs="Arial"/>
+                <w:i w:val="false"/>
+                <w:b w:val="false"/>
+                <w:u w:val="none"/>
+                <w:strike w:val="false"/>
+                <w:sz w:val="20"/>
+                <w:szCs w:val="20"/>
+                <w:color w:val="000000"/>
+              </w:rPr>
+            </w:pPr>
+            <w:r>
+              <w:rPr>
+                <w:rFonts w:ascii="Arial" w:hAnsi="Arial" w:eastAsia="Arial" w:cs="Arial"/>
+                <w:i w:val="false"/>
+                <w:b w:val="false"/>
+                <w:u w:val="none"/>
+                <w:strike w:val="false"/>
+                <w:sz w:val="20"/>
+                <w:szCs w:val="20"/>
+                <w:color w:val="000000"/>
+              </w:rPr>
+              <w:t xml:space="preserve">14.3%</w:t>
             </w:r>
           </w:p>
         </w:tc>

</xml_diff>